<commit_message>
Align store policies and refresh all handoff documents
</commit_message>
<xml_diff>
--- a/_archive/outputs-documents-20260918/planning-v2/01_말마프렌즈_IA구조도_v2.docx
+++ b/_archive/outputs-documents-20260918/planning-v2/01_말마프렌즈_IA구조도_v2.docx
@@ -5,30 +5,19 @@
     <w:p>
       <w:pPr>
         <w:pStyle w:val="Title"/>
-        <w:pBdr>
-          <w:bottom w:val="nil"/>
-        </w:pBdr>
       </w:pPr>
       <w:r>
         <w:t>말마프렌즈 온라인 스토어 IA 구조도</w:t>
       </w:r>
     </w:p>
     <w:p>
-      <w:pPr>
-        <w:pStyle w:val="Subtitle"/>
-      </w:pPr>
       <w:r>
-        <w:t>사용자와 관리자 화면 구조 및 이동 정의</w:t>
+        <w:t>정책 개정 2026년 10월 7일</w:t>
       </w:r>
     </w:p>
     <w:p>
       <w:r>
-        <w:t>기획 개정안 v2.0  |  2026년 9월 18일  |  고객사 정책 및 개발 검토 전</w:t>
-      </w:r>
-    </w:p>
-    <w:p>
-      <w:r>
-        <w:t>회원이 여러 굿즈를 한 주문으로 구매하고, 관리자가 기존 예약 운영 시스템에서 상품·재고·주문·출고를 관리하는 구조로 재정리한다. 예약권과 굿즈의 상품·주문 데이터는 분리한다. 아래 구조는 최종 서비스의 기획 제안이며 실제 인증·결제 연동 완료를 뜻하지 않는다.</w:t>
+        <w:t>상품 탐색부터 주문과 반품까지의 사용자 이동, 기존 관리자에 추가하는 커머스 메뉴 구조를 정의합니다.</w:t>
       </w:r>
     </w:p>
     <w:p>
@@ -36,87 +25,124 @@
         <w:pStyle w:val="Heading1"/>
       </w:pPr>
       <w:r>
-        <w:t>문서와 화면 식별 기준</w:t>
+        <w:t>사용자 이동</w:t>
+      </w:r>
+    </w:p>
+    <w:p>
+      <w:r>
+        <w:t>스토어 → 상품 목록 → 상품 상세 → 로그인 → 장바구니 또는 바로 구매 → 주문서 → 결제 → 주문 완료</w:t>
+      </w:r>
+    </w:p>
+    <w:p>
+      <w:r>
+        <w:t>주문 조회 → 주문 상세 → 취소 또는 반품 신청 → 반품 운송장 → 처리 결과 확인</w:t>
       </w:r>
     </w:p>
     <w:tbl>
       <w:tblPr>
         <w:tblW w:type="auto" w:w="0"/>
-        <w:tblLayout w:type="fixed"/>
+        <w:tblLayout w:type="autofit"/>
         <w:tblLook w:firstColumn="1" w:firstRow="1" w:lastColumn="0" w:lastRow="0" w:noHBand="0" w:noVBand="1" w:val="04A0"/>
       </w:tblPr>
       <w:tblGrid>
-        <w:gridCol w:w="1984"/>
-        <w:gridCol w:w="7824"/>
+        <w:gridCol w:w="1994"/>
+        <w:gridCol w:w="1994"/>
+        <w:gridCol w:w="1994"/>
+        <w:gridCol w:w="1994"/>
+        <w:gridCol w:w="1994"/>
       </w:tblGrid>
       <w:tr>
         <w:trPr>
+          <w:cantSplit/>
           <w:tblHeader/>
-          <w:cantSplit/>
         </w:trPr>
         <w:tc>
           <w:tcPr>
-            <w:tcW w:type="dxa" w:w="1984"/>
-            <w:tcBorders>
-              <w:top w:val="single" w:sz="4" w:color="D9D9D9"/>
-              <w:left w:val="single" w:sz="4" w:color="D9D9D9"/>
-              <w:bottom w:val="single" w:sz="4" w:color="D9D9D9"/>
-              <w:right w:val="single" w:sz="4" w:color="D9D9D9"/>
-              <w:insideH w:val="single" w:sz="4" w:color="D9D9D9"/>
-              <w:insideV w:val="single" w:sz="4" w:color="D9D9D9"/>
-            </w:tcBorders>
-            <w:tcMar>
-              <w:top w:w="90" w:type="dxa"/>
-              <w:left w:w="90" w:type="dxa"/>
-              <w:bottom w:w="90" w:type="dxa"/>
-              <w:right w:w="90" w:type="dxa"/>
-            </w:tcMar>
-            <w:shd w:fill="173C55"/>
+            <w:tcW w:type="dxa" w:w="1994"/>
+            <w:shd w:fill="EDEFF2"/>
           </w:tcPr>
           <w:p>
             <w:pPr>
-              <w:spacing w:after="20" w:line="264" w:lineRule="auto"/>
+              <w:spacing w:after="80" w:before="80"/>
             </w:pPr>
             <w:r>
               <w:rPr>
                 <w:b/>
-                <w:color w:val="FFFFFF"/>
                 <w:sz w:val="18"/>
               </w:rPr>
-              <w:t>구분</w:t>
+              <w:t>화면 ID</w:t>
             </w:r>
           </w:p>
         </w:tc>
         <w:tc>
           <w:tcPr>
-            <w:tcW w:type="dxa" w:w="7824"/>
-            <w:tcBorders>
-              <w:top w:val="single" w:sz="4" w:color="D9D9D9"/>
-              <w:left w:val="single" w:sz="4" w:color="D9D9D9"/>
-              <w:bottom w:val="single" w:sz="4" w:color="D9D9D9"/>
-              <w:right w:val="single" w:sz="4" w:color="D9D9D9"/>
-              <w:insideH w:val="single" w:sz="4" w:color="D9D9D9"/>
-              <w:insideV w:val="single" w:sz="4" w:color="D9D9D9"/>
-            </w:tcBorders>
-            <w:tcMar>
-              <w:top w:w="90" w:type="dxa"/>
-              <w:left w:w="90" w:type="dxa"/>
-              <w:bottom w:w="90" w:type="dxa"/>
-              <w:right w:w="90" w:type="dxa"/>
-            </w:tcMar>
-            <w:shd w:fill="173C55"/>
+            <w:tcW w:type="dxa" w:w="1994"/>
+            <w:shd w:fill="EDEFF2"/>
           </w:tcPr>
           <w:p>
             <w:pPr>
-              <w:spacing w:after="20" w:line="264" w:lineRule="auto"/>
+              <w:spacing w:after="80" w:before="80"/>
             </w:pPr>
             <w:r>
               <w:rPr>
                 <w:b/>
-                <w:color w:val="FFFFFF"/>
                 <w:sz w:val="18"/>
               </w:rPr>
-              <w:t>정의</w:t>
+              <w:t>화면</w:t>
+            </w:r>
+          </w:p>
+        </w:tc>
+        <w:tc>
+          <w:tcPr>
+            <w:tcW w:type="dxa" w:w="1994"/>
+            <w:shd w:fill="EDEFF2"/>
+          </w:tcPr>
+          <w:p>
+            <w:pPr>
+              <w:spacing w:after="80" w:before="80"/>
+            </w:pPr>
+            <w:r>
+              <w:rPr>
+                <w:b/>
+                <w:sz w:val="18"/>
+              </w:rPr>
+              <w:t>접근</w:t>
+            </w:r>
+          </w:p>
+        </w:tc>
+        <w:tc>
+          <w:tcPr>
+            <w:tcW w:type="dxa" w:w="1994"/>
+            <w:shd w:fill="EDEFF2"/>
+          </w:tcPr>
+          <w:p>
+            <w:pPr>
+              <w:spacing w:after="80" w:before="80"/>
+            </w:pPr>
+            <w:r>
+              <w:rPr>
+                <w:b/>
+                <w:sz w:val="18"/>
+              </w:rPr>
+              <w:t>경로</w:t>
+            </w:r>
+          </w:p>
+        </w:tc>
+        <w:tc>
+          <w:tcPr>
+            <w:tcW w:type="dxa" w:w="1994"/>
+            <w:shd w:fill="EDEFF2"/>
+          </w:tcPr>
+          <w:p>
+            <w:pPr>
+              <w:spacing w:after="80" w:before="80"/>
+            </w:pPr>
+            <w:r>
+              <w:rPr>
+                <w:b/>
+                <w:sz w:val="18"/>
+              </w:rPr>
+              <w:t>연결</w:t>
             </w:r>
           </w:p>
         </w:tc>
@@ -127,995 +153,45 @@
         </w:trPr>
         <w:tc>
           <w:tcPr>
-            <w:tcW w:type="dxa" w:w="1984"/>
-            <w:tcBorders>
-              <w:top w:val="single" w:sz="4" w:color="D9D9D9"/>
-              <w:left w:val="single" w:sz="4" w:color="D9D9D9"/>
-              <w:bottom w:val="single" w:sz="4" w:color="D9D9D9"/>
-              <w:right w:val="single" w:sz="4" w:color="D9D9D9"/>
-              <w:insideH w:val="single" w:sz="4" w:color="D9D9D9"/>
-              <w:insideV w:val="single" w:sz="4" w:color="D9D9D9"/>
-            </w:tcBorders>
-            <w:tcMar>
-              <w:top w:w="90" w:type="dxa"/>
-              <w:left w:w="90" w:type="dxa"/>
-              <w:bottom w:w="90" w:type="dxa"/>
-              <w:right w:w="90" w:type="dxa"/>
-            </w:tcMar>
-            <w:shd w:fill="FFFFFF"/>
+            <w:tcW w:type="dxa" w:w="1994"/>
           </w:tcPr>
           <w:p>
             <w:pPr>
-              <w:spacing w:after="20" w:line="264" w:lineRule="auto"/>
+              <w:spacing w:after="80" w:before="80"/>
             </w:pPr>
             <w:r>
               <w:rPr>
                 <w:b w:val="0"/>
                 <w:sz w:val="18"/>
               </w:rPr>
-              <w:t>U 화면</w:t>
+              <w:t>SCR-U-001</w:t>
             </w:r>
           </w:p>
         </w:tc>
         <w:tc>
           <w:tcPr>
-            <w:tcW w:type="dxa" w:w="7824"/>
-            <w:tcBorders>
-              <w:top w:val="single" w:sz="4" w:color="D9D9D9"/>
-              <w:left w:val="single" w:sz="4" w:color="D9D9D9"/>
-              <w:bottom w:val="single" w:sz="4" w:color="D9D9D9"/>
-              <w:right w:val="single" w:sz="4" w:color="D9D9D9"/>
-              <w:insideH w:val="single" w:sz="4" w:color="D9D9D9"/>
-              <w:insideV w:val="single" w:sz="4" w:color="D9D9D9"/>
-            </w:tcBorders>
-            <w:tcMar>
-              <w:top w:w="90" w:type="dxa"/>
-              <w:left w:w="90" w:type="dxa"/>
-              <w:bottom w:w="90" w:type="dxa"/>
-              <w:right w:w="90" w:type="dxa"/>
-            </w:tcMar>
-            <w:shd w:fill="FFFFFF"/>
+            <w:tcW w:type="dxa" w:w="1994"/>
           </w:tcPr>
           <w:p>
             <w:pPr>
-              <w:spacing w:after="20" w:line="264" w:lineRule="auto"/>
+              <w:spacing w:after="80" w:before="80"/>
             </w:pPr>
             <w:r>
               <w:rPr>
                 <w:b w:val="0"/>
                 <w:sz w:val="18"/>
               </w:rPr>
-              <w:t>사용자 페이지와 로그인 팝업 및 장바구니 패널</w:t>
-            </w:r>
-          </w:p>
-        </w:tc>
-      </w:tr>
-      <w:tr>
-        <w:trPr>
-          <w:cantSplit/>
-        </w:trPr>
-        <w:tc>
-          <w:tcPr>
-            <w:tcW w:type="dxa" w:w="1984"/>
-            <w:tcBorders>
-              <w:top w:val="single" w:sz="4" w:color="D9D9D9"/>
-              <w:left w:val="single" w:sz="4" w:color="D9D9D9"/>
-              <w:bottom w:val="single" w:sz="4" w:color="D9D9D9"/>
-              <w:right w:val="single" w:sz="4" w:color="D9D9D9"/>
-              <w:insideH w:val="single" w:sz="4" w:color="D9D9D9"/>
-              <w:insideV w:val="single" w:sz="4" w:color="D9D9D9"/>
-            </w:tcBorders>
-            <w:tcMar>
-              <w:top w:w="90" w:type="dxa"/>
-              <w:left w:w="90" w:type="dxa"/>
-              <w:bottom w:w="90" w:type="dxa"/>
-              <w:right w:w="90" w:type="dxa"/>
-            </w:tcMar>
-            <w:shd w:fill="F3F6F8"/>
-          </w:tcPr>
-          <w:p>
-            <w:pPr>
-              <w:spacing w:after="20" w:line="264" w:lineRule="auto"/>
-            </w:pPr>
-            <w:r>
-              <w:rPr>
-                <w:b w:val="0"/>
-                <w:sz w:val="18"/>
-              </w:rPr>
-              <w:t>A 화면</w:t>
+              <w:t>스토어 메인과 상품 목록</w:t>
             </w:r>
           </w:p>
         </w:tc>
         <w:tc>
           <w:tcPr>
-            <w:tcW w:type="dxa" w:w="7824"/>
-            <w:tcBorders>
-              <w:top w:val="single" w:sz="4" w:color="D9D9D9"/>
-              <w:left w:val="single" w:sz="4" w:color="D9D9D9"/>
-              <w:bottom w:val="single" w:sz="4" w:color="D9D9D9"/>
-              <w:right w:val="single" w:sz="4" w:color="D9D9D9"/>
-              <w:insideH w:val="single" w:sz="4" w:color="D9D9D9"/>
-              <w:insideV w:val="single" w:sz="4" w:color="D9D9D9"/>
-            </w:tcBorders>
-            <w:tcMar>
-              <w:top w:w="90" w:type="dxa"/>
-              <w:left w:w="90" w:type="dxa"/>
-              <w:bottom w:w="90" w:type="dxa"/>
-              <w:right w:w="90" w:type="dxa"/>
-            </w:tcMar>
-            <w:shd w:fill="F3F6F8"/>
+            <w:tcW w:type="dxa" w:w="1994"/>
           </w:tcPr>
           <w:p>
             <w:pPr>
-              <w:spacing w:after="20" w:line="264" w:lineRule="auto"/>
-            </w:pPr>
-            <w:r>
-              <w:rPr>
-                <w:b w:val="0"/>
-                <w:sz w:val="18"/>
-              </w:rPr>
-              <w:t>기존 관리자에 추가할 메뉴와 탭 및 팝업</w:t>
-            </w:r>
-          </w:p>
-        </w:tc>
-      </w:tr>
-      <w:tr>
-        <w:trPr>
-          <w:cantSplit/>
-        </w:trPr>
-        <w:tc>
-          <w:tcPr>
-            <w:tcW w:type="dxa" w:w="1984"/>
-            <w:tcBorders>
-              <w:top w:val="single" w:sz="4" w:color="D9D9D9"/>
-              <w:left w:val="single" w:sz="4" w:color="D9D9D9"/>
-              <w:bottom w:val="single" w:sz="4" w:color="D9D9D9"/>
-              <w:right w:val="single" w:sz="4" w:color="D9D9D9"/>
-              <w:insideH w:val="single" w:sz="4" w:color="D9D9D9"/>
-              <w:insideV w:val="single" w:sz="4" w:color="D9D9D9"/>
-            </w:tcBorders>
-            <w:tcMar>
-              <w:top w:w="90" w:type="dxa"/>
-              <w:left w:w="90" w:type="dxa"/>
-              <w:bottom w:w="90" w:type="dxa"/>
-              <w:right w:w="90" w:type="dxa"/>
-            </w:tcMar>
-            <w:shd w:fill="FFFFFF"/>
-          </w:tcPr>
-          <w:p>
-            <w:pPr>
-              <w:spacing w:after="20" w:line="264" w:lineRule="auto"/>
-            </w:pPr>
-            <w:r>
-              <w:rPr>
-                <w:b w:val="0"/>
-                <w:sz w:val="18"/>
-              </w:rPr>
-              <w:t>C 공통 동작</w:t>
-            </w:r>
-          </w:p>
-        </w:tc>
-        <w:tc>
-          <w:tcPr>
-            <w:tcW w:type="dxa" w:w="7824"/>
-            <w:tcBorders>
-              <w:top w:val="single" w:sz="4" w:color="D9D9D9"/>
-              <w:left w:val="single" w:sz="4" w:color="D9D9D9"/>
-              <w:bottom w:val="single" w:sz="4" w:color="D9D9D9"/>
-              <w:right w:val="single" w:sz="4" w:color="D9D9D9"/>
-              <w:insideH w:val="single" w:sz="4" w:color="D9D9D9"/>
-              <w:insideV w:val="single" w:sz="4" w:color="D9D9D9"/>
-            </w:tcBorders>
-            <w:tcMar>
-              <w:top w:w="90" w:type="dxa"/>
-              <w:left w:w="90" w:type="dxa"/>
-              <w:bottom w:w="90" w:type="dxa"/>
-              <w:right w:w="90" w:type="dxa"/>
-            </w:tcMar>
-            <w:shd w:fill="FFFFFF"/>
-          </w:tcPr>
-          <w:p>
-            <w:pPr>
-              <w:spacing w:after="20" w:line="264" w:lineRule="auto"/>
-            </w:pPr>
-            <w:r>
-              <w:rPr>
-                <w:b w:val="0"/>
-                <w:sz w:val="18"/>
-              </w:rPr>
-              <w:t>확인창 내려받기 편집 도구처럼 독립 메뉴가 아닌 기능</w:t>
-            </w:r>
-          </w:p>
-        </w:tc>
-      </w:tr>
-      <w:tr>
-        <w:trPr>
-          <w:cantSplit/>
-        </w:trPr>
-        <w:tc>
-          <w:tcPr>
-            <w:tcW w:type="dxa" w:w="1984"/>
-            <w:tcBorders>
-              <w:top w:val="single" w:sz="4" w:color="D9D9D9"/>
-              <w:left w:val="single" w:sz="4" w:color="D9D9D9"/>
-              <w:bottom w:val="single" w:sz="4" w:color="D9D9D9"/>
-              <w:right w:val="single" w:sz="4" w:color="D9D9D9"/>
-              <w:insideH w:val="single" w:sz="4" w:color="D9D9D9"/>
-              <w:insideV w:val="single" w:sz="4" w:color="D9D9D9"/>
-            </w:tcBorders>
-            <w:tcMar>
-              <w:top w:w="90" w:type="dxa"/>
-              <w:left w:w="90" w:type="dxa"/>
-              <w:bottom w:w="90" w:type="dxa"/>
-              <w:right w:w="90" w:type="dxa"/>
-            </w:tcMar>
-            <w:shd w:fill="F3F6F8"/>
-          </w:tcPr>
-          <w:p>
-            <w:pPr>
-              <w:spacing w:after="20" w:line="264" w:lineRule="auto"/>
-            </w:pPr>
-            <w:r>
-              <w:rPr>
-                <w:b w:val="0"/>
-                <w:sz w:val="18"/>
-              </w:rPr>
-              <w:t>X 외부 연동</w:t>
-            </w:r>
-          </w:p>
-        </w:tc>
-        <w:tc>
-          <w:tcPr>
-            <w:tcW w:type="dxa" w:w="7824"/>
-            <w:tcBorders>
-              <w:top w:val="single" w:sz="4" w:color="D9D9D9"/>
-              <w:left w:val="single" w:sz="4" w:color="D9D9D9"/>
-              <w:bottom w:val="single" w:sz="4" w:color="D9D9D9"/>
-              <w:right w:val="single" w:sz="4" w:color="D9D9D9"/>
-              <w:insideH w:val="single" w:sz="4" w:color="D9D9D9"/>
-              <w:insideV w:val="single" w:sz="4" w:color="D9D9D9"/>
-            </w:tcBorders>
-            <w:tcMar>
-              <w:top w:w="90" w:type="dxa"/>
-              <w:left w:w="90" w:type="dxa"/>
-              <w:bottom w:w="90" w:type="dxa"/>
-              <w:right w:w="90" w:type="dxa"/>
-            </w:tcMar>
-            <w:shd w:fill="F3F6F8"/>
-          </w:tcPr>
-          <w:p>
-            <w:pPr>
-              <w:spacing w:after="20" w:line="264" w:lineRule="auto"/>
-            </w:pPr>
-            <w:r>
-              <w:rPr>
-                <w:b w:val="0"/>
-                <w:sz w:val="18"/>
-              </w:rPr>
-              <w:t>기존 인증 PG 주소 검색 택배사 조회</w:t>
-            </w:r>
-          </w:p>
-        </w:tc>
-      </w:tr>
-      <w:tr>
-        <w:trPr>
-          <w:cantSplit/>
-        </w:trPr>
-        <w:tc>
-          <w:tcPr>
-            <w:tcW w:type="dxa" w:w="1984"/>
-            <w:tcBorders>
-              <w:top w:val="single" w:sz="4" w:color="D9D9D9"/>
-              <w:left w:val="single" w:sz="4" w:color="D9D9D9"/>
-              <w:bottom w:val="single" w:sz="4" w:color="D9D9D9"/>
-              <w:right w:val="single" w:sz="4" w:color="D9D9D9"/>
-              <w:insideH w:val="single" w:sz="4" w:color="D9D9D9"/>
-              <w:insideV w:val="single" w:sz="4" w:color="D9D9D9"/>
-            </w:tcBorders>
-            <w:tcMar>
-              <w:top w:w="90" w:type="dxa"/>
-              <w:left w:w="90" w:type="dxa"/>
-              <w:bottom w:w="90" w:type="dxa"/>
-              <w:right w:w="90" w:type="dxa"/>
-            </w:tcMar>
-            <w:shd w:fill="FFFFFF"/>
-          </w:tcPr>
-          <w:p>
-            <w:pPr>
-              <w:spacing w:after="20" w:line="264" w:lineRule="auto"/>
-            </w:pPr>
-            <w:r>
-              <w:rPr>
-                <w:b w:val="0"/>
-                <w:sz w:val="18"/>
-              </w:rPr>
-              <w:t>F 기능</w:t>
-            </w:r>
-          </w:p>
-        </w:tc>
-        <w:tc>
-          <w:tcPr>
-            <w:tcW w:type="dxa" w:w="7824"/>
-            <w:tcBorders>
-              <w:top w:val="single" w:sz="4" w:color="D9D9D9"/>
-              <w:left w:val="single" w:sz="4" w:color="D9D9D9"/>
-              <w:bottom w:val="single" w:sz="4" w:color="D9D9D9"/>
-              <w:right w:val="single" w:sz="4" w:color="D9D9D9"/>
-              <w:insideH w:val="single" w:sz="4" w:color="D9D9D9"/>
-              <w:insideV w:val="single" w:sz="4" w:color="D9D9D9"/>
-            </w:tcBorders>
-            <w:tcMar>
-              <w:top w:w="90" w:type="dxa"/>
-              <w:left w:w="90" w:type="dxa"/>
-              <w:bottom w:w="90" w:type="dxa"/>
-              <w:right w:w="90" w:type="dxa"/>
-            </w:tcMar>
-            <w:shd w:fill="FFFFFF"/>
-          </w:tcPr>
-          <w:p>
-            <w:pPr>
-              <w:spacing w:after="20" w:line="264" w:lineRule="auto"/>
-            </w:pPr>
-            <w:r>
-              <w:rPr>
-                <w:b w:val="0"/>
-                <w:sz w:val="18"/>
-              </w:rPr>
-              <w:t>기능명세서의 F01부터 F26까지 연결</w:t>
-            </w:r>
-          </w:p>
-        </w:tc>
-      </w:tr>
-      <w:tr>
-        <w:trPr>
-          <w:cantSplit/>
-        </w:trPr>
-        <w:tc>
-          <w:tcPr>
-            <w:tcW w:type="dxa" w:w="1984"/>
-            <w:tcBorders>
-              <w:top w:val="single" w:sz="4" w:color="D9D9D9"/>
-              <w:left w:val="single" w:sz="4" w:color="D9D9D9"/>
-              <w:bottom w:val="single" w:sz="4" w:color="D9D9D9"/>
-              <w:right w:val="single" w:sz="4" w:color="D9D9D9"/>
-              <w:insideH w:val="single" w:sz="4" w:color="D9D9D9"/>
-              <w:insideV w:val="single" w:sz="4" w:color="D9D9D9"/>
-            </w:tcBorders>
-            <w:tcMar>
-              <w:top w:w="90" w:type="dxa"/>
-              <w:left w:w="90" w:type="dxa"/>
-              <w:bottom w:w="90" w:type="dxa"/>
-              <w:right w:w="90" w:type="dxa"/>
-            </w:tcMar>
-            <w:shd w:fill="F3F6F8"/>
-          </w:tcPr>
-          <w:p>
-            <w:pPr>
-              <w:spacing w:after="20" w:line="264" w:lineRule="auto"/>
-            </w:pPr>
-            <w:r>
-              <w:rPr>
-                <w:b w:val="0"/>
-                <w:sz w:val="18"/>
-              </w:rPr>
-              <w:t>H 전달 정의</w:t>
-            </w:r>
-          </w:p>
-        </w:tc>
-        <w:tc>
-          <w:tcPr>
-            <w:tcW w:type="dxa" w:w="7824"/>
-            <w:tcBorders>
-              <w:top w:val="single" w:sz="4" w:color="D9D9D9"/>
-              <w:left w:val="single" w:sz="4" w:color="D9D9D9"/>
-              <w:bottom w:val="single" w:sz="4" w:color="D9D9D9"/>
-              <w:right w:val="single" w:sz="4" w:color="D9D9D9"/>
-              <w:insideH w:val="single" w:sz="4" w:color="D9D9D9"/>
-              <w:insideV w:val="single" w:sz="4" w:color="D9D9D9"/>
-            </w:tcBorders>
-            <w:tcMar>
-              <w:top w:w="90" w:type="dxa"/>
-              <w:left w:w="90" w:type="dxa"/>
-              <w:bottom w:w="90" w:type="dxa"/>
-              <w:right w:w="90" w:type="dxa"/>
-            </w:tcMar>
-            <w:shd w:fill="F3F6F8"/>
-          </w:tcPr>
-          <w:p>
-            <w:pPr>
-              <w:spacing w:after="20" w:line="264" w:lineRule="auto"/>
-            </w:pPr>
-            <w:r>
-              <w:rPr>
-                <w:b w:val="0"/>
-                <w:sz w:val="18"/>
-              </w:rPr>
-              <w:t>개발 전달서의 H01부터 H07까지 연결</w:t>
-            </w:r>
-          </w:p>
-        </w:tc>
-      </w:tr>
-      <w:tr>
-        <w:trPr>
-          <w:cantSplit/>
-        </w:trPr>
-        <w:tc>
-          <w:tcPr>
-            <w:tcW w:type="dxa" w:w="1984"/>
-            <w:tcBorders>
-              <w:top w:val="single" w:sz="4" w:color="D9D9D9"/>
-              <w:left w:val="single" w:sz="4" w:color="D9D9D9"/>
-              <w:bottom w:val="single" w:sz="4" w:color="D9D9D9"/>
-              <w:right w:val="single" w:sz="4" w:color="D9D9D9"/>
-              <w:insideH w:val="single" w:sz="4" w:color="D9D9D9"/>
-              <w:insideV w:val="single" w:sz="4" w:color="D9D9D9"/>
-            </w:tcBorders>
-            <w:tcMar>
-              <w:top w:w="90" w:type="dxa"/>
-              <w:left w:w="90" w:type="dxa"/>
-              <w:bottom w:w="90" w:type="dxa"/>
-              <w:right w:w="90" w:type="dxa"/>
-            </w:tcMar>
-            <w:shd w:fill="FFFFFF"/>
-          </w:tcPr>
-          <w:p>
-            <w:pPr>
-              <w:spacing w:after="20" w:line="264" w:lineRule="auto"/>
-            </w:pPr>
-            <w:r>
-              <w:rPr>
-                <w:b w:val="0"/>
-                <w:sz w:val="18"/>
-              </w:rPr>
-              <w:t>D 결정 항목</w:t>
-            </w:r>
-          </w:p>
-        </w:tc>
-        <w:tc>
-          <w:tcPr>
-            <w:tcW w:type="dxa" w:w="7824"/>
-            <w:tcBorders>
-              <w:top w:val="single" w:sz="4" w:color="D9D9D9"/>
-              <w:left w:val="single" w:sz="4" w:color="D9D9D9"/>
-              <w:bottom w:val="single" w:sz="4" w:color="D9D9D9"/>
-              <w:right w:val="single" w:sz="4" w:color="D9D9D9"/>
-              <w:insideH w:val="single" w:sz="4" w:color="D9D9D9"/>
-              <w:insideV w:val="single" w:sz="4" w:color="D9D9D9"/>
-            </w:tcBorders>
-            <w:tcMar>
-              <w:top w:w="90" w:type="dxa"/>
-              <w:left w:w="90" w:type="dxa"/>
-              <w:bottom w:w="90" w:type="dxa"/>
-              <w:right w:w="90" w:type="dxa"/>
-            </w:tcMar>
-            <w:shd w:fill="FFFFFF"/>
-          </w:tcPr>
-          <w:p>
-            <w:pPr>
-              <w:spacing w:after="20" w:line="264" w:lineRule="auto"/>
-            </w:pPr>
-            <w:r>
-              <w:rPr>
-                <w:b w:val="0"/>
-                <w:sz w:val="18"/>
-              </w:rPr>
-              <w:t>운영 정책 또는 범위 확정이 필요한 사항</w:t>
-            </w:r>
-          </w:p>
-        </w:tc>
-      </w:tr>
-      <w:tr>
-        <w:trPr>
-          <w:cantSplit/>
-        </w:trPr>
-        <w:tc>
-          <w:tcPr>
-            <w:tcW w:type="dxa" w:w="1984"/>
-            <w:tcBorders>
-              <w:top w:val="single" w:sz="4" w:color="D9D9D9"/>
-              <w:left w:val="single" w:sz="4" w:color="D9D9D9"/>
-              <w:bottom w:val="single" w:sz="4" w:color="D9D9D9"/>
-              <w:right w:val="single" w:sz="4" w:color="D9D9D9"/>
-              <w:insideH w:val="single" w:sz="4" w:color="D9D9D9"/>
-              <w:insideV w:val="single" w:sz="4" w:color="D9D9D9"/>
-            </w:tcBorders>
-            <w:tcMar>
-              <w:top w:w="90" w:type="dxa"/>
-              <w:left w:w="90" w:type="dxa"/>
-              <w:bottom w:w="90" w:type="dxa"/>
-              <w:right w:w="90" w:type="dxa"/>
-            </w:tcMar>
-            <w:shd w:fill="F3F6F8"/>
-          </w:tcPr>
-          <w:p>
-            <w:pPr>
-              <w:spacing w:after="20" w:line="264" w:lineRule="auto"/>
-            </w:pPr>
-            <w:r>
-              <w:rPr>
-                <w:b w:val="0"/>
-                <w:sz w:val="18"/>
-              </w:rPr>
-              <w:t>TC 검수</w:t>
-            </w:r>
-          </w:p>
-        </w:tc>
-        <w:tc>
-          <w:tcPr>
-            <w:tcW w:type="dxa" w:w="7824"/>
-            <w:tcBorders>
-              <w:top w:val="single" w:sz="4" w:color="D9D9D9"/>
-              <w:left w:val="single" w:sz="4" w:color="D9D9D9"/>
-              <w:bottom w:val="single" w:sz="4" w:color="D9D9D9"/>
-              <w:right w:val="single" w:sz="4" w:color="D9D9D9"/>
-              <w:insideH w:val="single" w:sz="4" w:color="D9D9D9"/>
-              <w:insideV w:val="single" w:sz="4" w:color="D9D9D9"/>
-            </w:tcBorders>
-            <w:tcMar>
-              <w:top w:w="90" w:type="dxa"/>
-              <w:left w:w="90" w:type="dxa"/>
-              <w:bottom w:w="90" w:type="dxa"/>
-              <w:right w:w="90" w:type="dxa"/>
-            </w:tcMar>
-            <w:shd w:fill="F3F6F8"/>
-          </w:tcPr>
-          <w:p>
-            <w:pPr>
-              <w:spacing w:after="20" w:line="264" w:lineRule="auto"/>
-            </w:pPr>
-            <w:r>
-              <w:rPr>
-                <w:b w:val="0"/>
-                <w:sz w:val="18"/>
-              </w:rPr>
-              <w:t>개발 전달서의 검수 시나리오</w:t>
-            </w:r>
-          </w:p>
-        </w:tc>
-      </w:tr>
-    </w:tbl>
-    <w:p/>
-    <w:p>
-      <w:pPr>
-        <w:pStyle w:val="Heading1"/>
-      </w:pPr>
-      <w:r>
-        <w:t>전체 메뉴 트리</w:t>
-      </w:r>
-    </w:p>
-    <w:p>
-      <w:r>
-        <w:t>렛츠런플레이 → 온라인 스토어 → 상품 목록 → 상품 상세. 로그인은 구매 행동과 주문 조회의 공통 진입 조건이다. 상품 상세에서 바로 구매 또는 장바구니 구매를 선택하고 주문서 → 외부 PG → 주문 완료로 진행한다. 주문 조회는 주문 목록 → 주문 상세 → 전체 취소 또는 외부 배송조회로 이어진다.</w:t>
-      </w:r>
-    </w:p>
-    <w:p>
-      <w:r>
-        <w:t>기존 관리자 → 굿즈 판매 현황 → 주문 목록 / 일괄 배송 처리. 주문 상세는 목록의 팝업이다. 기존 관리자 → 온라인 스토어 운영 → 상품 목록 → 상품 등록·수정 / 스토어 설정 팝업으로 구성한다.</w:t>
-      </w:r>
-    </w:p>
-    <w:p>
-      <w:r>
-        <w:br w:type="page"/>
-      </w:r>
-    </w:p>
-    <w:p>
-      <w:pPr>
-        <w:pStyle w:val="Heading1"/>
-      </w:pPr>
-      <w:r>
-        <w:t>사용자 IA 구조도</w:t>
-      </w:r>
-    </w:p>
-    <w:p>
-      <w:r>
-        <w:drawing>
-          <wp:inline xmlns:a="http://schemas.openxmlformats.org/drawingml/2006/main" xmlns:pic="http://schemas.openxmlformats.org/drawingml/2006/picture">
-            <wp:extent cx="6228000" cy="3909800"/>
-            <wp:docPr id="1" name="Picture 1" descr="01 사용자 IA"/>
-            <wp:cNvGraphicFramePr>
-              <a:graphicFrameLocks noChangeAspect="1"/>
-            </wp:cNvGraphicFramePr>
-            <a:graphic>
-              <a:graphicData uri="http://schemas.openxmlformats.org/drawingml/2006/picture">
-                <pic:pic>
-                  <pic:nvPicPr>
-                    <pic:cNvPr id="0" name="01_사용자_IA.png"/>
-                    <pic:cNvPicPr/>
-                  </pic:nvPicPr>
-                  <pic:blipFill>
-                    <a:blip r:embed="rId10"/>
-                    <a:stretch>
-                      <a:fillRect/>
-                    </a:stretch>
-                  </pic:blipFill>
-                  <pic:spPr>
-                    <a:xfrm>
-                      <a:off x="0" y="0"/>
-                      <a:ext cx="6228000" cy="3909800"/>
-                    </a:xfrm>
-                    <a:prstGeom prst="rect"/>
-                  </pic:spPr>
-                </pic:pic>
-              </a:graphicData>
-            </a:graphic>
-          </wp:inline>
-        </w:drawing>
-      </w:r>
-    </w:p>
-    <w:p>
-      <w:pPr>
-        <w:pStyle w:val="Heading1"/>
-      </w:pPr>
-      <w:r>
-        <w:t>사용자 동선</w:t>
-      </w:r>
-    </w:p>
-    <w:p>
-      <w:r>
-        <w:t>탐색은 비로그인 허용, 구매와 주문 조회는 회원 전용이다. 구매 중 로그인 성공 시 원래 선택과 행동을 이어간다. 로그인 닫기는 구매 중단이며 주문을 생성하지 않는다.</w:t>
-      </w:r>
-    </w:p>
-    <w:p>
-      <w:r>
-        <w:t>주소 검색 X03은 U05 내 보조 팝업이다. 결제 결과 실패·중단은 U05로 돌아가고, 결과 미확정은 확인 중으로 안내한다. 결제 승인만 확인되고 주문 저장이 실패한 경우는 자동 복구와 운영 확인 대상이다.</w:t>
-      </w:r>
-    </w:p>
-    <w:p>
-      <w:r>
-        <w:br w:type="page"/>
-      </w:r>
-    </w:p>
-    <w:p>
-      <w:pPr>
-        <w:pStyle w:val="Heading1"/>
-      </w:pPr>
-      <w:r>
-        <w:t>관리자 IA 구조도</w:t>
-      </w:r>
-    </w:p>
-    <w:p>
-      <w:r>
-        <w:drawing>
-          <wp:inline xmlns:a="http://schemas.openxmlformats.org/drawingml/2006/main" xmlns:pic="http://schemas.openxmlformats.org/drawingml/2006/picture">
-            <wp:extent cx="6228000" cy="3909800"/>
-            <wp:docPr id="2" name="Picture 2" descr="02 관리자 IA"/>
-            <wp:cNvGraphicFramePr>
-              <a:graphicFrameLocks noChangeAspect="1"/>
-            </wp:cNvGraphicFramePr>
-            <a:graphic>
-              <a:graphicData uri="http://schemas.openxmlformats.org/drawingml/2006/picture">
-                <pic:pic>
-                  <pic:nvPicPr>
-                    <pic:cNvPr id="0" name="02_관리자_IA.png"/>
-                    <pic:cNvPicPr/>
-                  </pic:nvPicPr>
-                  <pic:blipFill>
-                    <a:blip r:embed="rId11"/>
-                    <a:stretch>
-                      <a:fillRect/>
-                    </a:stretch>
-                  </pic:blipFill>
-                  <pic:spPr>
-                    <a:xfrm>
-                      <a:off x="0" y="0"/>
-                      <a:ext cx="6228000" cy="3909800"/>
-                    </a:xfrm>
-                    <a:prstGeom prst="rect"/>
-                  </pic:spPr>
-                </pic:pic>
-              </a:graphicData>
-            </a:graphic>
-          </wp:inline>
-        </w:drawing>
-      </w:r>
-    </w:p>
-    <w:p>
-      <w:pPr>
-        <w:pStyle w:val="Heading1"/>
-      </w:pPr>
-      <w:r>
-        <w:t>관리자 동선</w:t>
-      </w:r>
-    </w:p>
-    <w:p>
-      <w:r>
-        <w:t>A01 검색 → A02 주문 확인 → C03 출고 대상 내려받기 → 실제 포장·택배 접수 → A03 택배사·송장 입력 → 발송 완료. CSV 다운로드만으로 발송 상태가 변경되지 않는다.</w:t>
-      </w:r>
-    </w:p>
-    <w:p>
-      <w:r>
-        <w:t>A04 상품 선택 → A05 수정 → 저장 → 사용자 목록·상세 반영. A06 정책 변경은 새 주문에 적용하고, 기존 주문의 금액과 취소 기한은 보존한다.</w:t>
-      </w:r>
-    </w:p>
-    <w:p>
-      <w:r>
-        <w:br w:type="page"/>
-      </w:r>
-    </w:p>
-    <w:p>
-      <w:pPr>
-        <w:pStyle w:val="Heading1"/>
-      </w:pPr>
-      <w:r>
-        <w:t>사용자 화면 목록</w:t>
-      </w:r>
-    </w:p>
-    <w:tbl>
-      <w:tblPr>
-        <w:tblW w:type="auto" w:w="0"/>
-        <w:tblLayout w:type="fixed"/>
-        <w:tblLook w:firstColumn="1" w:firstRow="1" w:lastColumn="0" w:lastRow="0" w:noHBand="0" w:noVBand="1" w:val="04A0"/>
-      </w:tblPr>
-      <w:tblGrid>
-        <w:gridCol w:w="680"/>
-        <w:gridCol w:w="2494"/>
-        <w:gridCol w:w="1304"/>
-        <w:gridCol w:w="2948"/>
-        <w:gridCol w:w="2381"/>
-      </w:tblGrid>
-      <w:tr>
-        <w:trPr>
-          <w:tblHeader/>
-          <w:cantSplit/>
-        </w:trPr>
-        <w:tc>
-          <w:tcPr>
-            <w:tcW w:type="dxa" w:w="680"/>
-            <w:tcBorders>
-              <w:top w:val="single" w:sz="4" w:color="D9D9D9"/>
-              <w:left w:val="single" w:sz="4" w:color="D9D9D9"/>
-              <w:bottom w:val="single" w:sz="4" w:color="D9D9D9"/>
-              <w:right w:val="single" w:sz="4" w:color="D9D9D9"/>
-              <w:insideH w:val="single" w:sz="4" w:color="D9D9D9"/>
-              <w:insideV w:val="single" w:sz="4" w:color="D9D9D9"/>
-            </w:tcBorders>
-            <w:tcMar>
-              <w:top w:w="90" w:type="dxa"/>
-              <w:left w:w="90" w:type="dxa"/>
-              <w:bottom w:w="90" w:type="dxa"/>
-              <w:right w:w="90" w:type="dxa"/>
-            </w:tcMar>
-            <w:shd w:fill="173C55"/>
-          </w:tcPr>
-          <w:p>
-            <w:pPr>
-              <w:spacing w:after="20" w:line="264" w:lineRule="auto"/>
-            </w:pPr>
-            <w:r>
-              <w:rPr>
-                <w:b/>
-                <w:color w:val="FFFFFF"/>
-                <w:sz w:val="18"/>
-              </w:rPr>
-              <w:t>ID</w:t>
-            </w:r>
-          </w:p>
-        </w:tc>
-        <w:tc>
-          <w:tcPr>
-            <w:tcW w:type="dxa" w:w="2494"/>
-            <w:tcBorders>
-              <w:top w:val="single" w:sz="4" w:color="D9D9D9"/>
-              <w:left w:val="single" w:sz="4" w:color="D9D9D9"/>
-              <w:bottom w:val="single" w:sz="4" w:color="D9D9D9"/>
-              <w:right w:val="single" w:sz="4" w:color="D9D9D9"/>
-              <w:insideH w:val="single" w:sz="4" w:color="D9D9D9"/>
-              <w:insideV w:val="single" w:sz="4" w:color="D9D9D9"/>
-            </w:tcBorders>
-            <w:tcMar>
-              <w:top w:w="90" w:type="dxa"/>
-              <w:left w:w="90" w:type="dxa"/>
-              <w:bottom w:w="90" w:type="dxa"/>
-              <w:right w:w="90" w:type="dxa"/>
-            </w:tcMar>
-            <w:shd w:fill="173C55"/>
-          </w:tcPr>
-          <w:p>
-            <w:pPr>
-              <w:spacing w:after="20" w:line="264" w:lineRule="auto"/>
-            </w:pPr>
-            <w:r>
-              <w:rPr>
-                <w:b/>
-                <w:color w:val="FFFFFF"/>
-                <w:sz w:val="18"/>
-              </w:rPr>
-              <w:t>화면 및 형태</w:t>
-            </w:r>
-          </w:p>
-        </w:tc>
-        <w:tc>
-          <w:tcPr>
-            <w:tcW w:type="dxa" w:w="1304"/>
-            <w:tcBorders>
-              <w:top w:val="single" w:sz="4" w:color="D9D9D9"/>
-              <w:left w:val="single" w:sz="4" w:color="D9D9D9"/>
-              <w:bottom w:val="single" w:sz="4" w:color="D9D9D9"/>
-              <w:right w:val="single" w:sz="4" w:color="D9D9D9"/>
-              <w:insideH w:val="single" w:sz="4" w:color="D9D9D9"/>
-              <w:insideV w:val="single" w:sz="4" w:color="D9D9D9"/>
-            </w:tcBorders>
-            <w:tcMar>
-              <w:top w:w="90" w:type="dxa"/>
-              <w:left w:w="90" w:type="dxa"/>
-              <w:bottom w:w="90" w:type="dxa"/>
-              <w:right w:w="90" w:type="dxa"/>
-            </w:tcMar>
-            <w:shd w:fill="173C55"/>
-          </w:tcPr>
-          <w:p>
-            <w:pPr>
-              <w:spacing w:after="20" w:line="264" w:lineRule="auto"/>
-            </w:pPr>
-            <w:r>
-              <w:rPr>
-                <w:b/>
-                <w:color w:val="FFFFFF"/>
-                <w:sz w:val="18"/>
-              </w:rPr>
-              <w:t>접근</w:t>
-            </w:r>
-          </w:p>
-        </w:tc>
-        <w:tc>
-          <w:tcPr>
-            <w:tcW w:type="dxa" w:w="2948"/>
-            <w:tcBorders>
-              <w:top w:val="single" w:sz="4" w:color="D9D9D9"/>
-              <w:left w:val="single" w:sz="4" w:color="D9D9D9"/>
-              <w:bottom w:val="single" w:sz="4" w:color="D9D9D9"/>
-              <w:right w:val="single" w:sz="4" w:color="D9D9D9"/>
-              <w:insideH w:val="single" w:sz="4" w:color="D9D9D9"/>
-              <w:insideV w:val="single" w:sz="4" w:color="D9D9D9"/>
-            </w:tcBorders>
-            <w:tcMar>
-              <w:top w:w="90" w:type="dxa"/>
-              <w:left w:w="90" w:type="dxa"/>
-              <w:bottom w:w="90" w:type="dxa"/>
-              <w:right w:w="90" w:type="dxa"/>
-            </w:tcMar>
-            <w:shd w:fill="173C55"/>
-          </w:tcPr>
-          <w:p>
-            <w:pPr>
-              <w:spacing w:after="20" w:line="264" w:lineRule="auto"/>
-            </w:pPr>
-            <w:r>
-              <w:rPr>
-                <w:b/>
-                <w:color w:val="FFFFFF"/>
-                <w:sz w:val="18"/>
-              </w:rPr>
-              <w:t>현재 경로</w:t>
-            </w:r>
-          </w:p>
-        </w:tc>
-        <w:tc>
-          <w:tcPr>
-            <w:tcW w:type="dxa" w:w="2381"/>
-            <w:tcBorders>
-              <w:top w:val="single" w:sz="4" w:color="D9D9D9"/>
-              <w:left w:val="single" w:sz="4" w:color="D9D9D9"/>
-              <w:bottom w:val="single" w:sz="4" w:color="D9D9D9"/>
-              <w:right w:val="single" w:sz="4" w:color="D9D9D9"/>
-              <w:insideH w:val="single" w:sz="4" w:color="D9D9D9"/>
-              <w:insideV w:val="single" w:sz="4" w:color="D9D9D9"/>
-            </w:tcBorders>
-            <w:tcMar>
-              <w:top w:w="90" w:type="dxa"/>
-              <w:left w:w="90" w:type="dxa"/>
-              <w:bottom w:w="90" w:type="dxa"/>
-              <w:right w:w="90" w:type="dxa"/>
-            </w:tcMar>
-            <w:shd w:fill="173C55"/>
-          </w:tcPr>
-          <w:p>
-            <w:pPr>
-              <w:spacing w:after="20" w:line="264" w:lineRule="auto"/>
-            </w:pPr>
-            <w:r>
-              <w:rPr>
-                <w:b/>
-                <w:color w:val="FFFFFF"/>
-                <w:sz w:val="18"/>
-              </w:rPr>
-              <w:t>기능</w:t>
-            </w:r>
-          </w:p>
-        </w:tc>
-      </w:tr>
-      <w:tr>
-        <w:trPr>
-          <w:cantSplit/>
-        </w:trPr>
-        <w:tc>
-          <w:tcPr>
-            <w:tcW w:type="dxa" w:w="680"/>
-            <w:tcBorders>
-              <w:top w:val="single" w:sz="4" w:color="D9D9D9"/>
-              <w:left w:val="single" w:sz="4" w:color="D9D9D9"/>
-              <w:bottom w:val="single" w:sz="4" w:color="D9D9D9"/>
-              <w:right w:val="single" w:sz="4" w:color="D9D9D9"/>
-              <w:insideH w:val="single" w:sz="4" w:color="D9D9D9"/>
-              <w:insideV w:val="single" w:sz="4" w:color="D9D9D9"/>
-            </w:tcBorders>
-            <w:tcMar>
-              <w:top w:w="90" w:type="dxa"/>
-              <w:left w:w="90" w:type="dxa"/>
-              <w:bottom w:w="90" w:type="dxa"/>
-              <w:right w:w="90" w:type="dxa"/>
-            </w:tcMar>
-            <w:shd w:fill="FFFFFF"/>
-          </w:tcPr>
-          <w:p>
-            <w:pPr>
-              <w:spacing w:after="20" w:line="264" w:lineRule="auto"/>
-            </w:pPr>
-            <w:r>
-              <w:rPr>
-                <w:b w:val="0"/>
-                <w:sz w:val="18"/>
-              </w:rPr>
-              <w:t>U01</w:t>
-            </w:r>
-          </w:p>
-        </w:tc>
-        <w:tc>
-          <w:tcPr>
-            <w:tcW w:type="dxa" w:w="2494"/>
-            <w:tcBorders>
-              <w:top w:val="single" w:sz="4" w:color="D9D9D9"/>
-              <w:left w:val="single" w:sz="4" w:color="D9D9D9"/>
-              <w:bottom w:val="single" w:sz="4" w:color="D9D9D9"/>
-              <w:right w:val="single" w:sz="4" w:color="D9D9D9"/>
-              <w:insideH w:val="single" w:sz="4" w:color="D9D9D9"/>
-              <w:insideV w:val="single" w:sz="4" w:color="D9D9D9"/>
-            </w:tcBorders>
-            <w:tcMar>
-              <w:top w:w="90" w:type="dxa"/>
-              <w:left w:w="90" w:type="dxa"/>
-              <w:bottom w:w="90" w:type="dxa"/>
-              <w:right w:w="90" w:type="dxa"/>
-            </w:tcMar>
-            <w:shd w:fill="FFFFFF"/>
-          </w:tcPr>
-          <w:p>
-            <w:pPr>
-              <w:spacing w:after="20" w:line="264" w:lineRule="auto"/>
-            </w:pPr>
-            <w:r>
-              <w:rPr>
-                <w:b w:val="0"/>
-                <w:sz w:val="18"/>
-              </w:rPr>
-              <w:t>스토어 메인 및 상품 목록</w:t>
-              <w:br/>
-              <w:t>페이지</w:t>
-            </w:r>
-          </w:p>
-        </w:tc>
-        <w:tc>
-          <w:tcPr>
-            <w:tcW w:type="dxa" w:w="1304"/>
-            <w:tcBorders>
-              <w:top w:val="single" w:sz="4" w:color="D9D9D9"/>
-              <w:left w:val="single" w:sz="4" w:color="D9D9D9"/>
-              <w:bottom w:val="single" w:sz="4" w:color="D9D9D9"/>
-              <w:right w:val="single" w:sz="4" w:color="D9D9D9"/>
-              <w:insideH w:val="single" w:sz="4" w:color="D9D9D9"/>
-              <w:insideV w:val="single" w:sz="4" w:color="D9D9D9"/>
-            </w:tcBorders>
-            <w:tcMar>
-              <w:top w:w="90" w:type="dxa"/>
-              <w:left w:w="90" w:type="dxa"/>
-              <w:bottom w:w="90" w:type="dxa"/>
-              <w:right w:w="90" w:type="dxa"/>
-            </w:tcMar>
-            <w:shd w:fill="FFFFFF"/>
-          </w:tcPr>
-          <w:p>
-            <w:pPr>
-              <w:spacing w:after="20" w:line="264" w:lineRule="auto"/>
+              <w:spacing w:after="80" w:before="80"/>
             </w:pPr>
             <w:r>
               <w:rPr>
@@ -1128,26 +204,11 @@
         </w:tc>
         <w:tc>
           <w:tcPr>
-            <w:tcW w:type="dxa" w:w="2948"/>
-            <w:tcBorders>
-              <w:top w:val="single" w:sz="4" w:color="D9D9D9"/>
-              <w:left w:val="single" w:sz="4" w:color="D9D9D9"/>
-              <w:bottom w:val="single" w:sz="4" w:color="D9D9D9"/>
-              <w:right w:val="single" w:sz="4" w:color="D9D9D9"/>
-              <w:insideH w:val="single" w:sz="4" w:color="D9D9D9"/>
-              <w:insideV w:val="single" w:sz="4" w:color="D9D9D9"/>
-            </w:tcBorders>
-            <w:tcMar>
-              <w:top w:w="90" w:type="dxa"/>
-              <w:left w:w="90" w:type="dxa"/>
-              <w:bottom w:w="90" w:type="dxa"/>
-              <w:right w:w="90" w:type="dxa"/>
-            </w:tcMar>
-            <w:shd w:fill="FFFFFF"/>
+            <w:tcW w:type="dxa" w:w="1994"/>
           </w:tcPr>
           <w:p>
             <w:pPr>
-              <w:spacing w:after="20" w:line="264" w:lineRule="auto"/>
+              <w:spacing w:after="80" w:before="80"/>
             </w:pPr>
             <w:r>
               <w:rPr>
@@ -1160,33 +221,18 @@
         </w:tc>
         <w:tc>
           <w:tcPr>
-            <w:tcW w:type="dxa" w:w="2381"/>
-            <w:tcBorders>
-              <w:top w:val="single" w:sz="4" w:color="D9D9D9"/>
-              <w:left w:val="single" w:sz="4" w:color="D9D9D9"/>
-              <w:bottom w:val="single" w:sz="4" w:color="D9D9D9"/>
-              <w:right w:val="single" w:sz="4" w:color="D9D9D9"/>
-              <w:insideH w:val="single" w:sz="4" w:color="D9D9D9"/>
-              <w:insideV w:val="single" w:sz="4" w:color="D9D9D9"/>
-            </w:tcBorders>
-            <w:tcMar>
-              <w:top w:w="90" w:type="dxa"/>
-              <w:left w:w="90" w:type="dxa"/>
-              <w:bottom w:w="90" w:type="dxa"/>
-              <w:right w:w="90" w:type="dxa"/>
-            </w:tcMar>
-            <w:shd w:fill="FFFFFF"/>
+            <w:tcW w:type="dxa" w:w="1994"/>
           </w:tcPr>
           <w:p>
             <w:pPr>
-              <w:spacing w:after="20" w:line="264" w:lineRule="auto"/>
+              <w:spacing w:after="80" w:before="80"/>
             </w:pPr>
             <w:r>
               <w:rPr>
                 <w:b w:val="0"/>
                 <w:sz w:val="18"/>
               </w:rPr>
-              <w:t>F01 F02</w:t>
+              <w:t>상품 상세</w:t>
             </w:r>
           </w:p>
         </w:tc>
@@ -1197,58 +243,28 @@
         </w:trPr>
         <w:tc>
           <w:tcPr>
-            <w:tcW w:type="dxa" w:w="680"/>
-            <w:tcBorders>
-              <w:top w:val="single" w:sz="4" w:color="D9D9D9"/>
-              <w:left w:val="single" w:sz="4" w:color="D9D9D9"/>
-              <w:bottom w:val="single" w:sz="4" w:color="D9D9D9"/>
-              <w:right w:val="single" w:sz="4" w:color="D9D9D9"/>
-              <w:insideH w:val="single" w:sz="4" w:color="D9D9D9"/>
-              <w:insideV w:val="single" w:sz="4" w:color="D9D9D9"/>
-            </w:tcBorders>
-            <w:tcMar>
-              <w:top w:w="90" w:type="dxa"/>
-              <w:left w:w="90" w:type="dxa"/>
-              <w:bottom w:w="90" w:type="dxa"/>
-              <w:right w:w="90" w:type="dxa"/>
-            </w:tcMar>
-            <w:shd w:fill="F3F6F8"/>
+            <w:tcW w:type="dxa" w:w="1994"/>
           </w:tcPr>
           <w:p>
             <w:pPr>
-              <w:spacing w:after="20" w:line="264" w:lineRule="auto"/>
+              <w:spacing w:after="80" w:before="80"/>
             </w:pPr>
             <w:r>
               <w:rPr>
                 <w:b w:val="0"/>
                 <w:sz w:val="18"/>
               </w:rPr>
-              <w:t>U02</w:t>
+              <w:t>SCR-U-002</w:t>
             </w:r>
           </w:p>
         </w:tc>
         <w:tc>
           <w:tcPr>
-            <w:tcW w:type="dxa" w:w="2494"/>
-            <w:tcBorders>
-              <w:top w:val="single" w:sz="4" w:color="D9D9D9"/>
-              <w:left w:val="single" w:sz="4" w:color="D9D9D9"/>
-              <w:bottom w:val="single" w:sz="4" w:color="D9D9D9"/>
-              <w:right w:val="single" w:sz="4" w:color="D9D9D9"/>
-              <w:insideH w:val="single" w:sz="4" w:color="D9D9D9"/>
-              <w:insideV w:val="single" w:sz="4" w:color="D9D9D9"/>
-            </w:tcBorders>
-            <w:tcMar>
-              <w:top w:w="90" w:type="dxa"/>
-              <w:left w:w="90" w:type="dxa"/>
-              <w:bottom w:w="90" w:type="dxa"/>
-              <w:right w:w="90" w:type="dxa"/>
-            </w:tcMar>
-            <w:shd w:fill="F3F6F8"/>
+            <w:tcW w:type="dxa" w:w="1994"/>
           </w:tcPr>
           <w:p>
             <w:pPr>
-              <w:spacing w:after="20" w:line="264" w:lineRule="auto"/>
+              <w:spacing w:after="80" w:before="80"/>
             </w:pPr>
             <w:r>
               <w:rPr>
@@ -1256,33 +272,16 @@
                 <w:sz w:val="18"/>
               </w:rPr>
               <w:t>상품 상세</w:t>
-              <w:br/>
-              <w:t>페이지</w:t>
             </w:r>
           </w:p>
         </w:tc>
         <w:tc>
           <w:tcPr>
-            <w:tcW w:type="dxa" w:w="1304"/>
-            <w:tcBorders>
-              <w:top w:val="single" w:sz="4" w:color="D9D9D9"/>
-              <w:left w:val="single" w:sz="4" w:color="D9D9D9"/>
-              <w:bottom w:val="single" w:sz="4" w:color="D9D9D9"/>
-              <w:right w:val="single" w:sz="4" w:color="D9D9D9"/>
-              <w:insideH w:val="single" w:sz="4" w:color="D9D9D9"/>
-              <w:insideV w:val="single" w:sz="4" w:color="D9D9D9"/>
-            </w:tcBorders>
-            <w:tcMar>
-              <w:top w:w="90" w:type="dxa"/>
-              <w:left w:w="90" w:type="dxa"/>
-              <w:bottom w:w="90" w:type="dxa"/>
-              <w:right w:w="90" w:type="dxa"/>
-            </w:tcMar>
-            <w:shd w:fill="F3F6F8"/>
+            <w:tcW w:type="dxa" w:w="1994"/>
           </w:tcPr>
           <w:p>
             <w:pPr>
-              <w:spacing w:after="20" w:line="264" w:lineRule="auto"/>
+              <w:spacing w:after="80" w:before="80"/>
             </w:pPr>
             <w:r>
               <w:rPr>
@@ -1295,26 +294,11 @@
         </w:tc>
         <w:tc>
           <w:tcPr>
-            <w:tcW w:type="dxa" w:w="2948"/>
-            <w:tcBorders>
-              <w:top w:val="single" w:sz="4" w:color="D9D9D9"/>
-              <w:left w:val="single" w:sz="4" w:color="D9D9D9"/>
-              <w:bottom w:val="single" w:sz="4" w:color="D9D9D9"/>
-              <w:right w:val="single" w:sz="4" w:color="D9D9D9"/>
-              <w:insideH w:val="single" w:sz="4" w:color="D9D9D9"/>
-              <w:insideV w:val="single" w:sz="4" w:color="D9D9D9"/>
-            </w:tcBorders>
-            <w:tcMar>
-              <w:top w:w="90" w:type="dxa"/>
-              <w:left w:w="90" w:type="dxa"/>
-              <w:bottom w:w="90" w:type="dxa"/>
-              <w:right w:w="90" w:type="dxa"/>
-            </w:tcMar>
-            <w:shd w:fill="F3F6F8"/>
+            <w:tcW w:type="dxa" w:w="1994"/>
           </w:tcPr>
           <w:p>
             <w:pPr>
-              <w:spacing w:after="20" w:line="264" w:lineRule="auto"/>
+              <w:spacing w:after="80" w:before="80"/>
             </w:pPr>
             <w:r>
               <w:rPr>
@@ -1327,33 +311,18 @@
         </w:tc>
         <w:tc>
           <w:tcPr>
-            <w:tcW w:type="dxa" w:w="2381"/>
-            <w:tcBorders>
-              <w:top w:val="single" w:sz="4" w:color="D9D9D9"/>
-              <w:left w:val="single" w:sz="4" w:color="D9D9D9"/>
-              <w:bottom w:val="single" w:sz="4" w:color="D9D9D9"/>
-              <w:right w:val="single" w:sz="4" w:color="D9D9D9"/>
-              <w:insideH w:val="single" w:sz="4" w:color="D9D9D9"/>
-              <w:insideV w:val="single" w:sz="4" w:color="D9D9D9"/>
-            </w:tcBorders>
-            <w:tcMar>
-              <w:top w:w="90" w:type="dxa"/>
-              <w:left w:w="90" w:type="dxa"/>
-              <w:bottom w:w="90" w:type="dxa"/>
-              <w:right w:w="90" w:type="dxa"/>
-            </w:tcMar>
-            <w:shd w:fill="F3F6F8"/>
+            <w:tcW w:type="dxa" w:w="1994"/>
           </w:tcPr>
           <w:p>
             <w:pPr>
-              <w:spacing w:after="20" w:line="264" w:lineRule="auto"/>
+              <w:spacing w:after="80" w:before="80"/>
             </w:pPr>
             <w:r>
               <w:rPr>
                 <w:b w:val="0"/>
                 <w:sz w:val="18"/>
               </w:rPr>
-              <w:t>F03 F04</w:t>
+              <w:t>장바구니 / 바로 구매</w:t>
             </w:r>
           </w:p>
         </w:tc>
@@ -1364,163 +333,86 @@
         </w:trPr>
         <w:tc>
           <w:tcPr>
-            <w:tcW w:type="dxa" w:w="680"/>
-            <w:tcBorders>
-              <w:top w:val="single" w:sz="4" w:color="D9D9D9"/>
-              <w:left w:val="single" w:sz="4" w:color="D9D9D9"/>
-              <w:bottom w:val="single" w:sz="4" w:color="D9D9D9"/>
-              <w:right w:val="single" w:sz="4" w:color="D9D9D9"/>
-              <w:insideH w:val="single" w:sz="4" w:color="D9D9D9"/>
-              <w:insideV w:val="single" w:sz="4" w:color="D9D9D9"/>
-            </w:tcBorders>
-            <w:tcMar>
-              <w:top w:w="90" w:type="dxa"/>
-              <w:left w:w="90" w:type="dxa"/>
-              <w:bottom w:w="90" w:type="dxa"/>
-              <w:right w:w="90" w:type="dxa"/>
-            </w:tcMar>
-            <w:shd w:fill="FFFFFF"/>
+            <w:tcW w:type="dxa" w:w="1994"/>
           </w:tcPr>
           <w:p>
             <w:pPr>
-              <w:spacing w:after="20" w:line="264" w:lineRule="auto"/>
+              <w:spacing w:after="80" w:before="80"/>
             </w:pPr>
             <w:r>
               <w:rPr>
                 <w:b w:val="0"/>
                 <w:sz w:val="18"/>
               </w:rPr>
-              <w:t>U03</w:t>
+              <w:t>SCR-U-003</w:t>
             </w:r>
           </w:p>
         </w:tc>
         <w:tc>
           <w:tcPr>
-            <w:tcW w:type="dxa" w:w="2494"/>
-            <w:tcBorders>
-              <w:top w:val="single" w:sz="4" w:color="D9D9D9"/>
-              <w:left w:val="single" w:sz="4" w:color="D9D9D9"/>
-              <w:bottom w:val="single" w:sz="4" w:color="D9D9D9"/>
-              <w:right w:val="single" w:sz="4" w:color="D9D9D9"/>
-              <w:insideH w:val="single" w:sz="4" w:color="D9D9D9"/>
-              <w:insideV w:val="single" w:sz="4" w:color="D9D9D9"/>
-            </w:tcBorders>
-            <w:tcMar>
-              <w:top w:w="90" w:type="dxa"/>
-              <w:left w:w="90" w:type="dxa"/>
-              <w:bottom w:w="90" w:type="dxa"/>
-              <w:right w:w="90" w:type="dxa"/>
-            </w:tcMar>
-            <w:shd w:fill="FFFFFF"/>
+            <w:tcW w:type="dxa" w:w="1994"/>
           </w:tcPr>
           <w:p>
             <w:pPr>
-              <w:spacing w:after="20" w:line="264" w:lineRule="auto"/>
+              <w:spacing w:after="80" w:before="80"/>
             </w:pPr>
             <w:r>
               <w:rPr>
                 <w:b w:val="0"/>
                 <w:sz w:val="18"/>
               </w:rPr>
-              <w:t>로그인</w:t>
-              <w:br/>
-              <w:t>팝업</w:t>
+              <w:t>로그인 팝업</w:t>
             </w:r>
           </w:p>
         </w:tc>
         <w:tc>
           <w:tcPr>
-            <w:tcW w:type="dxa" w:w="1304"/>
-            <w:tcBorders>
-              <w:top w:val="single" w:sz="4" w:color="D9D9D9"/>
-              <w:left w:val="single" w:sz="4" w:color="D9D9D9"/>
-              <w:bottom w:val="single" w:sz="4" w:color="D9D9D9"/>
-              <w:right w:val="single" w:sz="4" w:color="D9D9D9"/>
-              <w:insideH w:val="single" w:sz="4" w:color="D9D9D9"/>
-              <w:insideV w:val="single" w:sz="4" w:color="D9D9D9"/>
-            </w:tcBorders>
-            <w:tcMar>
-              <w:top w:w="90" w:type="dxa"/>
-              <w:left w:w="90" w:type="dxa"/>
-              <w:bottom w:w="90" w:type="dxa"/>
-              <w:right w:w="90" w:type="dxa"/>
-            </w:tcMar>
-            <w:shd w:fill="FFFFFF"/>
+            <w:tcW w:type="dxa" w:w="1994"/>
           </w:tcPr>
           <w:p>
             <w:pPr>
-              <w:spacing w:after="20" w:line="264" w:lineRule="auto"/>
+              <w:spacing w:after="80" w:before="80"/>
             </w:pPr>
             <w:r>
               <w:rPr>
                 <w:b w:val="0"/>
                 <w:sz w:val="18"/>
               </w:rPr>
-              <w:t>비로그인</w:t>
+              <w:t>구매 및 주문 조회 전</w:t>
             </w:r>
           </w:p>
         </w:tc>
         <w:tc>
           <w:tcPr>
-            <w:tcW w:type="dxa" w:w="2948"/>
-            <w:tcBorders>
-              <w:top w:val="single" w:sz="4" w:color="D9D9D9"/>
-              <w:left w:val="single" w:sz="4" w:color="D9D9D9"/>
-              <w:bottom w:val="single" w:sz="4" w:color="D9D9D9"/>
-              <w:right w:val="single" w:sz="4" w:color="D9D9D9"/>
-              <w:insideH w:val="single" w:sz="4" w:color="D9D9D9"/>
-              <w:insideV w:val="single" w:sz="4" w:color="D9D9D9"/>
-            </w:tcBorders>
-            <w:tcMar>
-              <w:top w:w="90" w:type="dxa"/>
-              <w:left w:w="90" w:type="dxa"/>
-              <w:bottom w:w="90" w:type="dxa"/>
-              <w:right w:w="90" w:type="dxa"/>
-            </w:tcMar>
-            <w:shd w:fill="FFFFFF"/>
+            <w:tcW w:type="dxa" w:w="1994"/>
           </w:tcPr>
           <w:p>
             <w:pPr>
-              <w:spacing w:after="20" w:line="264" w:lineRule="auto"/>
+              <w:spacing w:after="80" w:before="80"/>
             </w:pPr>
             <w:r>
               <w:rPr>
                 <w:b w:val="0"/>
                 <w:sz w:val="18"/>
               </w:rPr>
-              <w:t># 경로 없음</w:t>
+              <w:t>loginModal</w:t>
             </w:r>
           </w:p>
         </w:tc>
         <w:tc>
           <w:tcPr>
-            <w:tcW w:type="dxa" w:w="2381"/>
-            <w:tcBorders>
-              <w:top w:val="single" w:sz="4" w:color="D9D9D9"/>
-              <w:left w:val="single" w:sz="4" w:color="D9D9D9"/>
-              <w:bottom w:val="single" w:sz="4" w:color="D9D9D9"/>
-              <w:right w:val="single" w:sz="4" w:color="D9D9D9"/>
-              <w:insideH w:val="single" w:sz="4" w:color="D9D9D9"/>
-              <w:insideV w:val="single" w:sz="4" w:color="D9D9D9"/>
-            </w:tcBorders>
-            <w:tcMar>
-              <w:top w:w="90" w:type="dxa"/>
-              <w:left w:w="90" w:type="dxa"/>
-              <w:bottom w:w="90" w:type="dxa"/>
-              <w:right w:w="90" w:type="dxa"/>
-            </w:tcMar>
-            <w:shd w:fill="FFFFFF"/>
+            <w:tcW w:type="dxa" w:w="1994"/>
           </w:tcPr>
           <w:p>
             <w:pPr>
-              <w:spacing w:after="20" w:line="264" w:lineRule="auto"/>
+              <w:spacing w:after="80" w:before="80"/>
             </w:pPr>
             <w:r>
               <w:rPr>
                 <w:b w:val="0"/>
                 <w:sz w:val="18"/>
               </w:rPr>
-              <w:t>F05</w:t>
+              <w:t>기존 행동 복귀</w:t>
             </w:r>
           </w:p>
         </w:tc>
@@ -1531,92 +423,45 @@
         </w:trPr>
         <w:tc>
           <w:tcPr>
-            <w:tcW w:type="dxa" w:w="680"/>
-            <w:tcBorders>
-              <w:top w:val="single" w:sz="4" w:color="D9D9D9"/>
-              <w:left w:val="single" w:sz="4" w:color="D9D9D9"/>
-              <w:bottom w:val="single" w:sz="4" w:color="D9D9D9"/>
-              <w:right w:val="single" w:sz="4" w:color="D9D9D9"/>
-              <w:insideH w:val="single" w:sz="4" w:color="D9D9D9"/>
-              <w:insideV w:val="single" w:sz="4" w:color="D9D9D9"/>
-            </w:tcBorders>
-            <w:tcMar>
-              <w:top w:w="90" w:type="dxa"/>
-              <w:left w:w="90" w:type="dxa"/>
-              <w:bottom w:w="90" w:type="dxa"/>
-              <w:right w:w="90" w:type="dxa"/>
-            </w:tcMar>
-            <w:shd w:fill="F3F6F8"/>
+            <w:tcW w:type="dxa" w:w="1994"/>
           </w:tcPr>
           <w:p>
             <w:pPr>
-              <w:spacing w:after="20" w:line="264" w:lineRule="auto"/>
+              <w:spacing w:after="80" w:before="80"/>
             </w:pPr>
             <w:r>
               <w:rPr>
                 <w:b w:val="0"/>
                 <w:sz w:val="18"/>
               </w:rPr>
-              <w:t>U04</w:t>
+              <w:t>SCR-U-004</w:t>
             </w:r>
           </w:p>
         </w:tc>
         <w:tc>
           <w:tcPr>
-            <w:tcW w:type="dxa" w:w="2494"/>
-            <w:tcBorders>
-              <w:top w:val="single" w:sz="4" w:color="D9D9D9"/>
-              <w:left w:val="single" w:sz="4" w:color="D9D9D9"/>
-              <w:bottom w:val="single" w:sz="4" w:color="D9D9D9"/>
-              <w:right w:val="single" w:sz="4" w:color="D9D9D9"/>
-              <w:insideH w:val="single" w:sz="4" w:color="D9D9D9"/>
-              <w:insideV w:val="single" w:sz="4" w:color="D9D9D9"/>
-            </w:tcBorders>
-            <w:tcMar>
-              <w:top w:w="90" w:type="dxa"/>
-              <w:left w:w="90" w:type="dxa"/>
-              <w:bottom w:w="90" w:type="dxa"/>
-              <w:right w:w="90" w:type="dxa"/>
-            </w:tcMar>
-            <w:shd w:fill="F3F6F8"/>
+            <w:tcW w:type="dxa" w:w="1994"/>
           </w:tcPr>
           <w:p>
             <w:pPr>
-              <w:spacing w:after="20" w:line="264" w:lineRule="auto"/>
+              <w:spacing w:after="80" w:before="80"/>
             </w:pPr>
             <w:r>
               <w:rPr>
                 <w:b w:val="0"/>
                 <w:sz w:val="18"/>
               </w:rPr>
-              <w:t>장바구니</w:t>
-              <w:br/>
-              <w:t>패널</w:t>
+              <w:t>장바구니 패널</w:t>
             </w:r>
           </w:p>
         </w:tc>
         <w:tc>
           <w:tcPr>
-            <w:tcW w:type="dxa" w:w="1304"/>
-            <w:tcBorders>
-              <w:top w:val="single" w:sz="4" w:color="D9D9D9"/>
-              <w:left w:val="single" w:sz="4" w:color="D9D9D9"/>
-              <w:bottom w:val="single" w:sz="4" w:color="D9D9D9"/>
-              <w:right w:val="single" w:sz="4" w:color="D9D9D9"/>
-              <w:insideH w:val="single" w:sz="4" w:color="D9D9D9"/>
-              <w:insideV w:val="single" w:sz="4" w:color="D9D9D9"/>
-            </w:tcBorders>
-            <w:tcMar>
-              <w:top w:w="90" w:type="dxa"/>
-              <w:left w:w="90" w:type="dxa"/>
-              <w:bottom w:w="90" w:type="dxa"/>
-              <w:right w:w="90" w:type="dxa"/>
-            </w:tcMar>
-            <w:shd w:fill="F3F6F8"/>
+            <w:tcW w:type="dxa" w:w="1994"/>
           </w:tcPr>
           <w:p>
             <w:pPr>
-              <w:spacing w:after="20" w:line="264" w:lineRule="auto"/>
+              <w:spacing w:after="80" w:before="80"/>
             </w:pPr>
             <w:r>
               <w:rPr>
@@ -1629,65 +474,35 @@
         </w:tc>
         <w:tc>
           <w:tcPr>
-            <w:tcW w:type="dxa" w:w="2948"/>
-            <w:tcBorders>
-              <w:top w:val="single" w:sz="4" w:color="D9D9D9"/>
-              <w:left w:val="single" w:sz="4" w:color="D9D9D9"/>
-              <w:bottom w:val="single" w:sz="4" w:color="D9D9D9"/>
-              <w:right w:val="single" w:sz="4" w:color="D9D9D9"/>
-              <w:insideH w:val="single" w:sz="4" w:color="D9D9D9"/>
-              <w:insideV w:val="single" w:sz="4" w:color="D9D9D9"/>
-            </w:tcBorders>
-            <w:tcMar>
-              <w:top w:w="90" w:type="dxa"/>
-              <w:left w:w="90" w:type="dxa"/>
-              <w:bottom w:w="90" w:type="dxa"/>
-              <w:right w:w="90" w:type="dxa"/>
-            </w:tcMar>
-            <w:shd w:fill="F3F6F8"/>
+            <w:tcW w:type="dxa" w:w="1994"/>
           </w:tcPr>
           <w:p>
             <w:pPr>
-              <w:spacing w:after="20" w:line="264" w:lineRule="auto"/>
+              <w:spacing w:after="80" w:before="80"/>
             </w:pPr>
             <w:r>
               <w:rPr>
                 <w:b w:val="0"/>
                 <w:sz w:val="18"/>
               </w:rPr>
-              <w:t>경로 없음</w:t>
+              <w:t>cartPanel</w:t>
             </w:r>
           </w:p>
         </w:tc>
         <w:tc>
           <w:tcPr>
-            <w:tcW w:type="dxa" w:w="2381"/>
-            <w:tcBorders>
-              <w:top w:val="single" w:sz="4" w:color="D9D9D9"/>
-              <w:left w:val="single" w:sz="4" w:color="D9D9D9"/>
-              <w:bottom w:val="single" w:sz="4" w:color="D9D9D9"/>
-              <w:right w:val="single" w:sz="4" w:color="D9D9D9"/>
-              <w:insideH w:val="single" w:sz="4" w:color="D9D9D9"/>
-              <w:insideV w:val="single" w:sz="4" w:color="D9D9D9"/>
-            </w:tcBorders>
-            <w:tcMar>
-              <w:top w:w="90" w:type="dxa"/>
-              <w:left w:w="90" w:type="dxa"/>
-              <w:bottom w:w="90" w:type="dxa"/>
-              <w:right w:w="90" w:type="dxa"/>
-            </w:tcMar>
-            <w:shd w:fill="F3F6F8"/>
+            <w:tcW w:type="dxa" w:w="1994"/>
           </w:tcPr>
           <w:p>
             <w:pPr>
-              <w:spacing w:after="20" w:line="264" w:lineRule="auto"/>
+              <w:spacing w:after="80" w:before="80"/>
             </w:pPr>
             <w:r>
               <w:rPr>
                 <w:b w:val="0"/>
                 <w:sz w:val="18"/>
               </w:rPr>
-              <w:t>F06</w:t>
+              <w:t>주문서</w:t>
             </w:r>
           </w:p>
         </w:tc>
@@ -1698,92 +513,45 @@
         </w:trPr>
         <w:tc>
           <w:tcPr>
-            <w:tcW w:type="dxa" w:w="680"/>
-            <w:tcBorders>
-              <w:top w:val="single" w:sz="4" w:color="D9D9D9"/>
-              <w:left w:val="single" w:sz="4" w:color="D9D9D9"/>
-              <w:bottom w:val="single" w:sz="4" w:color="D9D9D9"/>
-              <w:right w:val="single" w:sz="4" w:color="D9D9D9"/>
-              <w:insideH w:val="single" w:sz="4" w:color="D9D9D9"/>
-              <w:insideV w:val="single" w:sz="4" w:color="D9D9D9"/>
-            </w:tcBorders>
-            <w:tcMar>
-              <w:top w:w="90" w:type="dxa"/>
-              <w:left w:w="90" w:type="dxa"/>
-              <w:bottom w:w="90" w:type="dxa"/>
-              <w:right w:w="90" w:type="dxa"/>
-            </w:tcMar>
-            <w:shd w:fill="FFFFFF"/>
+            <w:tcW w:type="dxa" w:w="1994"/>
           </w:tcPr>
           <w:p>
             <w:pPr>
-              <w:spacing w:after="20" w:line="264" w:lineRule="auto"/>
+              <w:spacing w:after="80" w:before="80"/>
             </w:pPr>
             <w:r>
               <w:rPr>
                 <w:b w:val="0"/>
                 <w:sz w:val="18"/>
               </w:rPr>
-              <w:t>U05</w:t>
+              <w:t>SCR-U-005</w:t>
             </w:r>
           </w:p>
         </w:tc>
         <w:tc>
           <w:tcPr>
-            <w:tcW w:type="dxa" w:w="2494"/>
-            <w:tcBorders>
-              <w:top w:val="single" w:sz="4" w:color="D9D9D9"/>
-              <w:left w:val="single" w:sz="4" w:color="D9D9D9"/>
-              <w:bottom w:val="single" w:sz="4" w:color="D9D9D9"/>
-              <w:right w:val="single" w:sz="4" w:color="D9D9D9"/>
-              <w:insideH w:val="single" w:sz="4" w:color="D9D9D9"/>
-              <w:insideV w:val="single" w:sz="4" w:color="D9D9D9"/>
-            </w:tcBorders>
-            <w:tcMar>
-              <w:top w:w="90" w:type="dxa"/>
-              <w:left w:w="90" w:type="dxa"/>
-              <w:bottom w:w="90" w:type="dxa"/>
-              <w:right w:w="90" w:type="dxa"/>
-            </w:tcMar>
-            <w:shd w:fill="FFFFFF"/>
+            <w:tcW w:type="dxa" w:w="1994"/>
           </w:tcPr>
           <w:p>
             <w:pPr>
-              <w:spacing w:after="20" w:line="264" w:lineRule="auto"/>
+              <w:spacing w:after="80" w:before="80"/>
             </w:pPr>
             <w:r>
               <w:rPr>
                 <w:b w:val="0"/>
                 <w:sz w:val="18"/>
               </w:rPr>
-              <w:t>주문서</w:t>
-              <w:br/>
-              <w:t>페이지</w:t>
+              <w:t>주문서와 필수 동의</w:t>
             </w:r>
           </w:p>
         </w:tc>
         <w:tc>
           <w:tcPr>
-            <w:tcW w:type="dxa" w:w="1304"/>
-            <w:tcBorders>
-              <w:top w:val="single" w:sz="4" w:color="D9D9D9"/>
-              <w:left w:val="single" w:sz="4" w:color="D9D9D9"/>
-              <w:bottom w:val="single" w:sz="4" w:color="D9D9D9"/>
-              <w:right w:val="single" w:sz="4" w:color="D9D9D9"/>
-              <w:insideH w:val="single" w:sz="4" w:color="D9D9D9"/>
-              <w:insideV w:val="single" w:sz="4" w:color="D9D9D9"/>
-            </w:tcBorders>
-            <w:tcMar>
-              <w:top w:w="90" w:type="dxa"/>
-              <w:left w:w="90" w:type="dxa"/>
-              <w:bottom w:w="90" w:type="dxa"/>
-              <w:right w:w="90" w:type="dxa"/>
-            </w:tcMar>
-            <w:shd w:fill="FFFFFF"/>
+            <w:tcW w:type="dxa" w:w="1994"/>
           </w:tcPr>
           <w:p>
             <w:pPr>
-              <w:spacing w:after="20" w:line="264" w:lineRule="auto"/>
+              <w:spacing w:after="80" w:before="80"/>
             </w:pPr>
             <w:r>
               <w:rPr>
@@ -1796,26 +564,11 @@
         </w:tc>
         <w:tc>
           <w:tcPr>
-            <w:tcW w:type="dxa" w:w="2948"/>
-            <w:tcBorders>
-              <w:top w:val="single" w:sz="4" w:color="D9D9D9"/>
-              <w:left w:val="single" w:sz="4" w:color="D9D9D9"/>
-              <w:bottom w:val="single" w:sz="4" w:color="D9D9D9"/>
-              <w:right w:val="single" w:sz="4" w:color="D9D9D9"/>
-              <w:insideH w:val="single" w:sz="4" w:color="D9D9D9"/>
-              <w:insideV w:val="single" w:sz="4" w:color="D9D9D9"/>
-            </w:tcBorders>
-            <w:tcMar>
-              <w:top w:w="90" w:type="dxa"/>
-              <w:left w:w="90" w:type="dxa"/>
-              <w:bottom w:w="90" w:type="dxa"/>
-              <w:right w:w="90" w:type="dxa"/>
-            </w:tcMar>
-            <w:shd w:fill="FFFFFF"/>
+            <w:tcW w:type="dxa" w:w="1994"/>
           </w:tcPr>
           <w:p>
             <w:pPr>
-              <w:spacing w:after="20" w:line="264" w:lineRule="auto"/>
+              <w:spacing w:after="80" w:before="80"/>
             </w:pPr>
             <w:r>
               <w:rPr>
@@ -1828,33 +581,18 @@
         </w:tc>
         <w:tc>
           <w:tcPr>
-            <w:tcW w:type="dxa" w:w="2381"/>
-            <w:tcBorders>
-              <w:top w:val="single" w:sz="4" w:color="D9D9D9"/>
-              <w:left w:val="single" w:sz="4" w:color="D9D9D9"/>
-              <w:bottom w:val="single" w:sz="4" w:color="D9D9D9"/>
-              <w:right w:val="single" w:sz="4" w:color="D9D9D9"/>
-              <w:insideH w:val="single" w:sz="4" w:color="D9D9D9"/>
-              <w:insideV w:val="single" w:sz="4" w:color="D9D9D9"/>
-            </w:tcBorders>
-            <w:tcMar>
-              <w:top w:w="90" w:type="dxa"/>
-              <w:left w:w="90" w:type="dxa"/>
-              <w:bottom w:w="90" w:type="dxa"/>
-              <w:right w:w="90" w:type="dxa"/>
-            </w:tcMar>
-            <w:shd w:fill="FFFFFF"/>
+            <w:tcW w:type="dxa" w:w="1994"/>
           </w:tcPr>
           <w:p>
             <w:pPr>
-              <w:spacing w:after="20" w:line="264" w:lineRule="auto"/>
+              <w:spacing w:after="80" w:before="80"/>
             </w:pPr>
             <w:r>
               <w:rPr>
                 <w:b w:val="0"/>
                 <w:sz w:val="18"/>
               </w:rPr>
-              <w:t>F07 F08 F09</w:t>
+              <w:t>PG 결제</w:t>
             </w:r>
           </w:p>
         </w:tc>
@@ -1865,58 +603,28 @@
         </w:trPr>
         <w:tc>
           <w:tcPr>
-            <w:tcW w:type="dxa" w:w="680"/>
-            <w:tcBorders>
-              <w:top w:val="single" w:sz="4" w:color="D9D9D9"/>
-              <w:left w:val="single" w:sz="4" w:color="D9D9D9"/>
-              <w:bottom w:val="single" w:sz="4" w:color="D9D9D9"/>
-              <w:right w:val="single" w:sz="4" w:color="D9D9D9"/>
-              <w:insideH w:val="single" w:sz="4" w:color="D9D9D9"/>
-              <w:insideV w:val="single" w:sz="4" w:color="D9D9D9"/>
-            </w:tcBorders>
-            <w:tcMar>
-              <w:top w:w="90" w:type="dxa"/>
-              <w:left w:w="90" w:type="dxa"/>
-              <w:bottom w:w="90" w:type="dxa"/>
-              <w:right w:w="90" w:type="dxa"/>
-            </w:tcMar>
-            <w:shd w:fill="F3F6F8"/>
+            <w:tcW w:type="dxa" w:w="1994"/>
           </w:tcPr>
           <w:p>
             <w:pPr>
-              <w:spacing w:after="20" w:line="264" w:lineRule="auto"/>
+              <w:spacing w:after="80" w:before="80"/>
             </w:pPr>
             <w:r>
               <w:rPr>
                 <w:b w:val="0"/>
                 <w:sz w:val="18"/>
               </w:rPr>
-              <w:t>U06</w:t>
+              <w:t>SCR-U-006</w:t>
             </w:r>
           </w:p>
         </w:tc>
         <w:tc>
           <w:tcPr>
-            <w:tcW w:type="dxa" w:w="2494"/>
-            <w:tcBorders>
-              <w:top w:val="single" w:sz="4" w:color="D9D9D9"/>
-              <w:left w:val="single" w:sz="4" w:color="D9D9D9"/>
-              <w:bottom w:val="single" w:sz="4" w:color="D9D9D9"/>
-              <w:right w:val="single" w:sz="4" w:color="D9D9D9"/>
-              <w:insideH w:val="single" w:sz="4" w:color="D9D9D9"/>
-              <w:insideV w:val="single" w:sz="4" w:color="D9D9D9"/>
-            </w:tcBorders>
-            <w:tcMar>
-              <w:top w:w="90" w:type="dxa"/>
-              <w:left w:w="90" w:type="dxa"/>
-              <w:bottom w:w="90" w:type="dxa"/>
-              <w:right w:w="90" w:type="dxa"/>
-            </w:tcMar>
-            <w:shd w:fill="F3F6F8"/>
+            <w:tcW w:type="dxa" w:w="1994"/>
           </w:tcPr>
           <w:p>
             <w:pPr>
-              <w:spacing w:after="20" w:line="264" w:lineRule="auto"/>
+              <w:spacing w:after="80" w:before="80"/>
             </w:pPr>
             <w:r>
               <w:rPr>
@@ -1924,33 +632,16 @@
                 <w:sz w:val="18"/>
               </w:rPr>
               <w:t>주문 완료</w:t>
-              <w:br/>
-              <w:t>페이지</w:t>
             </w:r>
           </w:p>
         </w:tc>
         <w:tc>
           <w:tcPr>
-            <w:tcW w:type="dxa" w:w="1304"/>
-            <w:tcBorders>
-              <w:top w:val="single" w:sz="4" w:color="D9D9D9"/>
-              <w:left w:val="single" w:sz="4" w:color="D9D9D9"/>
-              <w:bottom w:val="single" w:sz="4" w:color="D9D9D9"/>
-              <w:right w:val="single" w:sz="4" w:color="D9D9D9"/>
-              <w:insideH w:val="single" w:sz="4" w:color="D9D9D9"/>
-              <w:insideV w:val="single" w:sz="4" w:color="D9D9D9"/>
-            </w:tcBorders>
-            <w:tcMar>
-              <w:top w:w="90" w:type="dxa"/>
-              <w:left w:w="90" w:type="dxa"/>
-              <w:bottom w:w="90" w:type="dxa"/>
-              <w:right w:w="90" w:type="dxa"/>
-            </w:tcMar>
-            <w:shd w:fill="F3F6F8"/>
+            <w:tcW w:type="dxa" w:w="1994"/>
           </w:tcPr>
           <w:p>
             <w:pPr>
-              <w:spacing w:after="20" w:line="264" w:lineRule="auto"/>
+              <w:spacing w:after="80" w:before="80"/>
             </w:pPr>
             <w:r>
               <w:rPr>
@@ -1963,26 +654,11 @@
         </w:tc>
         <w:tc>
           <w:tcPr>
-            <w:tcW w:type="dxa" w:w="2948"/>
-            <w:tcBorders>
-              <w:top w:val="single" w:sz="4" w:color="D9D9D9"/>
-              <w:left w:val="single" w:sz="4" w:color="D9D9D9"/>
-              <w:bottom w:val="single" w:sz="4" w:color="D9D9D9"/>
-              <w:right w:val="single" w:sz="4" w:color="D9D9D9"/>
-              <w:insideH w:val="single" w:sz="4" w:color="D9D9D9"/>
-              <w:insideV w:val="single" w:sz="4" w:color="D9D9D9"/>
-            </w:tcBorders>
-            <w:tcMar>
-              <w:top w:w="90" w:type="dxa"/>
-              <w:left w:w="90" w:type="dxa"/>
-              <w:bottom w:w="90" w:type="dxa"/>
-              <w:right w:w="90" w:type="dxa"/>
-            </w:tcMar>
-            <w:shd w:fill="F3F6F8"/>
+            <w:tcW w:type="dxa" w:w="1994"/>
           </w:tcPr>
           <w:p>
             <w:pPr>
-              <w:spacing w:after="20" w:line="264" w:lineRule="auto"/>
+              <w:spacing w:after="80" w:before="80"/>
             </w:pPr>
             <w:r>
               <w:rPr>
@@ -1995,33 +671,18 @@
         </w:tc>
         <w:tc>
           <w:tcPr>
-            <w:tcW w:type="dxa" w:w="2381"/>
-            <w:tcBorders>
-              <w:top w:val="single" w:sz="4" w:color="D9D9D9"/>
-              <w:left w:val="single" w:sz="4" w:color="D9D9D9"/>
-              <w:bottom w:val="single" w:sz="4" w:color="D9D9D9"/>
-              <w:right w:val="single" w:sz="4" w:color="D9D9D9"/>
-              <w:insideH w:val="single" w:sz="4" w:color="D9D9D9"/>
-              <w:insideV w:val="single" w:sz="4" w:color="D9D9D9"/>
-            </w:tcBorders>
-            <w:tcMar>
-              <w:top w:w="90" w:type="dxa"/>
-              <w:left w:w="90" w:type="dxa"/>
-              <w:bottom w:w="90" w:type="dxa"/>
-              <w:right w:w="90" w:type="dxa"/>
-            </w:tcMar>
-            <w:shd w:fill="F3F6F8"/>
+            <w:tcW w:type="dxa" w:w="1994"/>
           </w:tcPr>
           <w:p>
             <w:pPr>
-              <w:spacing w:after="20" w:line="264" w:lineRule="auto"/>
+              <w:spacing w:after="80" w:before="80"/>
             </w:pPr>
             <w:r>
               <w:rPr>
                 <w:b w:val="0"/>
                 <w:sz w:val="18"/>
               </w:rPr>
-              <w:t>F10</w:t>
+              <w:t>주문 조회</w:t>
             </w:r>
           </w:p>
         </w:tc>
@@ -2032,124 +693,62 @@
         </w:trPr>
         <w:tc>
           <w:tcPr>
-            <w:tcW w:type="dxa" w:w="680"/>
-            <w:tcBorders>
-              <w:top w:val="single" w:sz="4" w:color="D9D9D9"/>
-              <w:left w:val="single" w:sz="4" w:color="D9D9D9"/>
-              <w:bottom w:val="single" w:sz="4" w:color="D9D9D9"/>
-              <w:right w:val="single" w:sz="4" w:color="D9D9D9"/>
-              <w:insideH w:val="single" w:sz="4" w:color="D9D9D9"/>
-              <w:insideV w:val="single" w:sz="4" w:color="D9D9D9"/>
-            </w:tcBorders>
-            <w:tcMar>
-              <w:top w:w="90" w:type="dxa"/>
-              <w:left w:w="90" w:type="dxa"/>
-              <w:bottom w:w="90" w:type="dxa"/>
-              <w:right w:w="90" w:type="dxa"/>
-            </w:tcMar>
-            <w:shd w:fill="FFFFFF"/>
+            <w:tcW w:type="dxa" w:w="1994"/>
           </w:tcPr>
           <w:p>
             <w:pPr>
-              <w:spacing w:after="20" w:line="264" w:lineRule="auto"/>
+              <w:spacing w:after="80" w:before="80"/>
             </w:pPr>
             <w:r>
               <w:rPr>
                 <w:b w:val="0"/>
                 <w:sz w:val="18"/>
               </w:rPr>
-              <w:t>U07</w:t>
+              <w:t>SCR-U-007</w:t>
             </w:r>
           </w:p>
         </w:tc>
         <w:tc>
           <w:tcPr>
-            <w:tcW w:type="dxa" w:w="2494"/>
-            <w:tcBorders>
-              <w:top w:val="single" w:sz="4" w:color="D9D9D9"/>
-              <w:left w:val="single" w:sz="4" w:color="D9D9D9"/>
-              <w:bottom w:val="single" w:sz="4" w:color="D9D9D9"/>
-              <w:right w:val="single" w:sz="4" w:color="D9D9D9"/>
-              <w:insideH w:val="single" w:sz="4" w:color="D9D9D9"/>
-              <w:insideV w:val="single" w:sz="4" w:color="D9D9D9"/>
-            </w:tcBorders>
-            <w:tcMar>
-              <w:top w:w="90" w:type="dxa"/>
-              <w:left w:w="90" w:type="dxa"/>
-              <w:bottom w:w="90" w:type="dxa"/>
-              <w:right w:w="90" w:type="dxa"/>
-            </w:tcMar>
-            <w:shd w:fill="FFFFFF"/>
+            <w:tcW w:type="dxa" w:w="1994"/>
           </w:tcPr>
           <w:p>
             <w:pPr>
-              <w:spacing w:after="20" w:line="264" w:lineRule="auto"/>
+              <w:spacing w:after="80" w:before="80"/>
             </w:pPr>
             <w:r>
               <w:rPr>
                 <w:b w:val="0"/>
                 <w:sz w:val="18"/>
               </w:rPr>
-              <w:t>주문 목록</w:t>
-              <w:br/>
-              <w:t>페이지</w:t>
+              <w:t>본인 주문 목록</w:t>
             </w:r>
           </w:p>
         </w:tc>
         <w:tc>
           <w:tcPr>
-            <w:tcW w:type="dxa" w:w="1304"/>
-            <w:tcBorders>
-              <w:top w:val="single" w:sz="4" w:color="D9D9D9"/>
-              <w:left w:val="single" w:sz="4" w:color="D9D9D9"/>
-              <w:bottom w:val="single" w:sz="4" w:color="D9D9D9"/>
-              <w:right w:val="single" w:sz="4" w:color="D9D9D9"/>
-              <w:insideH w:val="single" w:sz="4" w:color="D9D9D9"/>
-              <w:insideV w:val="single" w:sz="4" w:color="D9D9D9"/>
-            </w:tcBorders>
-            <w:tcMar>
-              <w:top w:w="90" w:type="dxa"/>
-              <w:left w:w="90" w:type="dxa"/>
-              <w:bottom w:w="90" w:type="dxa"/>
-              <w:right w:w="90" w:type="dxa"/>
-            </w:tcMar>
-            <w:shd w:fill="FFFFFF"/>
+            <w:tcW w:type="dxa" w:w="1994"/>
           </w:tcPr>
           <w:p>
             <w:pPr>
-              <w:spacing w:after="20" w:line="264" w:lineRule="auto"/>
+              <w:spacing w:after="80" w:before="80"/>
             </w:pPr>
             <w:r>
               <w:rPr>
                 <w:b w:val="0"/>
                 <w:sz w:val="18"/>
               </w:rPr>
-              <w:t>본인 주문</w:t>
+              <w:t>회원</w:t>
             </w:r>
           </w:p>
         </w:tc>
         <w:tc>
           <w:tcPr>
-            <w:tcW w:type="dxa" w:w="2948"/>
-            <w:tcBorders>
-              <w:top w:val="single" w:sz="4" w:color="D9D9D9"/>
-              <w:left w:val="single" w:sz="4" w:color="D9D9D9"/>
-              <w:bottom w:val="single" w:sz="4" w:color="D9D9D9"/>
-              <w:right w:val="single" w:sz="4" w:color="D9D9D9"/>
-              <w:insideH w:val="single" w:sz="4" w:color="D9D9D9"/>
-              <w:insideV w:val="single" w:sz="4" w:color="D9D9D9"/>
-            </w:tcBorders>
-            <w:tcMar>
-              <w:top w:w="90" w:type="dxa"/>
-              <w:left w:w="90" w:type="dxa"/>
-              <w:bottom w:w="90" w:type="dxa"/>
-              <w:right w:w="90" w:type="dxa"/>
-            </w:tcMar>
-            <w:shd w:fill="FFFFFF"/>
+            <w:tcW w:type="dxa" w:w="1994"/>
           </w:tcPr>
           <w:p>
             <w:pPr>
-              <w:spacing w:after="20" w:line="264" w:lineRule="auto"/>
+              <w:spacing w:after="80" w:before="80"/>
             </w:pPr>
             <w:r>
               <w:rPr>
@@ -2162,33 +761,18 @@
         </w:tc>
         <w:tc>
           <w:tcPr>
-            <w:tcW w:type="dxa" w:w="2381"/>
-            <w:tcBorders>
-              <w:top w:val="single" w:sz="4" w:color="D9D9D9"/>
-              <w:left w:val="single" w:sz="4" w:color="D9D9D9"/>
-              <w:bottom w:val="single" w:sz="4" w:color="D9D9D9"/>
-              <w:right w:val="single" w:sz="4" w:color="D9D9D9"/>
-              <w:insideH w:val="single" w:sz="4" w:color="D9D9D9"/>
-              <w:insideV w:val="single" w:sz="4" w:color="D9D9D9"/>
-            </w:tcBorders>
-            <w:tcMar>
-              <w:top w:w="90" w:type="dxa"/>
-              <w:left w:w="90" w:type="dxa"/>
-              <w:bottom w:w="90" w:type="dxa"/>
-              <w:right w:w="90" w:type="dxa"/>
-            </w:tcMar>
-            <w:shd w:fill="FFFFFF"/>
+            <w:tcW w:type="dxa" w:w="1994"/>
           </w:tcPr>
           <w:p>
             <w:pPr>
-              <w:spacing w:after="20" w:line="264" w:lineRule="auto"/>
+              <w:spacing w:after="80" w:before="80"/>
             </w:pPr>
             <w:r>
               <w:rPr>
                 <w:b w:val="0"/>
                 <w:sz w:val="18"/>
               </w:rPr>
-              <w:t>F11</w:t>
+              <w:t>주문 상세</w:t>
             </w:r>
           </w:p>
         </w:tc>
@@ -2199,92 +783,45 @@
         </w:trPr>
         <w:tc>
           <w:tcPr>
-            <w:tcW w:type="dxa" w:w="680"/>
-            <w:tcBorders>
-              <w:top w:val="single" w:sz="4" w:color="D9D9D9"/>
-              <w:left w:val="single" w:sz="4" w:color="D9D9D9"/>
-              <w:bottom w:val="single" w:sz="4" w:color="D9D9D9"/>
-              <w:right w:val="single" w:sz="4" w:color="D9D9D9"/>
-              <w:insideH w:val="single" w:sz="4" w:color="D9D9D9"/>
-              <w:insideV w:val="single" w:sz="4" w:color="D9D9D9"/>
-            </w:tcBorders>
-            <w:tcMar>
-              <w:top w:w="90" w:type="dxa"/>
-              <w:left w:w="90" w:type="dxa"/>
-              <w:bottom w:w="90" w:type="dxa"/>
-              <w:right w:w="90" w:type="dxa"/>
-            </w:tcMar>
-            <w:shd w:fill="F3F6F8"/>
+            <w:tcW w:type="dxa" w:w="1994"/>
           </w:tcPr>
           <w:p>
             <w:pPr>
-              <w:spacing w:after="20" w:line="264" w:lineRule="auto"/>
+              <w:spacing w:after="80" w:before="80"/>
             </w:pPr>
             <w:r>
               <w:rPr>
                 <w:b w:val="0"/>
                 <w:sz w:val="18"/>
               </w:rPr>
-              <w:t>U08</w:t>
+              <w:t>SCR-U-008</w:t>
             </w:r>
           </w:p>
         </w:tc>
         <w:tc>
           <w:tcPr>
-            <w:tcW w:type="dxa" w:w="2494"/>
-            <w:tcBorders>
-              <w:top w:val="single" w:sz="4" w:color="D9D9D9"/>
-              <w:left w:val="single" w:sz="4" w:color="D9D9D9"/>
-              <w:bottom w:val="single" w:sz="4" w:color="D9D9D9"/>
-              <w:right w:val="single" w:sz="4" w:color="D9D9D9"/>
-              <w:insideH w:val="single" w:sz="4" w:color="D9D9D9"/>
-              <w:insideV w:val="single" w:sz="4" w:color="D9D9D9"/>
-            </w:tcBorders>
-            <w:tcMar>
-              <w:top w:w="90" w:type="dxa"/>
-              <w:left w:w="90" w:type="dxa"/>
-              <w:bottom w:w="90" w:type="dxa"/>
-              <w:right w:w="90" w:type="dxa"/>
-            </w:tcMar>
-            <w:shd w:fill="F3F6F8"/>
+            <w:tcW w:type="dxa" w:w="1994"/>
           </w:tcPr>
           <w:p>
             <w:pPr>
-              <w:spacing w:after="20" w:line="264" w:lineRule="auto"/>
+              <w:spacing w:after="80" w:before="80"/>
             </w:pPr>
             <w:r>
               <w:rPr>
                 <w:b w:val="0"/>
                 <w:sz w:val="18"/>
               </w:rPr>
-              <w:t>주문 상세</w:t>
-              <w:br/>
-              <w:t>페이지</w:t>
+              <w:t>주문 상세와 취소 반품</w:t>
             </w:r>
           </w:p>
         </w:tc>
         <w:tc>
           <w:tcPr>
-            <w:tcW w:type="dxa" w:w="1304"/>
-            <w:tcBorders>
-              <w:top w:val="single" w:sz="4" w:color="D9D9D9"/>
-              <w:left w:val="single" w:sz="4" w:color="D9D9D9"/>
-              <w:bottom w:val="single" w:sz="4" w:color="D9D9D9"/>
-              <w:right w:val="single" w:sz="4" w:color="D9D9D9"/>
-              <w:insideH w:val="single" w:sz="4" w:color="D9D9D9"/>
-              <w:insideV w:val="single" w:sz="4" w:color="D9D9D9"/>
-            </w:tcBorders>
-            <w:tcMar>
-              <w:top w:w="90" w:type="dxa"/>
-              <w:left w:w="90" w:type="dxa"/>
-              <w:bottom w:w="90" w:type="dxa"/>
-              <w:right w:w="90" w:type="dxa"/>
-            </w:tcMar>
-            <w:shd w:fill="F3F6F8"/>
+            <w:tcW w:type="dxa" w:w="1994"/>
           </w:tcPr>
           <w:p>
             <w:pPr>
-              <w:spacing w:after="20" w:line="264" w:lineRule="auto"/>
+              <w:spacing w:after="80" w:before="80"/>
             </w:pPr>
             <w:r>
               <w:rPr>
@@ -2297,26 +834,11 @@
         </w:tc>
         <w:tc>
           <w:tcPr>
-            <w:tcW w:type="dxa" w:w="2948"/>
-            <w:tcBorders>
-              <w:top w:val="single" w:sz="4" w:color="D9D9D9"/>
-              <w:left w:val="single" w:sz="4" w:color="D9D9D9"/>
-              <w:bottom w:val="single" w:sz="4" w:color="D9D9D9"/>
-              <w:right w:val="single" w:sz="4" w:color="D9D9D9"/>
-              <w:insideH w:val="single" w:sz="4" w:color="D9D9D9"/>
-              <w:insideV w:val="single" w:sz="4" w:color="D9D9D9"/>
-            </w:tcBorders>
-            <w:tcMar>
-              <w:top w:w="90" w:type="dxa"/>
-              <w:left w:w="90" w:type="dxa"/>
-              <w:bottom w:w="90" w:type="dxa"/>
-              <w:right w:w="90" w:type="dxa"/>
-            </w:tcMar>
-            <w:shd w:fill="F3F6F8"/>
+            <w:tcW w:type="dxa" w:w="1994"/>
           </w:tcPr>
           <w:p>
             <w:pPr>
-              <w:spacing w:after="20" w:line="264" w:lineRule="auto"/>
+              <w:spacing w:after="80" w:before="80"/>
             </w:pPr>
             <w:r>
               <w:rPr>
@@ -2329,181 +851,107 @@
         </w:tc>
         <w:tc>
           <w:tcPr>
-            <w:tcW w:type="dxa" w:w="2381"/>
-            <w:tcBorders>
-              <w:top w:val="single" w:sz="4" w:color="D9D9D9"/>
-              <w:left w:val="single" w:sz="4" w:color="D9D9D9"/>
-              <w:bottom w:val="single" w:sz="4" w:color="D9D9D9"/>
-              <w:right w:val="single" w:sz="4" w:color="D9D9D9"/>
-              <w:insideH w:val="single" w:sz="4" w:color="D9D9D9"/>
-              <w:insideV w:val="single" w:sz="4" w:color="D9D9D9"/>
-            </w:tcBorders>
-            <w:tcMar>
-              <w:top w:w="90" w:type="dxa"/>
-              <w:left w:w="90" w:type="dxa"/>
-              <w:bottom w:w="90" w:type="dxa"/>
-              <w:right w:w="90" w:type="dxa"/>
-            </w:tcMar>
-            <w:shd w:fill="F3F6F8"/>
+            <w:tcW w:type="dxa" w:w="1994"/>
           </w:tcPr>
           <w:p>
             <w:pPr>
-              <w:spacing w:after="20" w:line="264" w:lineRule="auto"/>
+              <w:spacing w:after="80" w:before="80"/>
             </w:pPr>
             <w:r>
               <w:rPr>
                 <w:b w:val="0"/>
                 <w:sz w:val="18"/>
               </w:rPr>
-              <w:t>F12 F13 F14</w:t>
+              <w:t>배송조회 / 반품 운송장</w:t>
             </w:r>
           </w:p>
         </w:tc>
       </w:tr>
     </w:tbl>
-    <w:p/>
     <w:p>
       <w:pPr>
         <w:pStyle w:val="Heading1"/>
       </w:pPr>
       <w:r>
-        <w:t>공통 영역과 접근 처리</w:t>
+        <w:t>관리자 이동</w:t>
       </w:r>
     </w:p>
     <w:p>
       <w:r>
-        <w:t>헤더는 상품 목록·주문 조회·장바구니 진입을 제공한다. 빈 장바구니는 숨김 대신 0개 상태 진입을 허용하는 개선 제안이다. 푸터는 고객센터·사업자 정보·기존 서비스 안내를 제공하며 공개 관리자 링크는 운영 URL·권한 정책에 맞춰 결정한다.</w:t>
+        <w:t>기존 관리자 → 커머스관리시스템 → 상품 판매 현황 / 배송 처리 / 매출 정산 / 온라인 스토어 운영</w:t>
       </w:r>
     </w:p>
     <w:p>
       <w:r>
-        <w:t>주문 목록·상세·완료 주소는 서버에서 로그인과 소유권을 검사한다. UI에서 감추는 것만으로 권한 처리를 대신하지 않는다. 존재하지 않거나 볼 수 없는 주문은 개인정보 없이 동일한 조회 불가 안내를 제공한다.</w:t>
-      </w:r>
-    </w:p>
-    <w:p>
-      <w:r>
-        <w:br w:type="page"/>
-      </w:r>
-    </w:p>
-    <w:p>
-      <w:pPr>
-        <w:pStyle w:val="Heading1"/>
-      </w:pPr>
-      <w:r>
-        <w:t>관리자 화면 목록과 경로 원칙</w:t>
+        <w:t>온라인 스토어 운영 → 상품 관리 / 메인 배너 관리 / 스토어 설정. 통합 관리자는 계정별 커머스 권한을 관리합니다.</w:t>
       </w:r>
     </w:p>
     <w:tbl>
       <w:tblPr>
         <w:tblW w:type="auto" w:w="0"/>
-        <w:tblLayout w:type="fixed"/>
+        <w:tblLayout w:type="autofit"/>
         <w:tblLook w:firstColumn="1" w:firstRow="1" w:lastColumn="0" w:lastRow="0" w:noHBand="0" w:noVBand="1" w:val="04A0"/>
       </w:tblPr>
       <w:tblGrid>
-        <w:gridCol w:w="680"/>
-        <w:gridCol w:w="2494"/>
-        <w:gridCol w:w="1304"/>
-        <w:gridCol w:w="2948"/>
-        <w:gridCol w:w="2381"/>
+        <w:gridCol w:w="1994"/>
+        <w:gridCol w:w="1994"/>
+        <w:gridCol w:w="1994"/>
+        <w:gridCol w:w="1994"/>
+        <w:gridCol w:w="1994"/>
       </w:tblGrid>
       <w:tr>
         <w:trPr>
+          <w:cantSplit/>
           <w:tblHeader/>
-          <w:cantSplit/>
         </w:trPr>
         <w:tc>
           <w:tcPr>
-            <w:tcW w:type="dxa" w:w="680"/>
-            <w:tcBorders>
-              <w:top w:val="single" w:sz="4" w:color="D9D9D9"/>
-              <w:left w:val="single" w:sz="4" w:color="D9D9D9"/>
-              <w:bottom w:val="single" w:sz="4" w:color="D9D9D9"/>
-              <w:right w:val="single" w:sz="4" w:color="D9D9D9"/>
-              <w:insideH w:val="single" w:sz="4" w:color="D9D9D9"/>
-              <w:insideV w:val="single" w:sz="4" w:color="D9D9D9"/>
-            </w:tcBorders>
-            <w:tcMar>
-              <w:top w:w="90" w:type="dxa"/>
-              <w:left w:w="90" w:type="dxa"/>
-              <w:bottom w:w="90" w:type="dxa"/>
-              <w:right w:w="90" w:type="dxa"/>
-            </w:tcMar>
-            <w:shd w:fill="173C55"/>
+            <w:tcW w:type="dxa" w:w="1994"/>
+            <w:shd w:fill="EDEFF2"/>
           </w:tcPr>
           <w:p>
             <w:pPr>
-              <w:spacing w:after="20" w:line="264" w:lineRule="auto"/>
+              <w:spacing w:after="80" w:before="80"/>
             </w:pPr>
             <w:r>
               <w:rPr>
                 <w:b/>
-                <w:color w:val="FFFFFF"/>
                 <w:sz w:val="18"/>
               </w:rPr>
-              <w:t>ID</w:t>
+              <w:t>화면 ID</w:t>
             </w:r>
           </w:p>
         </w:tc>
         <w:tc>
           <w:tcPr>
-            <w:tcW w:type="dxa" w:w="2494"/>
-            <w:tcBorders>
-              <w:top w:val="single" w:sz="4" w:color="D9D9D9"/>
-              <w:left w:val="single" w:sz="4" w:color="D9D9D9"/>
-              <w:bottom w:val="single" w:sz="4" w:color="D9D9D9"/>
-              <w:right w:val="single" w:sz="4" w:color="D9D9D9"/>
-              <w:insideH w:val="single" w:sz="4" w:color="D9D9D9"/>
-              <w:insideV w:val="single" w:sz="4" w:color="D9D9D9"/>
-            </w:tcBorders>
-            <w:tcMar>
-              <w:top w:w="90" w:type="dxa"/>
-              <w:left w:w="90" w:type="dxa"/>
-              <w:bottom w:w="90" w:type="dxa"/>
-              <w:right w:w="90" w:type="dxa"/>
-            </w:tcMar>
-            <w:shd w:fill="173C55"/>
+            <w:tcW w:type="dxa" w:w="1994"/>
+            <w:shd w:fill="EDEFF2"/>
           </w:tcPr>
           <w:p>
             <w:pPr>
-              <w:spacing w:after="20" w:line="264" w:lineRule="auto"/>
+              <w:spacing w:after="80" w:before="80"/>
             </w:pPr>
             <w:r>
               <w:rPr>
                 <w:b/>
-                <w:color w:val="FFFFFF"/>
                 <w:sz w:val="18"/>
               </w:rPr>
-              <w:t>화면 및 형태</w:t>
+              <w:t>화면</w:t>
             </w:r>
           </w:p>
         </w:tc>
         <w:tc>
           <w:tcPr>
-            <w:tcW w:type="dxa" w:w="1304"/>
-            <w:tcBorders>
-              <w:top w:val="single" w:sz="4" w:color="D9D9D9"/>
-              <w:left w:val="single" w:sz="4" w:color="D9D9D9"/>
-              <w:bottom w:val="single" w:sz="4" w:color="D9D9D9"/>
-              <w:right w:val="single" w:sz="4" w:color="D9D9D9"/>
-              <w:insideH w:val="single" w:sz="4" w:color="D9D9D9"/>
-              <w:insideV w:val="single" w:sz="4" w:color="D9D9D9"/>
-            </w:tcBorders>
-            <w:tcMar>
-              <w:top w:w="90" w:type="dxa"/>
-              <w:left w:w="90" w:type="dxa"/>
-              <w:bottom w:w="90" w:type="dxa"/>
-              <w:right w:w="90" w:type="dxa"/>
-            </w:tcMar>
-            <w:shd w:fill="173C55"/>
+            <w:tcW w:type="dxa" w:w="1994"/>
+            <w:shd w:fill="EDEFF2"/>
           </w:tcPr>
           <w:p>
             <w:pPr>
-              <w:spacing w:after="20" w:line="264" w:lineRule="auto"/>
+              <w:spacing w:after="80" w:before="80"/>
             </w:pPr>
             <w:r>
               <w:rPr>
                 <w:b/>
-                <w:color w:val="FFFFFF"/>
                 <w:sz w:val="18"/>
               </w:rPr>
               <w:t>접근</w:t>
@@ -2512,67 +960,37 @@
         </w:tc>
         <w:tc>
           <w:tcPr>
-            <w:tcW w:type="dxa" w:w="2948"/>
-            <w:tcBorders>
-              <w:top w:val="single" w:sz="4" w:color="D9D9D9"/>
-              <w:left w:val="single" w:sz="4" w:color="D9D9D9"/>
-              <w:bottom w:val="single" w:sz="4" w:color="D9D9D9"/>
-              <w:right w:val="single" w:sz="4" w:color="D9D9D9"/>
-              <w:insideH w:val="single" w:sz="4" w:color="D9D9D9"/>
-              <w:insideV w:val="single" w:sz="4" w:color="D9D9D9"/>
-            </w:tcBorders>
-            <w:tcMar>
-              <w:top w:w="90" w:type="dxa"/>
-              <w:left w:w="90" w:type="dxa"/>
-              <w:bottom w:w="90" w:type="dxa"/>
-              <w:right w:w="90" w:type="dxa"/>
-            </w:tcMar>
-            <w:shd w:fill="173C55"/>
+            <w:tcW w:type="dxa" w:w="1994"/>
+            <w:shd w:fill="EDEFF2"/>
           </w:tcPr>
           <w:p>
             <w:pPr>
-              <w:spacing w:after="20" w:line="264" w:lineRule="auto"/>
+              <w:spacing w:after="80" w:before="80"/>
             </w:pPr>
             <w:r>
               <w:rPr>
                 <w:b/>
-                <w:color w:val="FFFFFF"/>
                 <w:sz w:val="18"/>
               </w:rPr>
-              <w:t>현재 식별자</w:t>
+              <w:t>식별자</w:t>
             </w:r>
           </w:p>
         </w:tc>
         <w:tc>
           <w:tcPr>
-            <w:tcW w:type="dxa" w:w="2381"/>
-            <w:tcBorders>
-              <w:top w:val="single" w:sz="4" w:color="D9D9D9"/>
-              <w:left w:val="single" w:sz="4" w:color="D9D9D9"/>
-              <w:bottom w:val="single" w:sz="4" w:color="D9D9D9"/>
-              <w:right w:val="single" w:sz="4" w:color="D9D9D9"/>
-              <w:insideH w:val="single" w:sz="4" w:color="D9D9D9"/>
-              <w:insideV w:val="single" w:sz="4" w:color="D9D9D9"/>
-            </w:tcBorders>
-            <w:tcMar>
-              <w:top w:w="90" w:type="dxa"/>
-              <w:left w:w="90" w:type="dxa"/>
-              <w:bottom w:w="90" w:type="dxa"/>
-              <w:right w:w="90" w:type="dxa"/>
-            </w:tcMar>
-            <w:shd w:fill="173C55"/>
+            <w:tcW w:type="dxa" w:w="1994"/>
+            <w:shd w:fill="EDEFF2"/>
           </w:tcPr>
           <w:p>
             <w:pPr>
-              <w:spacing w:after="20" w:line="264" w:lineRule="auto"/>
+              <w:spacing w:after="80" w:before="80"/>
             </w:pPr>
             <w:r>
               <w:rPr>
                 <w:b/>
-                <w:color w:val="FFFFFF"/>
                 <w:sz w:val="18"/>
               </w:rPr>
-              <w:t>기능</w:t>
+              <w:t>연결</w:t>
             </w:r>
           </w:p>
         </w:tc>
@@ -2583,163 +1001,86 @@
         </w:trPr>
         <w:tc>
           <w:tcPr>
-            <w:tcW w:type="dxa" w:w="680"/>
-            <w:tcBorders>
-              <w:top w:val="single" w:sz="4" w:color="D9D9D9"/>
-              <w:left w:val="single" w:sz="4" w:color="D9D9D9"/>
-              <w:bottom w:val="single" w:sz="4" w:color="D9D9D9"/>
-              <w:right w:val="single" w:sz="4" w:color="D9D9D9"/>
-              <w:insideH w:val="single" w:sz="4" w:color="D9D9D9"/>
-              <w:insideV w:val="single" w:sz="4" w:color="D9D9D9"/>
-            </w:tcBorders>
-            <w:tcMar>
-              <w:top w:w="90" w:type="dxa"/>
-              <w:left w:w="90" w:type="dxa"/>
-              <w:bottom w:w="90" w:type="dxa"/>
-              <w:right w:w="90" w:type="dxa"/>
-            </w:tcMar>
-            <w:shd w:fill="FFFFFF"/>
+            <w:tcW w:type="dxa" w:w="1994"/>
           </w:tcPr>
           <w:p>
             <w:pPr>
-              <w:spacing w:after="20" w:line="264" w:lineRule="auto"/>
+              <w:spacing w:after="80" w:before="80"/>
             </w:pPr>
             <w:r>
               <w:rPr>
                 <w:b w:val="0"/>
                 <w:sz w:val="18"/>
               </w:rPr>
-              <w:t>A01</w:t>
+              <w:t>SCR-A-001</w:t>
             </w:r>
           </w:p>
         </w:tc>
         <w:tc>
           <w:tcPr>
-            <w:tcW w:type="dxa" w:w="2494"/>
-            <w:tcBorders>
-              <w:top w:val="single" w:sz="4" w:color="D9D9D9"/>
-              <w:left w:val="single" w:sz="4" w:color="D9D9D9"/>
-              <w:bottom w:val="single" w:sz="4" w:color="D9D9D9"/>
-              <w:right w:val="single" w:sz="4" w:color="D9D9D9"/>
-              <w:insideH w:val="single" w:sz="4" w:color="D9D9D9"/>
-              <w:insideV w:val="single" w:sz="4" w:color="D9D9D9"/>
-            </w:tcBorders>
-            <w:tcMar>
-              <w:top w:w="90" w:type="dxa"/>
-              <w:left w:w="90" w:type="dxa"/>
-              <w:bottom w:w="90" w:type="dxa"/>
-              <w:right w:w="90" w:type="dxa"/>
-            </w:tcMar>
-            <w:shd w:fill="FFFFFF"/>
+            <w:tcW w:type="dxa" w:w="1994"/>
           </w:tcPr>
           <w:p>
             <w:pPr>
-              <w:spacing w:after="20" w:line="264" w:lineRule="auto"/>
+              <w:spacing w:after="80" w:before="80"/>
             </w:pPr>
             <w:r>
               <w:rPr>
                 <w:b w:val="0"/>
                 <w:sz w:val="18"/>
               </w:rPr>
-              <w:t>굿즈 주문 목록</w:t>
-              <w:br/>
-              <w:t>메뉴 및 탭</w:t>
+              <w:t>상품 판매 현황</w:t>
             </w:r>
           </w:p>
         </w:tc>
         <w:tc>
           <w:tcPr>
-            <w:tcW w:type="dxa" w:w="1304"/>
-            <w:tcBorders>
-              <w:top w:val="single" w:sz="4" w:color="D9D9D9"/>
-              <w:left w:val="single" w:sz="4" w:color="D9D9D9"/>
-              <w:bottom w:val="single" w:sz="4" w:color="D9D9D9"/>
-              <w:right w:val="single" w:sz="4" w:color="D9D9D9"/>
-              <w:insideH w:val="single" w:sz="4" w:color="D9D9D9"/>
-              <w:insideV w:val="single" w:sz="4" w:color="D9D9D9"/>
-            </w:tcBorders>
-            <w:tcMar>
-              <w:top w:w="90" w:type="dxa"/>
-              <w:left w:w="90" w:type="dxa"/>
-              <w:bottom w:w="90" w:type="dxa"/>
-              <w:right w:w="90" w:type="dxa"/>
-            </w:tcMar>
-            <w:shd w:fill="FFFFFF"/>
+            <w:tcW w:type="dxa" w:w="1994"/>
           </w:tcPr>
           <w:p>
             <w:pPr>
-              <w:spacing w:after="20" w:line="264" w:lineRule="auto"/>
+              <w:spacing w:after="80" w:before="80"/>
             </w:pPr>
             <w:r>
               <w:rPr>
                 <w:b w:val="0"/>
                 <w:sz w:val="18"/>
               </w:rPr>
-              <w:t>권한 관리자</w:t>
+              <w:t>커머스 관리자</w:t>
             </w:r>
           </w:p>
         </w:tc>
         <w:tc>
           <w:tcPr>
-            <w:tcW w:type="dxa" w:w="2948"/>
-            <w:tcBorders>
-              <w:top w:val="single" w:sz="4" w:color="D9D9D9"/>
-              <w:left w:val="single" w:sz="4" w:color="D9D9D9"/>
-              <w:bottom w:val="single" w:sz="4" w:color="D9D9D9"/>
-              <w:right w:val="single" w:sz="4" w:color="D9D9D9"/>
-              <w:insideH w:val="single" w:sz="4" w:color="D9D9D9"/>
-              <w:insideV w:val="single" w:sz="4" w:color="D9D9D9"/>
-            </w:tcBorders>
-            <w:tcMar>
-              <w:top w:w="90" w:type="dxa"/>
-              <w:left w:w="90" w:type="dxa"/>
-              <w:bottom w:w="90" w:type="dxa"/>
-              <w:right w:w="90" w:type="dxa"/>
-            </w:tcMar>
-            <w:shd w:fill="FFFFFF"/>
+            <w:tcW w:type="dxa" w:w="1994"/>
           </w:tcPr>
           <w:p>
             <w:pPr>
-              <w:spacing w:after="20" w:line="264" w:lineRule="auto"/>
+              <w:spacing w:after="80" w:before="80"/>
             </w:pPr>
             <w:r>
               <w:rPr>
                 <w:b w:val="0"/>
                 <w:sz w:val="18"/>
               </w:rPr>
-              <w:t>admin.html / sales / orders</w:t>
+              <w:t>salesView</w:t>
             </w:r>
           </w:p>
         </w:tc>
         <w:tc>
           <w:tcPr>
-            <w:tcW w:type="dxa" w:w="2381"/>
-            <w:tcBorders>
-              <w:top w:val="single" w:sz="4" w:color="D9D9D9"/>
-              <w:left w:val="single" w:sz="4" w:color="D9D9D9"/>
-              <w:bottom w:val="single" w:sz="4" w:color="D9D9D9"/>
-              <w:right w:val="single" w:sz="4" w:color="D9D9D9"/>
-              <w:insideH w:val="single" w:sz="4" w:color="D9D9D9"/>
-              <w:insideV w:val="single" w:sz="4" w:color="D9D9D9"/>
-            </w:tcBorders>
-            <w:tcMar>
-              <w:top w:w="90" w:type="dxa"/>
-              <w:left w:w="90" w:type="dxa"/>
-              <w:bottom w:w="90" w:type="dxa"/>
-              <w:right w:w="90" w:type="dxa"/>
-            </w:tcMar>
-            <w:shd w:fill="FFFFFF"/>
+            <w:tcW w:type="dxa" w:w="1994"/>
           </w:tcPr>
           <w:p>
             <w:pPr>
-              <w:spacing w:after="20" w:line="264" w:lineRule="auto"/>
+              <w:spacing w:after="80" w:before="80"/>
             </w:pPr>
             <w:r>
               <w:rPr>
                 <w:b w:val="0"/>
                 <w:sz w:val="18"/>
               </w:rPr>
-              <w:t>F15 F16</w:t>
+              <w:t>검색 / 상세 / CSV</w:t>
             </w:r>
           </w:p>
         </w:tc>
@@ -2750,124 +1091,62 @@
         </w:trPr>
         <w:tc>
           <w:tcPr>
-            <w:tcW w:type="dxa" w:w="680"/>
-            <w:tcBorders>
-              <w:top w:val="single" w:sz="4" w:color="D9D9D9"/>
-              <w:left w:val="single" w:sz="4" w:color="D9D9D9"/>
-              <w:bottom w:val="single" w:sz="4" w:color="D9D9D9"/>
-              <w:right w:val="single" w:sz="4" w:color="D9D9D9"/>
-              <w:insideH w:val="single" w:sz="4" w:color="D9D9D9"/>
-              <w:insideV w:val="single" w:sz="4" w:color="D9D9D9"/>
-            </w:tcBorders>
-            <w:tcMar>
-              <w:top w:w="90" w:type="dxa"/>
-              <w:left w:w="90" w:type="dxa"/>
-              <w:bottom w:w="90" w:type="dxa"/>
-              <w:right w:w="90" w:type="dxa"/>
-            </w:tcMar>
-            <w:shd w:fill="F3F6F8"/>
+            <w:tcW w:type="dxa" w:w="1994"/>
           </w:tcPr>
           <w:p>
             <w:pPr>
-              <w:spacing w:after="20" w:line="264" w:lineRule="auto"/>
+              <w:spacing w:after="80" w:before="80"/>
             </w:pPr>
             <w:r>
               <w:rPr>
                 <w:b w:val="0"/>
                 <w:sz w:val="18"/>
               </w:rPr>
-              <w:t>A02</w:t>
+              <w:t>SCR-A-002</w:t>
             </w:r>
           </w:p>
         </w:tc>
         <w:tc>
           <w:tcPr>
-            <w:tcW w:type="dxa" w:w="2494"/>
-            <w:tcBorders>
-              <w:top w:val="single" w:sz="4" w:color="D9D9D9"/>
-              <w:left w:val="single" w:sz="4" w:color="D9D9D9"/>
-              <w:bottom w:val="single" w:sz="4" w:color="D9D9D9"/>
-              <w:right w:val="single" w:sz="4" w:color="D9D9D9"/>
-              <w:insideH w:val="single" w:sz="4" w:color="D9D9D9"/>
-              <w:insideV w:val="single" w:sz="4" w:color="D9D9D9"/>
-            </w:tcBorders>
-            <w:tcMar>
-              <w:top w:w="90" w:type="dxa"/>
-              <w:left w:w="90" w:type="dxa"/>
-              <w:bottom w:w="90" w:type="dxa"/>
-              <w:right w:w="90" w:type="dxa"/>
-            </w:tcMar>
-            <w:shd w:fill="F3F6F8"/>
+            <w:tcW w:type="dxa" w:w="1994"/>
           </w:tcPr>
           <w:p>
             <w:pPr>
-              <w:spacing w:after="20" w:line="264" w:lineRule="auto"/>
+              <w:spacing w:after="80" w:before="80"/>
             </w:pPr>
             <w:r>
               <w:rPr>
                 <w:b w:val="0"/>
                 <w:sz w:val="18"/>
               </w:rPr>
-              <w:t>관리자 주문 상세</w:t>
-              <w:br/>
-              <w:t>팝업</w:t>
+              <w:t>주문 상세 팝업</w:t>
             </w:r>
           </w:p>
         </w:tc>
         <w:tc>
           <w:tcPr>
-            <w:tcW w:type="dxa" w:w="1304"/>
-            <w:tcBorders>
-              <w:top w:val="single" w:sz="4" w:color="D9D9D9"/>
-              <w:left w:val="single" w:sz="4" w:color="D9D9D9"/>
-              <w:bottom w:val="single" w:sz="4" w:color="D9D9D9"/>
-              <w:right w:val="single" w:sz="4" w:color="D9D9D9"/>
-              <w:insideH w:val="single" w:sz="4" w:color="D9D9D9"/>
-              <w:insideV w:val="single" w:sz="4" w:color="D9D9D9"/>
-            </w:tcBorders>
-            <w:tcMar>
-              <w:top w:w="90" w:type="dxa"/>
-              <w:left w:w="90" w:type="dxa"/>
-              <w:bottom w:w="90" w:type="dxa"/>
-              <w:right w:w="90" w:type="dxa"/>
-            </w:tcMar>
-            <w:shd w:fill="F3F6F8"/>
+            <w:tcW w:type="dxa" w:w="1994"/>
           </w:tcPr>
           <w:p>
             <w:pPr>
-              <w:spacing w:after="20" w:line="264" w:lineRule="auto"/>
+              <w:spacing w:after="80" w:before="80"/>
             </w:pPr>
             <w:r>
               <w:rPr>
                 <w:b w:val="0"/>
                 <w:sz w:val="18"/>
               </w:rPr>
-              <w:t>권한 관리자</w:t>
+              <w:t>커머스 관리자</w:t>
             </w:r>
           </w:p>
         </w:tc>
         <w:tc>
           <w:tcPr>
-            <w:tcW w:type="dxa" w:w="2948"/>
-            <w:tcBorders>
-              <w:top w:val="single" w:sz="4" w:color="D9D9D9"/>
-              <w:left w:val="single" w:sz="4" w:color="D9D9D9"/>
-              <w:bottom w:val="single" w:sz="4" w:color="D9D9D9"/>
-              <w:right w:val="single" w:sz="4" w:color="D9D9D9"/>
-              <w:insideH w:val="single" w:sz="4" w:color="D9D9D9"/>
-              <w:insideV w:val="single" w:sz="4" w:color="D9D9D9"/>
-            </w:tcBorders>
-            <w:tcMar>
-              <w:top w:w="90" w:type="dxa"/>
-              <w:left w:w="90" w:type="dxa"/>
-              <w:bottom w:w="90" w:type="dxa"/>
-              <w:right w:w="90" w:type="dxa"/>
-            </w:tcMar>
-            <w:shd w:fill="F3F6F8"/>
+            <w:tcW w:type="dxa" w:w="1994"/>
           </w:tcPr>
           <w:p>
             <w:pPr>
-              <w:spacing w:after="20" w:line="264" w:lineRule="auto"/>
+              <w:spacing w:after="80" w:before="80"/>
             </w:pPr>
             <w:r>
               <w:rPr>
@@ -2880,33 +1159,18 @@
         </w:tc>
         <w:tc>
           <w:tcPr>
-            <w:tcW w:type="dxa" w:w="2381"/>
-            <w:tcBorders>
-              <w:top w:val="single" w:sz="4" w:color="D9D9D9"/>
-              <w:left w:val="single" w:sz="4" w:color="D9D9D9"/>
-              <w:bottom w:val="single" w:sz="4" w:color="D9D9D9"/>
-              <w:right w:val="single" w:sz="4" w:color="D9D9D9"/>
-              <w:insideH w:val="single" w:sz="4" w:color="D9D9D9"/>
-              <w:insideV w:val="single" w:sz="4" w:color="D9D9D9"/>
-            </w:tcBorders>
-            <w:tcMar>
-              <w:top w:w="90" w:type="dxa"/>
-              <w:left w:w="90" w:type="dxa"/>
-              <w:bottom w:w="90" w:type="dxa"/>
-              <w:right w:w="90" w:type="dxa"/>
-            </w:tcMar>
-            <w:shd w:fill="F3F6F8"/>
+            <w:tcW w:type="dxa" w:w="1994"/>
           </w:tcPr>
           <w:p>
             <w:pPr>
-              <w:spacing w:after="20" w:line="264" w:lineRule="auto"/>
+              <w:spacing w:after="80" w:before="80"/>
             </w:pPr>
             <w:r>
               <w:rPr>
                 <w:b w:val="0"/>
                 <w:sz w:val="18"/>
               </w:rPr>
-              <w:t>F17 F18</w:t>
+              <w:t>취소 / 반품 환불 / 반려 / 예외 환불</w:t>
             </w:r>
           </w:p>
         </w:tc>
@@ -2917,163 +1181,86 @@
         </w:trPr>
         <w:tc>
           <w:tcPr>
-            <w:tcW w:type="dxa" w:w="680"/>
-            <w:tcBorders>
-              <w:top w:val="single" w:sz="4" w:color="D9D9D9"/>
-              <w:left w:val="single" w:sz="4" w:color="D9D9D9"/>
-              <w:bottom w:val="single" w:sz="4" w:color="D9D9D9"/>
-              <w:right w:val="single" w:sz="4" w:color="D9D9D9"/>
-              <w:insideH w:val="single" w:sz="4" w:color="D9D9D9"/>
-              <w:insideV w:val="single" w:sz="4" w:color="D9D9D9"/>
-            </w:tcBorders>
-            <w:tcMar>
-              <w:top w:w="90" w:type="dxa"/>
-              <w:left w:w="90" w:type="dxa"/>
-              <w:bottom w:w="90" w:type="dxa"/>
-              <w:right w:w="90" w:type="dxa"/>
-            </w:tcMar>
-            <w:shd w:fill="FFFFFF"/>
+            <w:tcW w:type="dxa" w:w="1994"/>
           </w:tcPr>
           <w:p>
             <w:pPr>
-              <w:spacing w:after="20" w:line="264" w:lineRule="auto"/>
+              <w:spacing w:after="80" w:before="80"/>
             </w:pPr>
             <w:r>
               <w:rPr>
                 <w:b w:val="0"/>
                 <w:sz w:val="18"/>
               </w:rPr>
-              <w:t>A03</w:t>
+              <w:t>SCR-A-003</w:t>
             </w:r>
           </w:p>
         </w:tc>
         <w:tc>
           <w:tcPr>
-            <w:tcW w:type="dxa" w:w="2494"/>
-            <w:tcBorders>
-              <w:top w:val="single" w:sz="4" w:color="D9D9D9"/>
-              <w:left w:val="single" w:sz="4" w:color="D9D9D9"/>
-              <w:bottom w:val="single" w:sz="4" w:color="D9D9D9"/>
-              <w:right w:val="single" w:sz="4" w:color="D9D9D9"/>
-              <w:insideH w:val="single" w:sz="4" w:color="D9D9D9"/>
-              <w:insideV w:val="single" w:sz="4" w:color="D9D9D9"/>
-            </w:tcBorders>
-            <w:tcMar>
-              <w:top w:w="90" w:type="dxa"/>
-              <w:left w:w="90" w:type="dxa"/>
-              <w:bottom w:w="90" w:type="dxa"/>
-              <w:right w:w="90" w:type="dxa"/>
-            </w:tcMar>
-            <w:shd w:fill="FFFFFF"/>
+            <w:tcW w:type="dxa" w:w="1994"/>
           </w:tcPr>
           <w:p>
             <w:pPr>
-              <w:spacing w:after="20" w:line="264" w:lineRule="auto"/>
+              <w:spacing w:after="80" w:before="80"/>
             </w:pPr>
             <w:r>
               <w:rPr>
                 <w:b w:val="0"/>
                 <w:sz w:val="18"/>
               </w:rPr>
-              <w:t>일괄 배송 처리</w:t>
-              <w:br/>
-              <w:t>탭</w:t>
+              <w:t>배송 처리</w:t>
             </w:r>
           </w:p>
         </w:tc>
         <w:tc>
           <w:tcPr>
-            <w:tcW w:type="dxa" w:w="1304"/>
-            <w:tcBorders>
-              <w:top w:val="single" w:sz="4" w:color="D9D9D9"/>
-              <w:left w:val="single" w:sz="4" w:color="D9D9D9"/>
-              <w:bottom w:val="single" w:sz="4" w:color="D9D9D9"/>
-              <w:right w:val="single" w:sz="4" w:color="D9D9D9"/>
-              <w:insideH w:val="single" w:sz="4" w:color="D9D9D9"/>
-              <w:insideV w:val="single" w:sz="4" w:color="D9D9D9"/>
-            </w:tcBorders>
-            <w:tcMar>
-              <w:top w:w="90" w:type="dxa"/>
-              <w:left w:w="90" w:type="dxa"/>
-              <w:bottom w:w="90" w:type="dxa"/>
-              <w:right w:w="90" w:type="dxa"/>
-            </w:tcMar>
-            <w:shd w:fill="FFFFFF"/>
+            <w:tcW w:type="dxa" w:w="1994"/>
           </w:tcPr>
           <w:p>
             <w:pPr>
-              <w:spacing w:after="20" w:line="264" w:lineRule="auto"/>
+              <w:spacing w:after="80" w:before="80"/>
             </w:pPr>
             <w:r>
               <w:rPr>
                 <w:b w:val="0"/>
                 <w:sz w:val="18"/>
               </w:rPr>
-              <w:t>출고 권한</w:t>
+              <w:t>커머스 관리자</w:t>
             </w:r>
           </w:p>
         </w:tc>
         <w:tc>
           <w:tcPr>
-            <w:tcW w:type="dxa" w:w="2948"/>
-            <w:tcBorders>
-              <w:top w:val="single" w:sz="4" w:color="D9D9D9"/>
-              <w:left w:val="single" w:sz="4" w:color="D9D9D9"/>
-              <w:bottom w:val="single" w:sz="4" w:color="D9D9D9"/>
-              <w:right w:val="single" w:sz="4" w:color="D9D9D9"/>
-              <w:insideH w:val="single" w:sz="4" w:color="D9D9D9"/>
-              <w:insideV w:val="single" w:sz="4" w:color="D9D9D9"/>
-            </w:tcBorders>
-            <w:tcMar>
-              <w:top w:w="90" w:type="dxa"/>
-              <w:left w:w="90" w:type="dxa"/>
-              <w:bottom w:w="90" w:type="dxa"/>
-              <w:right w:w="90" w:type="dxa"/>
-            </w:tcMar>
-            <w:shd w:fill="FFFFFF"/>
+            <w:tcW w:type="dxa" w:w="1994"/>
           </w:tcPr>
           <w:p>
             <w:pPr>
-              <w:spacing w:after="20" w:line="264" w:lineRule="auto"/>
+              <w:spacing w:after="80" w:before="80"/>
             </w:pPr>
             <w:r>
               <w:rPr>
                 <w:b w:val="0"/>
                 <w:sz w:val="18"/>
               </w:rPr>
-              <w:t>sales / shipping</w:t>
+              <w:t>shippingStages</w:t>
             </w:r>
           </w:p>
         </w:tc>
         <w:tc>
           <w:tcPr>
-            <w:tcW w:type="dxa" w:w="2381"/>
-            <w:tcBorders>
-              <w:top w:val="single" w:sz="4" w:color="D9D9D9"/>
-              <w:left w:val="single" w:sz="4" w:color="D9D9D9"/>
-              <w:bottom w:val="single" w:sz="4" w:color="D9D9D9"/>
-              <w:right w:val="single" w:sz="4" w:color="D9D9D9"/>
-              <w:insideH w:val="single" w:sz="4" w:color="D9D9D9"/>
-              <w:insideV w:val="single" w:sz="4" w:color="D9D9D9"/>
-            </w:tcBorders>
-            <w:tcMar>
-              <w:top w:w="90" w:type="dxa"/>
-              <w:left w:w="90" w:type="dxa"/>
-              <w:bottom w:w="90" w:type="dxa"/>
-              <w:right w:w="90" w:type="dxa"/>
-            </w:tcMar>
-            <w:shd w:fill="FFFFFF"/>
+            <w:tcW w:type="dxa" w:w="1994"/>
           </w:tcPr>
           <w:p>
             <w:pPr>
-              <w:spacing w:after="20" w:line="264" w:lineRule="auto"/>
+              <w:spacing w:after="80" w:before="80"/>
             </w:pPr>
             <w:r>
               <w:rPr>
                 <w:b w:val="0"/>
                 <w:sz w:val="18"/>
               </w:rPr>
-              <w:t>F19 F20</w:t>
+              <w:t>주문별 송장 등록 / 수정</w:t>
             </w:r>
           </w:p>
         </w:tc>
@@ -3084,163 +1271,86 @@
         </w:trPr>
         <w:tc>
           <w:tcPr>
-            <w:tcW w:type="dxa" w:w="680"/>
-            <w:tcBorders>
-              <w:top w:val="single" w:sz="4" w:color="D9D9D9"/>
-              <w:left w:val="single" w:sz="4" w:color="D9D9D9"/>
-              <w:bottom w:val="single" w:sz="4" w:color="D9D9D9"/>
-              <w:right w:val="single" w:sz="4" w:color="D9D9D9"/>
-              <w:insideH w:val="single" w:sz="4" w:color="D9D9D9"/>
-              <w:insideV w:val="single" w:sz="4" w:color="D9D9D9"/>
-            </w:tcBorders>
-            <w:tcMar>
-              <w:top w:w="90" w:type="dxa"/>
-              <w:left w:w="90" w:type="dxa"/>
-              <w:bottom w:w="90" w:type="dxa"/>
-              <w:right w:w="90" w:type="dxa"/>
-            </w:tcMar>
-            <w:shd w:fill="F3F6F8"/>
+            <w:tcW w:type="dxa" w:w="1994"/>
           </w:tcPr>
           <w:p>
             <w:pPr>
-              <w:spacing w:after="20" w:line="264" w:lineRule="auto"/>
+              <w:spacing w:after="80" w:before="80"/>
             </w:pPr>
             <w:r>
               <w:rPr>
                 <w:b w:val="0"/>
                 <w:sz w:val="18"/>
               </w:rPr>
-              <w:t>A04</w:t>
+              <w:t>SCR-A-004</w:t>
             </w:r>
           </w:p>
         </w:tc>
         <w:tc>
           <w:tcPr>
-            <w:tcW w:type="dxa" w:w="2494"/>
-            <w:tcBorders>
-              <w:top w:val="single" w:sz="4" w:color="D9D9D9"/>
-              <w:left w:val="single" w:sz="4" w:color="D9D9D9"/>
-              <w:bottom w:val="single" w:sz="4" w:color="D9D9D9"/>
-              <w:right w:val="single" w:sz="4" w:color="D9D9D9"/>
-              <w:insideH w:val="single" w:sz="4" w:color="D9D9D9"/>
-              <w:insideV w:val="single" w:sz="4" w:color="D9D9D9"/>
-            </w:tcBorders>
-            <w:tcMar>
-              <w:top w:w="90" w:type="dxa"/>
-              <w:left w:w="90" w:type="dxa"/>
-              <w:bottom w:w="90" w:type="dxa"/>
-              <w:right w:w="90" w:type="dxa"/>
-            </w:tcMar>
-            <w:shd w:fill="F3F6F8"/>
+            <w:tcW w:type="dxa" w:w="1994"/>
           </w:tcPr>
           <w:p>
             <w:pPr>
-              <w:spacing w:after="20" w:line="264" w:lineRule="auto"/>
+              <w:spacing w:after="80" w:before="80"/>
             </w:pPr>
             <w:r>
               <w:rPr>
                 <w:b w:val="0"/>
                 <w:sz w:val="18"/>
               </w:rPr>
-              <w:t>상품 목록</w:t>
-              <w:br/>
-              <w:t>메뉴</w:t>
+              <w:t>상품 관리</w:t>
             </w:r>
           </w:p>
         </w:tc>
         <w:tc>
           <w:tcPr>
-            <w:tcW w:type="dxa" w:w="1304"/>
-            <w:tcBorders>
-              <w:top w:val="single" w:sz="4" w:color="D9D9D9"/>
-              <w:left w:val="single" w:sz="4" w:color="D9D9D9"/>
-              <w:bottom w:val="single" w:sz="4" w:color="D9D9D9"/>
-              <w:right w:val="single" w:sz="4" w:color="D9D9D9"/>
-              <w:insideH w:val="single" w:sz="4" w:color="D9D9D9"/>
-              <w:insideV w:val="single" w:sz="4" w:color="D9D9D9"/>
-            </w:tcBorders>
-            <w:tcMar>
-              <w:top w:w="90" w:type="dxa"/>
-              <w:left w:w="90" w:type="dxa"/>
-              <w:bottom w:w="90" w:type="dxa"/>
-              <w:right w:w="90" w:type="dxa"/>
-            </w:tcMar>
-            <w:shd w:fill="F3F6F8"/>
+            <w:tcW w:type="dxa" w:w="1994"/>
           </w:tcPr>
           <w:p>
             <w:pPr>
-              <w:spacing w:after="20" w:line="264" w:lineRule="auto"/>
+              <w:spacing w:after="80" w:before="80"/>
             </w:pPr>
             <w:r>
               <w:rPr>
                 <w:b w:val="0"/>
                 <w:sz w:val="18"/>
               </w:rPr>
-              <w:t>상품 권한</w:t>
+              <w:t>커머스 관리자</w:t>
             </w:r>
           </w:p>
         </w:tc>
         <w:tc>
           <w:tcPr>
-            <w:tcW w:type="dxa" w:w="2948"/>
-            <w:tcBorders>
-              <w:top w:val="single" w:sz="4" w:color="D9D9D9"/>
-              <w:left w:val="single" w:sz="4" w:color="D9D9D9"/>
-              <w:bottom w:val="single" w:sz="4" w:color="D9D9D9"/>
-              <w:right w:val="single" w:sz="4" w:color="D9D9D9"/>
-              <w:insideH w:val="single" w:sz="4" w:color="D9D9D9"/>
-              <w:insideV w:val="single" w:sz="4" w:color="D9D9D9"/>
-            </w:tcBorders>
-            <w:tcMar>
-              <w:top w:w="90" w:type="dxa"/>
-              <w:left w:w="90" w:type="dxa"/>
-              <w:bottom w:w="90" w:type="dxa"/>
-              <w:right w:w="90" w:type="dxa"/>
-            </w:tcMar>
-            <w:shd w:fill="F3F6F8"/>
+            <w:tcW w:type="dxa" w:w="1994"/>
           </w:tcPr>
           <w:p>
             <w:pPr>
-              <w:spacing w:after="20" w:line="264" w:lineRule="auto"/>
+              <w:spacing w:after="80" w:before="80"/>
             </w:pPr>
             <w:r>
               <w:rPr>
                 <w:b w:val="0"/>
                 <w:sz w:val="18"/>
               </w:rPr>
-              <w:t>operationsView</w:t>
+              <w:t>operationProducts</w:t>
             </w:r>
           </w:p>
         </w:tc>
         <w:tc>
           <w:tcPr>
-            <w:tcW w:type="dxa" w:w="2381"/>
-            <w:tcBorders>
-              <w:top w:val="single" w:sz="4" w:color="D9D9D9"/>
-              <w:left w:val="single" w:sz="4" w:color="D9D9D9"/>
-              <w:bottom w:val="single" w:sz="4" w:color="D9D9D9"/>
-              <w:right w:val="single" w:sz="4" w:color="D9D9D9"/>
-              <w:insideH w:val="single" w:sz="4" w:color="D9D9D9"/>
-              <w:insideV w:val="single" w:sz="4" w:color="D9D9D9"/>
-            </w:tcBorders>
-            <w:tcMar>
-              <w:top w:w="90" w:type="dxa"/>
-              <w:left w:w="90" w:type="dxa"/>
-              <w:bottom w:w="90" w:type="dxa"/>
-              <w:right w:w="90" w:type="dxa"/>
-            </w:tcMar>
-            <w:shd w:fill="F3F6F8"/>
+            <w:tcW w:type="dxa" w:w="1994"/>
           </w:tcPr>
           <w:p>
             <w:pPr>
-              <w:spacing w:after="20" w:line="264" w:lineRule="auto"/>
+              <w:spacing w:after="80" w:before="80"/>
             </w:pPr>
             <w:r>
               <w:rPr>
                 <w:b w:val="0"/>
                 <w:sz w:val="18"/>
               </w:rPr>
-              <w:t>F21</w:t>
+              <w:t>상품 편집 / 순서 설정</w:t>
             </w:r>
           </w:p>
         </w:tc>
@@ -3251,124 +1361,62 @@
         </w:trPr>
         <w:tc>
           <w:tcPr>
-            <w:tcW w:type="dxa" w:w="680"/>
-            <w:tcBorders>
-              <w:top w:val="single" w:sz="4" w:color="D9D9D9"/>
-              <w:left w:val="single" w:sz="4" w:color="D9D9D9"/>
-              <w:bottom w:val="single" w:sz="4" w:color="D9D9D9"/>
-              <w:right w:val="single" w:sz="4" w:color="D9D9D9"/>
-              <w:insideH w:val="single" w:sz="4" w:color="D9D9D9"/>
-              <w:insideV w:val="single" w:sz="4" w:color="D9D9D9"/>
-            </w:tcBorders>
-            <w:tcMar>
-              <w:top w:w="90" w:type="dxa"/>
-              <w:left w:w="90" w:type="dxa"/>
-              <w:bottom w:w="90" w:type="dxa"/>
-              <w:right w:w="90" w:type="dxa"/>
-            </w:tcMar>
-            <w:shd w:fill="FFFFFF"/>
+            <w:tcW w:type="dxa" w:w="1994"/>
           </w:tcPr>
           <w:p>
             <w:pPr>
-              <w:spacing w:after="20" w:line="264" w:lineRule="auto"/>
+              <w:spacing w:after="80" w:before="80"/>
             </w:pPr>
             <w:r>
               <w:rPr>
                 <w:b w:val="0"/>
                 <w:sz w:val="18"/>
               </w:rPr>
-              <w:t>A05</w:t>
+              <w:t>SCR-A-005</w:t>
             </w:r>
           </w:p>
         </w:tc>
         <w:tc>
           <w:tcPr>
-            <w:tcW w:type="dxa" w:w="2494"/>
-            <w:tcBorders>
-              <w:top w:val="single" w:sz="4" w:color="D9D9D9"/>
-              <w:left w:val="single" w:sz="4" w:color="D9D9D9"/>
-              <w:bottom w:val="single" w:sz="4" w:color="D9D9D9"/>
-              <w:right w:val="single" w:sz="4" w:color="D9D9D9"/>
-              <w:insideH w:val="single" w:sz="4" w:color="D9D9D9"/>
-              <w:insideV w:val="single" w:sz="4" w:color="D9D9D9"/>
-            </w:tcBorders>
-            <w:tcMar>
-              <w:top w:w="90" w:type="dxa"/>
-              <w:left w:w="90" w:type="dxa"/>
-              <w:bottom w:w="90" w:type="dxa"/>
-              <w:right w:w="90" w:type="dxa"/>
-            </w:tcMar>
-            <w:shd w:fill="FFFFFF"/>
+            <w:tcW w:type="dxa" w:w="1994"/>
           </w:tcPr>
           <w:p>
             <w:pPr>
-              <w:spacing w:after="20" w:line="264" w:lineRule="auto"/>
+              <w:spacing w:after="80" w:before="80"/>
             </w:pPr>
             <w:r>
               <w:rPr>
                 <w:b w:val="0"/>
                 <w:sz w:val="18"/>
               </w:rPr>
-              <w:t>상품 등록 및 수정</w:t>
-              <w:br/>
-              <w:t>팝업</w:t>
+              <w:t>상품 등록과 상세 편집</w:t>
             </w:r>
           </w:p>
         </w:tc>
         <w:tc>
           <w:tcPr>
-            <w:tcW w:type="dxa" w:w="1304"/>
-            <w:tcBorders>
-              <w:top w:val="single" w:sz="4" w:color="D9D9D9"/>
-              <w:left w:val="single" w:sz="4" w:color="D9D9D9"/>
-              <w:bottom w:val="single" w:sz="4" w:color="D9D9D9"/>
-              <w:right w:val="single" w:sz="4" w:color="D9D9D9"/>
-              <w:insideH w:val="single" w:sz="4" w:color="D9D9D9"/>
-              <w:insideV w:val="single" w:sz="4" w:color="D9D9D9"/>
-            </w:tcBorders>
-            <w:tcMar>
-              <w:top w:w="90" w:type="dxa"/>
-              <w:left w:w="90" w:type="dxa"/>
-              <w:bottom w:w="90" w:type="dxa"/>
-              <w:right w:w="90" w:type="dxa"/>
-            </w:tcMar>
-            <w:shd w:fill="FFFFFF"/>
+            <w:tcW w:type="dxa" w:w="1994"/>
           </w:tcPr>
           <w:p>
             <w:pPr>
-              <w:spacing w:after="20" w:line="264" w:lineRule="auto"/>
+              <w:spacing w:after="80" w:before="80"/>
             </w:pPr>
             <w:r>
               <w:rPr>
                 <w:b w:val="0"/>
                 <w:sz w:val="18"/>
               </w:rPr>
-              <w:t>상품 권한</w:t>
+              <w:t>커머스 관리자</w:t>
             </w:r>
           </w:p>
         </w:tc>
         <w:tc>
           <w:tcPr>
-            <w:tcW w:type="dxa" w:w="2948"/>
-            <w:tcBorders>
-              <w:top w:val="single" w:sz="4" w:color="D9D9D9"/>
-              <w:left w:val="single" w:sz="4" w:color="D9D9D9"/>
-              <w:bottom w:val="single" w:sz="4" w:color="D9D9D9"/>
-              <w:right w:val="single" w:sz="4" w:color="D9D9D9"/>
-              <w:insideH w:val="single" w:sz="4" w:color="D9D9D9"/>
-              <w:insideV w:val="single" w:sz="4" w:color="D9D9D9"/>
-            </w:tcBorders>
-            <w:tcMar>
-              <w:top w:w="90" w:type="dxa"/>
-              <w:left w:w="90" w:type="dxa"/>
-              <w:bottom w:w="90" w:type="dxa"/>
-              <w:right w:w="90" w:type="dxa"/>
-            </w:tcMar>
-            <w:shd w:fill="FFFFFF"/>
+            <w:tcW w:type="dxa" w:w="1994"/>
           </w:tcPr>
           <w:p>
             <w:pPr>
-              <w:spacing w:after="20" w:line="264" w:lineRule="auto"/>
+              <w:spacing w:after="80" w:before="80"/>
             </w:pPr>
             <w:r>
               <w:rPr>
@@ -3381,33 +1429,18 @@
         </w:tc>
         <w:tc>
           <w:tcPr>
-            <w:tcW w:type="dxa" w:w="2381"/>
-            <w:tcBorders>
-              <w:top w:val="single" w:sz="4" w:color="D9D9D9"/>
-              <w:left w:val="single" w:sz="4" w:color="D9D9D9"/>
-              <w:bottom w:val="single" w:sz="4" w:color="D9D9D9"/>
-              <w:right w:val="single" w:sz="4" w:color="D9D9D9"/>
-              <w:insideH w:val="single" w:sz="4" w:color="D9D9D9"/>
-              <w:insideV w:val="single" w:sz="4" w:color="D9D9D9"/>
-            </w:tcBorders>
-            <w:tcMar>
-              <w:top w:w="90" w:type="dxa"/>
-              <w:left w:w="90" w:type="dxa"/>
-              <w:bottom w:w="90" w:type="dxa"/>
-              <w:right w:w="90" w:type="dxa"/>
-            </w:tcMar>
-            <w:shd w:fill="FFFFFF"/>
+            <w:tcW w:type="dxa" w:w="1994"/>
           </w:tcPr>
           <w:p>
             <w:pPr>
-              <w:spacing w:after="20" w:line="264" w:lineRule="auto"/>
+              <w:spacing w:after="80" w:before="80"/>
             </w:pPr>
             <w:r>
               <w:rPr>
                 <w:b w:val="0"/>
                 <w:sz w:val="18"/>
               </w:rPr>
-              <w:t>F22 F23 F24 F25</w:t>
+              <w:t>서식 / 이미지 / 영상 주소</w:t>
             </w:r>
           </w:p>
         </w:tc>
@@ -3418,218 +1451,516 @@
         </w:trPr>
         <w:tc>
           <w:tcPr>
-            <w:tcW w:type="dxa" w:w="680"/>
-            <w:tcBorders>
-              <w:top w:val="single" w:sz="4" w:color="D9D9D9"/>
-              <w:left w:val="single" w:sz="4" w:color="D9D9D9"/>
-              <w:bottom w:val="single" w:sz="4" w:color="D9D9D9"/>
-              <w:right w:val="single" w:sz="4" w:color="D9D9D9"/>
-              <w:insideH w:val="single" w:sz="4" w:color="D9D9D9"/>
-              <w:insideV w:val="single" w:sz="4" w:color="D9D9D9"/>
-            </w:tcBorders>
-            <w:tcMar>
-              <w:top w:w="90" w:type="dxa"/>
-              <w:left w:w="90" w:type="dxa"/>
-              <w:bottom w:w="90" w:type="dxa"/>
-              <w:right w:w="90" w:type="dxa"/>
-            </w:tcMar>
-            <w:shd w:fill="F3F6F8"/>
+            <w:tcW w:type="dxa" w:w="1994"/>
           </w:tcPr>
           <w:p>
             <w:pPr>
-              <w:spacing w:after="20" w:line="264" w:lineRule="auto"/>
+              <w:spacing w:after="80" w:before="80"/>
             </w:pPr>
             <w:r>
               <w:rPr>
                 <w:b w:val="0"/>
                 <w:sz w:val="18"/>
               </w:rPr>
-              <w:t>A06</w:t>
+              <w:t>SCR-A-006</w:t>
             </w:r>
           </w:p>
         </w:tc>
         <w:tc>
           <w:tcPr>
-            <w:tcW w:type="dxa" w:w="2494"/>
-            <w:tcBorders>
-              <w:top w:val="single" w:sz="4" w:color="D9D9D9"/>
-              <w:left w:val="single" w:sz="4" w:color="D9D9D9"/>
-              <w:bottom w:val="single" w:sz="4" w:color="D9D9D9"/>
-              <w:right w:val="single" w:sz="4" w:color="D9D9D9"/>
-              <w:insideH w:val="single" w:sz="4" w:color="D9D9D9"/>
-              <w:insideV w:val="single" w:sz="4" w:color="D9D9D9"/>
-            </w:tcBorders>
-            <w:tcMar>
-              <w:top w:w="90" w:type="dxa"/>
-              <w:left w:w="90" w:type="dxa"/>
-              <w:bottom w:w="90" w:type="dxa"/>
-              <w:right w:w="90" w:type="dxa"/>
-            </w:tcMar>
-            <w:shd w:fill="F3F6F8"/>
+            <w:tcW w:type="dxa" w:w="1994"/>
           </w:tcPr>
           <w:p>
             <w:pPr>
-              <w:spacing w:after="20" w:line="264" w:lineRule="auto"/>
+              <w:spacing w:after="80" w:before="80"/>
             </w:pPr>
             <w:r>
               <w:rPr>
                 <w:b w:val="0"/>
                 <w:sz w:val="18"/>
               </w:rPr>
-              <w:t>스토어 설정</w:t>
-              <w:br/>
-              <w:t>팝업</w:t>
+              <w:t>스토어 설정과 배너</w:t>
             </w:r>
           </w:p>
         </w:tc>
         <w:tc>
           <w:tcPr>
-            <w:tcW w:type="dxa" w:w="1304"/>
-            <w:tcBorders>
-              <w:top w:val="single" w:sz="4" w:color="D9D9D9"/>
-              <w:left w:val="single" w:sz="4" w:color="D9D9D9"/>
-              <w:bottom w:val="single" w:sz="4" w:color="D9D9D9"/>
-              <w:right w:val="single" w:sz="4" w:color="D9D9D9"/>
-              <w:insideH w:val="single" w:sz="4" w:color="D9D9D9"/>
-              <w:insideV w:val="single" w:sz="4" w:color="D9D9D9"/>
-            </w:tcBorders>
-            <w:tcMar>
-              <w:top w:w="90" w:type="dxa"/>
-              <w:left w:w="90" w:type="dxa"/>
-              <w:bottom w:w="90" w:type="dxa"/>
-              <w:right w:w="90" w:type="dxa"/>
-            </w:tcMar>
-            <w:shd w:fill="F3F6F8"/>
+            <w:tcW w:type="dxa" w:w="1994"/>
           </w:tcPr>
           <w:p>
             <w:pPr>
-              <w:spacing w:after="20" w:line="264" w:lineRule="auto"/>
+              <w:spacing w:after="80" w:before="80"/>
             </w:pPr>
             <w:r>
               <w:rPr>
                 <w:b w:val="0"/>
                 <w:sz w:val="18"/>
               </w:rPr>
-              <w:t>정책 권한</w:t>
+              <w:t>커머스 관리자</w:t>
             </w:r>
           </w:p>
         </w:tc>
         <w:tc>
           <w:tcPr>
-            <w:tcW w:type="dxa" w:w="2948"/>
-            <w:tcBorders>
-              <w:top w:val="single" w:sz="4" w:color="D9D9D9"/>
-              <w:left w:val="single" w:sz="4" w:color="D9D9D9"/>
-              <w:bottom w:val="single" w:sz="4" w:color="D9D9D9"/>
-              <w:right w:val="single" w:sz="4" w:color="D9D9D9"/>
-              <w:insideH w:val="single" w:sz="4" w:color="D9D9D9"/>
-              <w:insideV w:val="single" w:sz="4" w:color="D9D9D9"/>
-            </w:tcBorders>
-            <w:tcMar>
-              <w:top w:w="90" w:type="dxa"/>
-              <w:left w:w="90" w:type="dxa"/>
-              <w:bottom w:w="90" w:type="dxa"/>
-              <w:right w:w="90" w:type="dxa"/>
-            </w:tcMar>
-            <w:shd w:fill="F3F6F8"/>
+            <w:tcW w:type="dxa" w:w="1994"/>
           </w:tcPr>
           <w:p>
             <w:pPr>
-              <w:spacing w:after="20" w:line="264" w:lineRule="auto"/>
+              <w:spacing w:after="80" w:before="80"/>
             </w:pPr>
             <w:r>
               <w:rPr>
                 <w:b w:val="0"/>
                 <w:sz w:val="18"/>
               </w:rPr>
-              <w:t>settingsDialog</w:t>
+              <w:t>operationSettings / operationBanner</w:t>
             </w:r>
           </w:p>
         </w:tc>
         <w:tc>
           <w:tcPr>
-            <w:tcW w:type="dxa" w:w="2381"/>
-            <w:tcBorders>
-              <w:top w:val="single" w:sz="4" w:color="D9D9D9"/>
-              <w:left w:val="single" w:sz="4" w:color="D9D9D9"/>
-              <w:bottom w:val="single" w:sz="4" w:color="D9D9D9"/>
-              <w:right w:val="single" w:sz="4" w:color="D9D9D9"/>
-              <w:insideH w:val="single" w:sz="4" w:color="D9D9D9"/>
-              <w:insideV w:val="single" w:sz="4" w:color="D9D9D9"/>
-            </w:tcBorders>
-            <w:tcMar>
-              <w:top w:w="90" w:type="dxa"/>
-              <w:left w:w="90" w:type="dxa"/>
-              <w:bottom w:w="90" w:type="dxa"/>
-              <w:right w:w="90" w:type="dxa"/>
-            </w:tcMar>
-            <w:shd w:fill="F3F6F8"/>
+            <w:tcW w:type="dxa" w:w="1994"/>
           </w:tcPr>
           <w:p>
             <w:pPr>
-              <w:spacing w:after="20" w:line="264" w:lineRule="auto"/>
+              <w:spacing w:after="80" w:before="80"/>
             </w:pPr>
             <w:r>
               <w:rPr>
                 <w:b w:val="0"/>
                 <w:sz w:val="18"/>
               </w:rPr>
-              <w:t>F26</w:t>
+              <w:t>배송비 / 기한 / 반품비 / 안내</w:t>
+            </w:r>
+          </w:p>
+        </w:tc>
+      </w:tr>
+      <w:tr>
+        <w:trPr>
+          <w:cantSplit/>
+        </w:trPr>
+        <w:tc>
+          <w:tcPr>
+            <w:tcW w:type="dxa" w:w="1994"/>
+          </w:tcPr>
+          <w:p>
+            <w:pPr>
+              <w:spacing w:after="80" w:before="80"/>
+            </w:pPr>
+            <w:r>
+              <w:rPr>
+                <w:b w:val="0"/>
+                <w:sz w:val="18"/>
+              </w:rPr>
+              <w:t>SCR-A-007</w:t>
+            </w:r>
+          </w:p>
+        </w:tc>
+        <w:tc>
+          <w:tcPr>
+            <w:tcW w:type="dxa" w:w="1994"/>
+          </w:tcPr>
+          <w:p>
+            <w:pPr>
+              <w:spacing w:after="80" w:before="80"/>
+            </w:pPr>
+            <w:r>
+              <w:rPr>
+                <w:b w:val="0"/>
+                <w:sz w:val="18"/>
+              </w:rPr>
+              <w:t>매출 정산</w:t>
+            </w:r>
+          </w:p>
+        </w:tc>
+        <w:tc>
+          <w:tcPr>
+            <w:tcW w:type="dxa" w:w="1994"/>
+          </w:tcPr>
+          <w:p>
+            <w:pPr>
+              <w:spacing w:after="80" w:before="80"/>
+            </w:pPr>
+            <w:r>
+              <w:rPr>
+                <w:b w:val="0"/>
+                <w:sz w:val="18"/>
+              </w:rPr>
+              <w:t>커머스 관리자</w:t>
+            </w:r>
+          </w:p>
+        </w:tc>
+        <w:tc>
+          <w:tcPr>
+            <w:tcW w:type="dxa" w:w="1994"/>
+          </w:tcPr>
+          <w:p>
+            <w:pPr>
+              <w:spacing w:after="80" w:before="80"/>
+            </w:pPr>
+            <w:r>
+              <w:rPr>
+                <w:b w:val="0"/>
+                <w:sz w:val="18"/>
+              </w:rPr>
+              <w:t>settlementView</w:t>
+            </w:r>
+          </w:p>
+        </w:tc>
+        <w:tc>
+          <w:tcPr>
+            <w:tcW w:type="dxa" w:w="1994"/>
+          </w:tcPr>
+          <w:p>
+            <w:pPr>
+              <w:spacing w:after="80" w:before="80"/>
+            </w:pPr>
+            <w:r>
+              <w:rPr>
+                <w:b w:val="0"/>
+                <w:sz w:val="18"/>
+              </w:rPr>
+              <w:t>승인월 / 환불 조정 / XLSX</w:t>
+            </w:r>
+          </w:p>
+        </w:tc>
+      </w:tr>
+      <w:tr>
+        <w:trPr>
+          <w:cantSplit/>
+        </w:trPr>
+        <w:tc>
+          <w:tcPr>
+            <w:tcW w:type="dxa" w:w="1994"/>
+          </w:tcPr>
+          <w:p>
+            <w:pPr>
+              <w:spacing w:after="80" w:before="80"/>
+            </w:pPr>
+            <w:r>
+              <w:rPr>
+                <w:b w:val="0"/>
+                <w:sz w:val="18"/>
+              </w:rPr>
+              <w:t>SCR-A-008</w:t>
+            </w:r>
+          </w:p>
+        </w:tc>
+        <w:tc>
+          <w:tcPr>
+            <w:tcW w:type="dxa" w:w="1994"/>
+          </w:tcPr>
+          <w:p>
+            <w:pPr>
+              <w:spacing w:after="80" w:before="80"/>
+            </w:pPr>
+            <w:r>
+              <w:rPr>
+                <w:b w:val="0"/>
+                <w:sz w:val="18"/>
+              </w:rPr>
+              <w:t>계정별 커머스 권한</w:t>
+            </w:r>
+          </w:p>
+        </w:tc>
+        <w:tc>
+          <w:tcPr>
+            <w:tcW w:type="dxa" w:w="1994"/>
+          </w:tcPr>
+          <w:p>
+            <w:pPr>
+              <w:spacing w:after="80" w:before="80"/>
+            </w:pPr>
+            <w:r>
+              <w:rPr>
+                <w:b w:val="0"/>
+                <w:sz w:val="18"/>
+              </w:rPr>
+              <w:t>통합 관리자</w:t>
+            </w:r>
+          </w:p>
+        </w:tc>
+        <w:tc>
+          <w:tcPr>
+            <w:tcW w:type="dxa" w:w="1994"/>
+          </w:tcPr>
+          <w:p>
+            <w:pPr>
+              <w:spacing w:after="80" w:before="80"/>
+            </w:pPr>
+            <w:r>
+              <w:rPr>
+                <w:b w:val="0"/>
+                <w:sz w:val="18"/>
+              </w:rPr>
+              <w:t>accountsView</w:t>
+            </w:r>
+          </w:p>
+        </w:tc>
+        <w:tc>
+          <w:tcPr>
+            <w:tcW w:type="dxa" w:w="1994"/>
+          </w:tcPr>
+          <w:p>
+            <w:pPr>
+              <w:spacing w:after="80" w:before="80"/>
+            </w:pPr>
+            <w:r>
+              <w:rPr>
+                <w:b w:val="0"/>
+                <w:sz w:val="18"/>
+              </w:rPr>
+              <w:t>권한 부여 / 해제</w:t>
             </w:r>
           </w:p>
         </w:tc>
       </w:tr>
     </w:tbl>
-    <w:p/>
     <w:p>
       <w:pPr>
         <w:pStyle w:val="Heading1"/>
       </w:pPr>
       <w:r>
-        <w:t>현재 구조와 최종 서비스의 차이</w:t>
+        <w:t>공통 기준</w:t>
+      </w:r>
+    </w:p>
+    <w:p>
+      <w:pPr>
+        <w:pStyle w:val="Heading2"/>
+      </w:pPr>
+      <w:r>
+        <w:t>상품 카드 목록</w:t>
+      </w:r>
+    </w:p>
+    <w:p>
+      <w:pPr>
+        <w:pStyle w:val="Heading3"/>
+      </w:pPr>
+      <w:r>
+        <w:t>목록 표시</w:t>
       </w:r>
     </w:p>
     <w:p>
       <w:r>
-        <w:t>현재 사용자 페이지는 해시 경로이며 관리자는 URL 변경 없이 탭과 팝업을 전환한다. 서버 경로 명칭은 제안 단계로, IA 화면 ID를 기준으로 상세 URL은 개발 설계에서 확정한다.</w:t>
+        <w:rPr>
+          <w:b/>
+        </w:rPr>
+        <w:t xml:space="preserve">대상  </w:t>
+      </w:r>
+      <w:r>
+        <w:t>판매 중·품절 상품</w:t>
       </w:r>
     </w:p>
     <w:p>
       <w:r>
-        <w:t>index.html에는 초기 관리자 패널과 상품 팝업 코드가 남아 있다. 최종 서비스 관리자 동작 기준은 admin.html로 통일하고 중복 패널을 제거하는 제안이다. app.js의 초기 함수보다 뒤에서 덮어쓰는 store-flow.js 동작을 우선 확인했다.</w:t>
+        <w:rPr>
+          <w:b/>
+        </w:rPr>
+        <w:t xml:space="preserve">개수  </w:t>
+      </w:r>
+      <w:r>
+        <w:t>페이지당 최대 24개, 이전·다음 이동</w:t>
       </w:r>
     </w:p>
     <w:p>
       <w:r>
-        <w:t>색상·배너·상품 이미지·반응형 화면 시안은 이번 IA의 범위를 넘는다. UX 검토의 모바일 고정 구매 영역, 관리자 고정 저장 버튼, 편집 내용 보존은 기능명세서와 전달서에 개선 요구로 연결한다.</w:t>
+        <w:rPr>
+          <w:b/>
+        </w:rPr>
+        <w:t xml:space="preserve">배치  </w:t>
+      </w:r>
+      <w:r>
+        <w:t>PC 3열, 모바일 2열</w:t>
+      </w:r>
+    </w:p>
+    <w:p>
+      <w:pPr>
+        <w:pStyle w:val="Heading3"/>
+      </w:pPr>
+      <w:r>
+        <w:t>순서   카드</w:t>
+      </w:r>
+    </w:p>
+    <w:p>
+      <w:r>
+        <w:rPr>
+          <w:b/>
+        </w:rPr>
+        <w:t xml:space="preserve">정렬  </w:t>
+      </w:r>
+      <w:r>
+        <w:t>관리자가 저장한 노출 순서 유지</w:t>
+      </w:r>
+    </w:p>
+    <w:p>
+      <w:r>
+        <w:rPr>
+          <w:b/>
+        </w:rPr>
+        <w:t xml:space="preserve">카드  </w:t>
+      </w:r>
+      <w:r>
+        <w:t>이미지·상태·상품명·가격 표시, 상세로 연결</w:t>
+      </w:r>
+    </w:p>
+    <w:p>
+      <w:r>
+        <w:rPr>
+          <w:b/>
+        </w:rPr>
+        <w:t xml:space="preserve">빈 목록  </w:t>
+      </w:r>
+      <w:r>
+        <w:t>상품 없음 안내</w:t>
+      </w:r>
+    </w:p>
+    <w:p>
+      <w:pPr>
+        <w:pStyle w:val="Heading2"/>
+      </w:pPr>
+      <w:r>
+        <w:t>내 주문 목록</w:t>
+      </w:r>
+    </w:p>
+    <w:p>
+      <w:pPr>
+        <w:pStyle w:val="Heading3"/>
+      </w:pPr>
+      <w:r>
+        <w:t>목록 조회</w:t>
+      </w:r>
+    </w:p>
+    <w:p>
+      <w:r>
+        <w:rPr>
+          <w:b/>
+        </w:rPr>
+        <w:t xml:space="preserve">대상  </w:t>
+      </w:r>
+      <w:r>
+        <w:t>본인 주문, 최신순</w:t>
+      </w:r>
+    </w:p>
+    <w:p>
+      <w:r>
+        <w:rPr>
+          <w:b/>
+        </w:rPr>
+        <w:t xml:space="preserve">개수  </w:t>
+      </w:r>
+      <w:r>
+        <w:t>페이지당 10건, 이전·다음 이동</w:t>
+      </w:r>
+    </w:p>
+    <w:p>
+      <w:r>
+        <w:rPr>
+          <w:b/>
+        </w:rPr>
+        <w:t xml:space="preserve">표시  </w:t>
+      </w:r>
+      <w:r>
+        <w:t>주문일·번호·상태·상품·결제금액</w:t>
+      </w:r>
+    </w:p>
+    <w:p>
+      <w:pPr>
+        <w:pStyle w:val="Heading3"/>
+      </w:pPr>
+      <w:r>
+        <w:t>목록 안내</w:t>
+      </w:r>
+    </w:p>
+    <w:p>
+      <w:r>
+        <w:rPr>
+          <w:b/>
+        </w:rPr>
+        <w:t xml:space="preserve">삭제 상품  </w:t>
+      </w:r>
+      <w:r>
+        <w:t>주문 당시 이름과 삭제 표시 유지</w:t>
+      </w:r>
+    </w:p>
+    <w:p>
+      <w:r>
+        <w:rPr>
+          <w:b/>
+        </w:rPr>
+        <w:t xml:space="preserve">결과  </w:t>
+      </w:r>
+      <w:r>
+        <w:t>주문 없음·조회 오류를 구분해 안내</w:t>
+      </w:r>
+    </w:p>
+    <w:p>
+      <w:pPr>
+        <w:pStyle w:val="Heading2"/>
+      </w:pPr>
+      <w:r>
+        <w:t>관리자 업무 탐색</w:t>
+      </w:r>
+    </w:p>
+    <w:p>
+      <w:pPr>
+        <w:pStyle w:val="Heading3"/>
+      </w:pPr>
+      <w:r>
+        <w:t>메뉴   권한</w:t>
+      </w:r>
+    </w:p>
+    <w:p>
+      <w:r>
+        <w:rPr>
+          <w:b/>
+        </w:rPr>
+        <w:t xml:space="preserve">그룹  </w:t>
+      </w:r>
+      <w:r>
+        <w:t>예약관리·커머스관리 분리</w:t>
+      </w:r>
+    </w:p>
+    <w:p>
+      <w:r>
+        <w:rPr>
+          <w:b/>
+        </w:rPr>
+        <w:t xml:space="preserve">커머스  </w:t>
+      </w:r>
+      <w:r>
+        <w:t>상품 판매 현황·배송 처리·매출 정산·온라인 스토어 운영</w:t>
+      </w:r>
+    </w:p>
+    <w:p>
+      <w:r>
+        <w:rPr>
+          <w:b/>
+        </w:rPr>
+        <w:t xml:space="preserve">권한  </w:t>
+      </w:r>
+      <w:r>
+        <w:t>커머스 권한이 있는 계정에 메뉴 표시, 통합 관리자 기본 부여</w:t>
+      </w:r>
+    </w:p>
+    <w:p>
+      <w:r>
+        <w:rPr>
+          <w:b/>
+        </w:rPr>
+        <w:t xml:space="preserve">안내  </w:t>
+      </w:r>
+      <w:r>
+        <w:t>현재 메뉴 강조, 발송 대기 건수 표시</w:t>
       </w:r>
     </w:p>
     <w:sectPr>
-      <w:footerReference w:type="default" r:id="rId9"/>
-      <w:pgSz w:w="11906" w:h="16838"/>
-      <w:pgMar w:top="964" w:right="1020" w:bottom="907" w:left="1020" w:header="720" w:footer="720" w:gutter="0"/>
+      <w:pgSz w:w="12240" w:h="15840"/>
+      <w:pgMar w:top="1020" w:right="1134" w:bottom="1020" w:left="1134" w:header="720" w:footer="720" w:gutter="0"/>
       <w:cols w:space="720"/>
       <w:docGrid w:linePitch="360"/>
     </w:sectPr>
   </w:body>
 </w:document>
-</file>
-
-<file path=word/footer1.xml><?xml version="1.0" encoding="utf-8"?>
-<w:ftr xmlns:m="http://schemas.openxmlformats.org/officeDocument/2006/math" xmlns:mc="http://schemas.openxmlformats.org/markup-compatibility/2006" xmlns:mo="http://schemas.microsoft.com/office/mac/office/2008/main" xmlns:mv="urn:schemas-microsoft-com:mac:vml" xmlns:o="urn:schemas-microsoft-com:office:office" xmlns:r="http://schemas.openxmlformats.org/officeDocument/2006/relationships" xmlns:v="urn:schemas-microsoft-com:vml" xmlns:w10="urn:schemas-microsoft-com:office:word" xmlns:w14="http://schemas.microsoft.com/office/word/2010/wordml" xmlns:w="http://schemas.openxmlformats.org/wordprocessingml/2006/main" xmlns:wne="http://schemas.microsoft.com/office/word/2006/wordml" xmlns:wp14="http://schemas.microsoft.com/office/word/2010/wordprocessingDrawing" xmlns:wp="http://schemas.openxmlformats.org/drawingml/2006/wordprocessingDrawing" xmlns:wpc="http://schemas.microsoft.com/office/word/2010/wordprocessingCanvas" xmlns:wpg="http://schemas.microsoft.com/office/word/2010/wordprocessingGroup" xmlns:wpi="http://schemas.microsoft.com/office/word/2010/wordprocessingInk" xmlns:wps="http://schemas.microsoft.com/office/word/2010/wordprocessingShape" mc:Ignorable="w14 wp14">
-  <w:p>
-    <w:pPr>
-      <w:pStyle w:val="Footer"/>
-    </w:pPr>
-    <w:r>
-      <w:rPr>
-        <w:sz w:val="16"/>
-      </w:rPr>
-      <w:t xml:space="preserve">말마프렌즈 온라인 스토어  •  개발 전달 자료 v2.0  •  </w:t>
-    </w:r>
-    <w:fldSimple w:instr="PAGE"/>
-  </w:p>
-</w:ftr>
 </file>
 
 <file path=word/numbering.xml><?xml version="1.0" encoding="utf-8"?>
@@ -3996,11 +2327,10 @@
     <w:qFormat/>
     <w:rsid w:val="00FC693F"/>
     <w:pPr>
-      <w:spacing w:after="120" w:line="283" w:lineRule="auto"/>
+      <w:spacing w:after="100" w:line="288" w:lineRule="auto"/>
     </w:pPr>
     <w:rPr>
-      <w:rFonts w:ascii="AppleGothic" w:hAnsi="AppleGothic" w:eastAsia="AppleGothic"/>
-      <w:color w:val="000000"/>
+      <w:rFonts w:ascii="Noto Sans KR" w:hAnsi="Noto Sans KR" w:eastAsia="Noto Sans KR" w:cs="Noto Sans KR"/>
       <w:sz w:val="20"/>
     </w:rPr>
   </w:style>
@@ -4018,6 +2348,9 @@
       </w:tabs>
       <w:spacing w:after="0" w:line="240" w:lineRule="auto"/>
     </w:pPr>
+    <w:rPr>
+      <w:rFonts w:ascii="Noto Sans KR" w:hAnsi="Noto Sans KR" w:eastAsia="Noto Sans KR" w:cs="Noto Sans KR"/>
+    </w:rPr>
   </w:style>
   <w:style w:type="character" w:customStyle="1" w:styleId="HeaderChar">
     <w:name w:val="Header Char"/>
@@ -4040,6 +2373,9 @@
       </w:tabs>
       <w:spacing w:after="0" w:line="240" w:lineRule="auto"/>
     </w:pPr>
+    <w:rPr>
+      <w:rFonts w:ascii="Noto Sans KR" w:hAnsi="Noto Sans KR" w:eastAsia="Noto Sans KR" w:cs="Noto Sans KR"/>
+    </w:rPr>
   </w:style>
   <w:style w:type="character" w:customStyle="1" w:styleId="FooterChar">
     <w:name w:val="Footer Char"/>
@@ -4059,15 +2395,15 @@
     <w:pPr>
       <w:keepNext/>
       <w:keepLines/>
-      <w:spacing w:before="200" w:after="140"/>
+      <w:spacing w:before="480" w:after="120" w:line="288" w:lineRule="auto"/>
       <w:outlineLvl w:val="0"/>
     </w:pPr>
     <w:rPr>
-      <w:rFonts w:asciiTheme="majorHAnsi" w:eastAsiaTheme="majorEastAsia" w:hAnsiTheme="majorHAnsi" w:cstheme="majorBidi" w:ascii="AppleGothic" w:hAnsi="AppleGothic" w:eastAsia="AppleGothic"/>
+      <w:rFonts w:ascii="Noto Sans KR" w:hAnsi="Noto Sans KR" w:eastAsia="Noto Sans KR" w:cs="Noto Sans KR"/>
       <w:b/>
       <w:bCs/>
       <w:color w:val="000000"/>
-      <w:sz w:val="32"/>
+      <w:sz w:val="30"/>
       <w:szCs w:val="28"/>
     </w:rPr>
   </w:style>
@@ -4083,11 +2419,11 @@
     <w:pPr>
       <w:keepNext/>
       <w:keepLines/>
-      <w:spacing w:before="200" w:after="140"/>
+      <w:spacing w:before="200" w:after="120" w:line="288" w:lineRule="auto"/>
       <w:outlineLvl w:val="1"/>
     </w:pPr>
     <w:rPr>
-      <w:rFonts w:asciiTheme="majorHAnsi" w:eastAsiaTheme="majorEastAsia" w:hAnsiTheme="majorHAnsi" w:cstheme="majorBidi" w:ascii="AppleGothic" w:hAnsi="AppleGothic" w:eastAsia="AppleGothic"/>
+      <w:rFonts w:ascii="Noto Sans KR" w:hAnsi="Noto Sans KR" w:eastAsia="Noto Sans KR" w:cs="Noto Sans KR"/>
       <w:b/>
       <w:bCs/>
       <w:color w:val="000000"/>
@@ -4107,14 +2443,15 @@
     <w:pPr>
       <w:keepNext/>
       <w:keepLines/>
-      <w:spacing w:before="200" w:after="0"/>
+      <w:spacing w:before="200" w:after="120" w:line="288" w:lineRule="auto"/>
       <w:outlineLvl w:val="2"/>
     </w:pPr>
     <w:rPr>
-      <w:rFonts w:asciiTheme="majorHAnsi" w:eastAsiaTheme="majorEastAsia" w:hAnsiTheme="majorHAnsi" w:cstheme="majorBidi" w:ascii="AppleGothic" w:hAnsi="AppleGothic" w:eastAsia="AppleGothic"/>
+      <w:rFonts w:ascii="Noto Sans KR" w:hAnsi="Noto Sans KR" w:eastAsia="Noto Sans KR" w:cs="Noto Sans KR"/>
       <w:b/>
       <w:bCs/>
       <w:color w:val="000000"/>
+      <w:sz w:val="21"/>
     </w:rPr>
   </w:style>
   <w:style w:type="paragraph" w:styleId="Heading4">
@@ -4134,12 +2471,11 @@
       <w:outlineLvl w:val="3"/>
     </w:pPr>
     <w:rPr>
-      <w:rFonts w:asciiTheme="majorHAnsi" w:eastAsiaTheme="majorEastAsia" w:hAnsiTheme="majorHAnsi" w:cstheme="majorBidi"/>
+      <w:rFonts w:ascii="Noto Sans KR" w:hAnsi="Noto Sans KR" w:eastAsia="Noto Sans KR" w:cs="Noto Sans KR"/>
       <w:b/>
       <w:bCs/>
       <w:i/>
       <w:iCs/>
-      <w:color w:val="4F81BD" w:themeColor="accent1"/>
     </w:rPr>
   </w:style>
   <w:style w:type="paragraph" w:styleId="Heading5">
@@ -4159,8 +2495,7 @@
       <w:outlineLvl w:val="4"/>
     </w:pPr>
     <w:rPr>
-      <w:rFonts w:asciiTheme="majorHAnsi" w:eastAsiaTheme="majorEastAsia" w:hAnsiTheme="majorHAnsi" w:cstheme="majorBidi"/>
-      <w:color w:val="243F60" w:themeColor="accent1" w:themeShade="7F"/>
+      <w:rFonts w:ascii="Noto Sans KR" w:hAnsi="Noto Sans KR" w:eastAsia="Noto Sans KR" w:cs="Noto Sans KR"/>
     </w:rPr>
   </w:style>
   <w:style w:type="paragraph" w:styleId="Heading6">
@@ -4180,10 +2515,9 @@
       <w:outlineLvl w:val="5"/>
     </w:pPr>
     <w:rPr>
-      <w:rFonts w:asciiTheme="majorHAnsi" w:eastAsiaTheme="majorEastAsia" w:hAnsiTheme="majorHAnsi" w:cstheme="majorBidi"/>
+      <w:rFonts w:ascii="Noto Sans KR" w:hAnsi="Noto Sans KR" w:eastAsia="Noto Sans KR" w:cs="Noto Sans KR"/>
       <w:i/>
       <w:iCs/>
-      <w:color w:val="243F60" w:themeColor="accent1" w:themeShade="7F"/>
     </w:rPr>
   </w:style>
   <w:style w:type="paragraph" w:styleId="Heading7">
@@ -4203,10 +2537,9 @@
       <w:outlineLvl w:val="6"/>
     </w:pPr>
     <w:rPr>
-      <w:rFonts w:asciiTheme="majorHAnsi" w:eastAsiaTheme="majorEastAsia" w:hAnsiTheme="majorHAnsi" w:cstheme="majorBidi"/>
+      <w:rFonts w:ascii="Noto Sans KR" w:hAnsi="Noto Sans KR" w:eastAsia="Noto Sans KR" w:cs="Noto Sans KR"/>
       <w:i/>
       <w:iCs/>
-      <w:color w:val="404040" w:themeColor="text1" w:themeTint="BF"/>
     </w:rPr>
   </w:style>
   <w:style w:type="paragraph" w:styleId="Heading8">
@@ -4226,8 +2559,7 @@
       <w:outlineLvl w:val="7"/>
     </w:pPr>
     <w:rPr>
-      <w:rFonts w:asciiTheme="majorHAnsi" w:eastAsiaTheme="majorEastAsia" w:hAnsiTheme="majorHAnsi" w:cstheme="majorBidi"/>
-      <w:color w:val="4F81BD" w:themeColor="accent1"/>
+      <w:rFonts w:ascii="Noto Sans KR" w:hAnsi="Noto Sans KR" w:eastAsia="Noto Sans KR" w:cs="Noto Sans KR"/>
       <w:sz w:val="20"/>
       <w:szCs w:val="20"/>
     </w:rPr>
@@ -4249,10 +2581,9 @@
       <w:outlineLvl w:val="8"/>
     </w:pPr>
     <w:rPr>
-      <w:rFonts w:asciiTheme="majorHAnsi" w:eastAsiaTheme="majorEastAsia" w:hAnsiTheme="majorHAnsi" w:cstheme="majorBidi"/>
+      <w:rFonts w:ascii="Noto Sans KR" w:hAnsi="Noto Sans KR" w:eastAsia="Noto Sans KR" w:cs="Noto Sans KR"/>
       <w:i/>
       <w:iCs/>
-      <w:color w:val="404040" w:themeColor="text1" w:themeTint="BF"/>
       <w:sz w:val="20"/>
       <w:szCs w:val="20"/>
     </w:rPr>
@@ -4292,6 +2623,9 @@
     <w:pPr>
       <w:spacing w:after="0" w:line="240" w:lineRule="auto"/>
     </w:pPr>
+    <w:rPr>
+      <w:rFonts w:ascii="Noto Sans KR" w:hAnsi="Noto Sans KR" w:eastAsia="Noto Sans KR" w:cs="Noto Sans KR"/>
+    </w:rPr>
   </w:style>
   <w:style w:type="character" w:customStyle="1" w:styleId="Heading1Char">
     <w:name w:val="Heading 1 Char"/>
@@ -4345,15 +2679,15 @@
     <w:qFormat/>
     <w:rsid w:val="00FC693F"/>
     <w:pPr>
-      <w:spacing w:after="300" w:line="240" w:lineRule="auto"/>
+      <w:spacing w:after="120" w:line="288" w:lineRule="auto"/>
       <w:contextualSpacing/>
     </w:pPr>
     <w:rPr>
-      <w:rFonts w:asciiTheme="majorHAnsi" w:eastAsiaTheme="majorEastAsia" w:hAnsiTheme="majorHAnsi" w:cstheme="majorBidi" w:ascii="AppleGothic" w:hAnsi="AppleGothic" w:eastAsia="AppleGothic"/>
+      <w:rFonts w:ascii="Noto Sans KR" w:hAnsi="Noto Sans KR" w:eastAsia="Noto Sans KR" w:cs="Noto Sans KR"/>
       <w:color w:val="000000"/>
       <w:spacing w:val="5"/>
       <w:kern w:val="28"/>
-      <w:sz w:val="46"/>
+      <w:sz w:val="40"/>
       <w:szCs w:val="52"/>
     </w:rPr>
   </w:style>
@@ -4386,7 +2720,7 @@
       </w:numPr>
     </w:pPr>
     <w:rPr>
-      <w:rFonts w:asciiTheme="majorHAnsi" w:eastAsiaTheme="majorEastAsia" w:hAnsiTheme="majorHAnsi" w:cstheme="majorBidi" w:ascii="AppleGothic" w:hAnsi="AppleGothic" w:eastAsia="AppleGothic"/>
+      <w:rFonts w:ascii="Noto Sans KR" w:hAnsi="Noto Sans KR" w:eastAsia="Noto Sans KR" w:cs="Noto Sans KR"/>
       <w:i/>
       <w:iCs/>
       <w:color w:val="000000"/>
@@ -4421,6 +2755,9 @@
       <w:ind w:left="720"/>
       <w:contextualSpacing/>
     </w:pPr>
+    <w:rPr>
+      <w:rFonts w:ascii="Noto Sans KR" w:hAnsi="Noto Sans KR" w:eastAsia="Noto Sans KR" w:cs="Noto Sans KR"/>
+    </w:rPr>
   </w:style>
   <w:style w:type="paragraph" w:styleId="BodyText">
     <w:name w:val="Body Text"/>
@@ -4432,6 +2769,9 @@
     <w:pPr>
       <w:spacing w:after="120"/>
     </w:pPr>
+    <w:rPr>
+      <w:rFonts w:ascii="Noto Sans KR" w:hAnsi="Noto Sans KR" w:eastAsia="Noto Sans KR" w:cs="Noto Sans KR"/>
+    </w:rPr>
   </w:style>
   <w:style w:type="character" w:customStyle="1" w:styleId="BodyTextChar">
     <w:name w:val="Body Text Char"/>
@@ -4450,6 +2790,9 @@
     <w:pPr>
       <w:spacing w:after="120" w:line="480" w:lineRule="auto"/>
     </w:pPr>
+    <w:rPr>
+      <w:rFonts w:ascii="Noto Sans KR" w:hAnsi="Noto Sans KR" w:eastAsia="Noto Sans KR" w:cs="Noto Sans KR"/>
+    </w:rPr>
   </w:style>
   <w:style w:type="character" w:customStyle="1" w:styleId="BodyText2Char">
     <w:name w:val="Body Text 2 Char"/>
@@ -4469,6 +2812,7 @@
       <w:spacing w:after="120"/>
     </w:pPr>
     <w:rPr>
+      <w:rFonts w:ascii="Noto Sans KR" w:hAnsi="Noto Sans KR" w:eastAsia="Noto Sans KR" w:cs="Noto Sans KR"/>
       <w:sz w:val="16"/>
       <w:szCs w:val="16"/>
     </w:rPr>
@@ -4494,6 +2838,9 @@
       <w:ind w:left="360" w:hanging="360"/>
       <w:contextualSpacing/>
     </w:pPr>
+    <w:rPr>
+      <w:rFonts w:ascii="Noto Sans KR" w:hAnsi="Noto Sans KR" w:eastAsia="Noto Sans KR" w:cs="Noto Sans KR"/>
+    </w:rPr>
   </w:style>
   <w:style w:type="paragraph" w:styleId="List2">
     <w:name w:val="List 2"/>
@@ -4505,6 +2852,9 @@
       <w:ind w:left="720" w:hanging="360"/>
       <w:contextualSpacing/>
     </w:pPr>
+    <w:rPr>
+      <w:rFonts w:ascii="Noto Sans KR" w:hAnsi="Noto Sans KR" w:eastAsia="Noto Sans KR" w:cs="Noto Sans KR"/>
+    </w:rPr>
   </w:style>
   <w:style w:type="paragraph" w:styleId="List3">
     <w:name w:val="List 3"/>
@@ -4516,6 +2866,9 @@
       <w:ind w:left="1080" w:hanging="360"/>
       <w:contextualSpacing/>
     </w:pPr>
+    <w:rPr>
+      <w:rFonts w:ascii="Noto Sans KR" w:hAnsi="Noto Sans KR" w:eastAsia="Noto Sans KR" w:cs="Noto Sans KR"/>
+    </w:rPr>
   </w:style>
   <w:style w:type="paragraph" w:styleId="ListBullet">
     <w:name w:val="List Bullet"/>
@@ -4529,6 +2882,9 @@
       </w:numPr>
       <w:contextualSpacing/>
     </w:pPr>
+    <w:rPr>
+      <w:rFonts w:ascii="Noto Sans KR" w:hAnsi="Noto Sans KR" w:eastAsia="Noto Sans KR" w:cs="Noto Sans KR"/>
+    </w:rPr>
   </w:style>
   <w:style w:type="paragraph" w:styleId="ListBullet2">
     <w:name w:val="List Bullet 2"/>
@@ -4542,6 +2898,9 @@
       </w:numPr>
       <w:contextualSpacing/>
     </w:pPr>
+    <w:rPr>
+      <w:rFonts w:ascii="Noto Sans KR" w:hAnsi="Noto Sans KR" w:eastAsia="Noto Sans KR" w:cs="Noto Sans KR"/>
+    </w:rPr>
   </w:style>
   <w:style w:type="paragraph" w:styleId="ListBullet3">
     <w:name w:val="List Bullet 3"/>
@@ -4555,6 +2914,9 @@
       </w:numPr>
       <w:contextualSpacing/>
     </w:pPr>
+    <w:rPr>
+      <w:rFonts w:ascii="Noto Sans KR" w:hAnsi="Noto Sans KR" w:eastAsia="Noto Sans KR" w:cs="Noto Sans KR"/>
+    </w:rPr>
   </w:style>
   <w:style w:type="paragraph" w:styleId="ListNumber">
     <w:name w:val="List Number"/>
@@ -4568,6 +2930,9 @@
       </w:numPr>
       <w:contextualSpacing/>
     </w:pPr>
+    <w:rPr>
+      <w:rFonts w:ascii="Noto Sans KR" w:hAnsi="Noto Sans KR" w:eastAsia="Noto Sans KR" w:cs="Noto Sans KR"/>
+    </w:rPr>
   </w:style>
   <w:style w:type="paragraph" w:styleId="ListNumber2">
     <w:name w:val="List Number 2"/>
@@ -4581,6 +2946,9 @@
       </w:numPr>
       <w:contextualSpacing/>
     </w:pPr>
+    <w:rPr>
+      <w:rFonts w:ascii="Noto Sans KR" w:hAnsi="Noto Sans KR" w:eastAsia="Noto Sans KR" w:cs="Noto Sans KR"/>
+    </w:rPr>
   </w:style>
   <w:style w:type="paragraph" w:styleId="ListNumber3">
     <w:name w:val="List Number 3"/>
@@ -4594,6 +2962,9 @@
       </w:numPr>
       <w:contextualSpacing/>
     </w:pPr>
+    <w:rPr>
+      <w:rFonts w:ascii="Noto Sans KR" w:hAnsi="Noto Sans KR" w:eastAsia="Noto Sans KR" w:cs="Noto Sans KR"/>
+    </w:rPr>
   </w:style>
   <w:style w:type="paragraph" w:styleId="ListContinue">
     <w:name w:val="List Continue"/>
@@ -4606,6 +2977,9 @@
       <w:ind w:left="360"/>
       <w:contextualSpacing/>
     </w:pPr>
+    <w:rPr>
+      <w:rFonts w:ascii="Noto Sans KR" w:hAnsi="Noto Sans KR" w:eastAsia="Noto Sans KR" w:cs="Noto Sans KR"/>
+    </w:rPr>
   </w:style>
   <w:style w:type="paragraph" w:styleId="ListContinue2">
     <w:name w:val="List Continue 2"/>
@@ -4618,6 +2992,9 @@
       <w:ind w:left="720"/>
       <w:contextualSpacing/>
     </w:pPr>
+    <w:rPr>
+      <w:rFonts w:ascii="Noto Sans KR" w:hAnsi="Noto Sans KR" w:eastAsia="Noto Sans KR" w:cs="Noto Sans KR"/>
+    </w:rPr>
   </w:style>
   <w:style w:type="paragraph" w:styleId="ListContinue3">
     <w:name w:val="List Continue 3"/>
@@ -4630,6 +3007,9 @@
       <w:ind w:left="1080"/>
       <w:contextualSpacing/>
     </w:pPr>
+    <w:rPr>
+      <w:rFonts w:ascii="Noto Sans KR" w:hAnsi="Noto Sans KR" w:eastAsia="Noto Sans KR" w:cs="Noto Sans KR"/>
+    </w:rPr>
   </w:style>
   <w:style w:type="paragraph" w:styleId="MacroText">
     <w:name w:val="macro"/>
@@ -4649,7 +3029,7 @@
       </w:tabs>
     </w:pPr>
     <w:rPr>
-      <w:rFonts w:ascii="Courier" w:hAnsi="Courier"/>
+      <w:rFonts w:ascii="Noto Sans KR" w:hAnsi="Noto Sans KR" w:eastAsia="Noto Sans KR" w:cs="Noto Sans KR"/>
       <w:sz w:val="20"/>
       <w:szCs w:val="20"/>
     </w:rPr>
@@ -4675,9 +3055,9 @@
     <w:qFormat/>
     <w:rsid w:val="00FC693F"/>
     <w:rPr>
+      <w:rFonts w:ascii="Noto Sans KR" w:hAnsi="Noto Sans KR" w:eastAsia="Noto Sans KR" w:cs="Noto Sans KR"/>
       <w:i/>
       <w:iCs/>
-      <w:color w:val="000000" w:themeColor="text1"/>
     </w:rPr>
   </w:style>
   <w:style w:type="character" w:customStyle="1" w:styleId="QuoteChar">
@@ -4791,9 +3171,9 @@
       <w:spacing w:line="240" w:lineRule="auto"/>
     </w:pPr>
     <w:rPr>
+      <w:rFonts w:ascii="Noto Sans KR" w:hAnsi="Noto Sans KR" w:eastAsia="Noto Sans KR" w:cs="Noto Sans KR"/>
       <w:b/>
       <w:bCs/>
-      <w:color w:val="4F81BD" w:themeColor="accent1"/>
       <w:sz w:val="18"/>
       <w:szCs w:val="18"/>
     </w:rPr>
@@ -4829,18 +3209,15 @@
     <w:qFormat/>
     <w:rsid w:val="00FC693F"/>
     <w:pPr>
-      <w:pBdr>
-        <w:bottom w:val="single" w:sz="4" w:space="4" w:color="4F81BD" w:themeColor="accent1"/>
-      </w:pBdr>
       <w:spacing w:before="200" w:after="280"/>
       <w:ind w:left="936" w:right="936"/>
     </w:pPr>
     <w:rPr>
+      <w:rFonts w:ascii="Noto Sans KR" w:hAnsi="Noto Sans KR" w:eastAsia="Noto Sans KR" w:cs="Noto Sans KR"/>
       <w:b/>
       <w:bCs/>
       <w:i/>
       <w:iCs/>
-      <w:color w:val="4F81BD" w:themeColor="accent1"/>
     </w:rPr>
   </w:style>
   <w:style w:type="character" w:customStyle="1" w:styleId="IntenseQuoteChar">
@@ -4935,6 +3312,9 @@
     <w:pPr>
       <w:outlineLvl w:val="9"/>
     </w:pPr>
+    <w:rPr>
+      <w:rFonts w:ascii="Noto Sans KR" w:hAnsi="Noto Sans KR" w:eastAsia="Noto Sans KR" w:cs="Noto Sans KR"/>
+    </w:rPr>
   </w:style>
   <w:style w:type="table" w:styleId="TableGrid">
     <w:name w:val="Table Grid"/>

</xml_diff>